<commit_message>
DOCS: SRS, SAD and Test Plan v1.1 for the web interface
</commit_message>
<xml_diff>
--- a/docs/HMS_SRS.docx
+++ b/docs/HMS_SRS.docx
@@ -50,7 +50,7 @@
           <w:sz w:val="24"/>
           <w:szCs w:val="24"/>
         </w:rPr>
-        <w:t xml:space="preserve">Version 1.0 approved</w:t>
+        <w:t>Version 1.1 approved (web user interface)</w:t>
       </w:r>
     </w:p>
     <w:p>
@@ -188,7 +188,7 @@
           <w:sz w:val="24"/>
           <w:szCs w:val="24"/>
         </w:rPr>
-        <w:t xml:space="preserve">07-10-2026</w:t>
+        <w:t>26-10-2026</w:t>
       </w:r>
     </w:p>
     <w:p>
@@ -621,6 +621,21 @@
     <w:p>
       <w:pPr>
         <w:spacing w:after="30" w:before="0" w:line="264"/>
+        <w:ind w:left="400"/>
+        <w:jc w:val="left"/>
+      </w:pPr>
+      <w:r>
+        <w:rPr>
+          <w:rFonts w:ascii="Times New Roman" w:cs="Times New Roman" w:eastAsia="Times New Roman" w:hAnsi="Times New Roman"/>
+          <w:sz w:val="23"/>
+          <w:szCs w:val="23"/>
+        </w:rPr>
+        <w:t>5.5 Web User Interface</w:t>
+      </w:r>
+    </w:p>
+    <w:p>
+      <w:pPr>
+        <w:spacing w:after="30" w:before="0" w:line="264"/>
         <w:jc w:val="left"/>
       </w:pPr>
       <w:r>
@@ -1219,6 +1234,139 @@
           </w:p>
         </w:tc>
       </w:tr>
+      <w:tr>
+        <w:trPr>
+          <w:cantSplit/>
+        </w:trPr>
+        <w:tc>
+          <w:tcPr>
+            <w:tcW w:type="dxa" w:w="2700"/>
+            <w:tcBorders>
+              <w:top w:val="single" w:color="808080" w:sz="4"/>
+              <w:left w:val="single" w:color="808080" w:sz="4"/>
+              <w:bottom w:val="single" w:color="808080" w:sz="4"/>
+              <w:right w:val="single" w:color="808080" w:sz="4"/>
+            </w:tcBorders>
+            <w:tcMar>
+              <w:top w:type="dxa" w:w="50"/>
+              <w:left w:type="dxa" w:w="90"/>
+              <w:bottom w:type="dxa" w:w="50"/>
+              <w:right w:type="dxa" w:w="90"/>
+            </w:tcMar>
+            <w:vAlign w:val="top"/>
+          </w:tcPr>
+          <w:p>
+            <w:pPr>
+              <w:spacing w:after="30" w:line="240"/>
+              <w:jc w:val="left"/>
+            </w:pPr>
+            <w:r>
+              <w:rPr>
+                <w:rFonts w:ascii="Times New Roman" w:cs="Times New Roman" w:eastAsia="Times New Roman" w:hAnsi="Times New Roman"/>
+                <w:sz w:val="20"/>
+                <w:szCs w:val="20"/>
+              </w:rPr>
+              <w:t>Team 11</w:t>
+            </w:r>
+          </w:p>
+        </w:tc>
+        <w:tc>
+          <w:tcPr>
+            <w:tcW w:type="dxa" w:w="1500"/>
+            <w:tcBorders>
+              <w:top w:val="single" w:color="808080" w:sz="4"/>
+              <w:left w:val="single" w:color="808080" w:sz="4"/>
+              <w:bottom w:val="single" w:color="808080" w:sz="4"/>
+              <w:right w:val="single" w:color="808080" w:sz="4"/>
+            </w:tcBorders>
+            <w:tcMar>
+              <w:top w:type="dxa" w:w="50"/>
+              <w:left w:type="dxa" w:w="90"/>
+              <w:bottom w:type="dxa" w:w="50"/>
+              <w:right w:type="dxa" w:w="90"/>
+            </w:tcMar>
+            <w:vAlign w:val="top"/>
+          </w:tcPr>
+          <w:p>
+            <w:pPr>
+              <w:spacing w:after="30" w:line="240"/>
+              <w:jc w:val="left"/>
+            </w:pPr>
+            <w:r>
+              <w:rPr>
+                <w:rFonts w:ascii="Times New Roman" w:cs="Times New Roman" w:eastAsia="Times New Roman" w:hAnsi="Times New Roman"/>
+                <w:sz w:val="20"/>
+                <w:szCs w:val="20"/>
+              </w:rPr>
+              <w:t>26-10-2026</w:t>
+            </w:r>
+          </w:p>
+        </w:tc>
+        <w:tc>
+          <w:tcPr>
+            <w:tcW w:type="dxa" w:w="4200"/>
+            <w:tcBorders>
+              <w:top w:val="single" w:color="808080" w:sz="4"/>
+              <w:left w:val="single" w:color="808080" w:sz="4"/>
+              <w:bottom w:val="single" w:color="808080" w:sz="4"/>
+              <w:right w:val="single" w:color="808080" w:sz="4"/>
+            </w:tcBorders>
+            <w:tcMar>
+              <w:top w:type="dxa" w:w="50"/>
+              <w:left w:type="dxa" w:w="90"/>
+              <w:bottom w:type="dxa" w:w="50"/>
+              <w:right w:type="dxa" w:w="90"/>
+            </w:tcMar>
+            <w:vAlign w:val="top"/>
+          </w:tcPr>
+          <w:p>
+            <w:pPr>
+              <w:spacing w:after="30" w:line="240"/>
+              <w:jc w:val="left"/>
+            </w:pPr>
+            <w:r>
+              <w:rPr>
+                <w:rFonts w:ascii="Times New Roman" w:cs="Times New Roman" w:eastAsia="Times New Roman" w:hAnsi="Times New Roman"/>
+                <w:sz w:val="20"/>
+                <w:szCs w:val="20"/>
+              </w:rPr>
+              <w:t>Web user interface: React + TypeScript website served by the C++ program on the same computer; console interface removed. Added HMS-F-070 to F-074 (Section 5.5) and HMS-SEC-009; updated Sections 1.3, 2.1, 2.3–2.6, 3.1–3.4, 4.2, 6.3, 6.4, 7 and Appendix C</w:t>
+            </w:r>
+          </w:p>
+        </w:tc>
+        <w:tc>
+          <w:tcPr>
+            <w:tcW w:type="dxa" w:w="1346"/>
+            <w:tcBorders>
+              <w:top w:val="single" w:color="808080" w:sz="4"/>
+              <w:left w:val="single" w:color="808080" w:sz="4"/>
+              <w:bottom w:val="single" w:color="808080" w:sz="4"/>
+              <w:right w:val="single" w:color="808080" w:sz="4"/>
+            </w:tcBorders>
+            <w:tcMar>
+              <w:top w:type="dxa" w:w="50"/>
+              <w:left w:type="dxa" w:w="90"/>
+              <w:bottom w:type="dxa" w:w="50"/>
+              <w:right w:type="dxa" w:w="90"/>
+            </w:tcMar>
+            <w:vAlign w:val="top"/>
+          </w:tcPr>
+          <w:p>
+            <w:pPr>
+              <w:spacing w:after="30" w:line="240"/>
+              <w:jc w:val="left"/>
+            </w:pPr>
+            <w:r>
+              <w:rPr>
+                <w:rFonts w:ascii="Times New Roman" w:cs="Times New Roman" w:eastAsia="Times New Roman" w:hAnsi="Times New Roman"/>
+                <w:sz w:val="20"/>
+                <w:szCs w:val="20"/>
+              </w:rPr>
+              <w:t>1.1</w:t>
+            </w:r>
+          </w:p>
+        </w:tc>
+      </w:tr>
     </w:tbl>
     <w:p>
       <w:pPr>
@@ -1256,25 +1404,7 @@
           <w:sz w:val="23"/>
           <w:szCs w:val="23"/>
         </w:rPr>
-        <w:t xml:space="preserve">This document specifies the software requirements of the </w:t>
-      </w:r>
-      <w:r>
-        <w:rPr>
-          <w:rFonts w:ascii="Times New Roman" w:cs="Times New Roman" w:eastAsia="Times New Roman" w:hAnsi="Times New Roman"/>
-          <w:b/>
-          <w:bCs/>
-          <w:sz w:val="23"/>
-          <w:szCs w:val="23"/>
-        </w:rPr>
-        <w:t xml:space="preserve">Hospital Management System (HMS), release 1.0</w:t>
-      </w:r>
-      <w:r>
-        <w:rPr>
-          <w:rFonts w:ascii="Times New Roman" w:cs="Times New Roman" w:eastAsia="Times New Roman" w:hAnsi="Times New Roman"/>
-          <w:sz w:val="23"/>
-          <w:szCs w:val="23"/>
-        </w:rPr>
-        <w:t xml:space="preserve">, a patient-record and appointment-management application for the out-patient department (OPD) of a hospital. It is written to the IEEE 830 / ISO/IEC/IEEE 29148 structure supplied as the course template. The SRS covers the complete HMS 1.0 product; no part of it is delegated to another subsystem.</w:t>
+        <w:t>This document specifies the software requirements of the Hospital Management System (HMS), release 1.1, a patient-record and appointment-management application for the out-patient department (OPD) of a hospital. It is written to the IEEE 830 / ISO/IEC/IEEE 29148 structure supplied as the course template. The SRS covers the complete HMS 1.1 product; no part of it is delegated to another subsystem.</w:t>
       </w:r>
     </w:p>
     <w:p>
@@ -1814,25 +1944,7 @@
           <w:sz w:val="23"/>
           <w:szCs w:val="23"/>
         </w:rPr>
-        <w:t xml:space="preserve">HMS is a stand-alone, menu-driven console application written in C++17. It lets hospital staff </w:t>
-      </w:r>
-      <w:r>
-        <w:rPr>
-          <w:rFonts w:ascii="Times New Roman" w:cs="Times New Roman" w:eastAsia="Times New Roman" w:hAnsi="Times New Roman"/>
-          <w:b/>
-          <w:bCs/>
-          <w:sz w:val="23"/>
-          <w:szCs w:val="23"/>
-        </w:rPr>
-        <w:t xml:space="preserve">register and find patients, manage doctors and their weekly availability, book, cancel and reschedule appointments, record consultations (diagnosis and prescription), produce daily reports, and back up the data</w:t>
-      </w:r>
-      <w:r>
-        <w:rPr>
-          <w:rFonts w:ascii="Times New Roman" w:cs="Times New Roman" w:eastAsia="Times New Roman" w:hAnsi="Times New Roman"/>
-          <w:sz w:val="23"/>
-          <w:szCs w:val="23"/>
-        </w:rPr>
-        <w:t xml:space="preserve">. Three kinds of staff use it: Administrator, Receptionist and Doctor.</w:t>
+        <w:t>HMS is a stand-alone application for one hospital computer: a C++17 program holds all data and rules, and staff use it through a website (React + TypeScript) that opens in the web browser of the same computer. It lets hospital staff register and find patients, manage doctors and their weekly availability, book, cancel and reschedule appointments, record consultations (diagnosis and prescription), produce daily reports, and back up the data. Three kinds of staff use it: Administrator, Receptionist and Doctor.</w:t>
       </w:r>
     </w:p>
     <w:p>
@@ -1920,7 +2032,7 @@
           <w:sz w:val="23"/>
           <w:szCs w:val="23"/>
         </w:rPr>
-        <w:t xml:space="preserve">Run on an ordinary hospital desktop (4 GB RAM) with no database server and no network.</w:t>
+        <w:t>Run on an ordinary hospital desktop (4 GB RAM) with no database server and no network connection (the website is served only to the same computer).</w:t>
       </w:r>
     </w:p>
     <w:p>
@@ -1936,15 +2048,7 @@
           <w:sz w:val="23"/>
           <w:szCs w:val="23"/>
         </w:rPr>
-        <w:t xml:space="preserve">Out of scope for release 1.0:</w:t>
-      </w:r>
-      <w:r>
-        <w:rPr>
-          <w:rFonts w:ascii="Times New Roman" w:cs="Times New Roman" w:eastAsia="Times New Roman" w:hAnsi="Times New Roman"/>
-          <w:sz w:val="23"/>
-          <w:szCs w:val="23"/>
-        </w:rPr>
-        <w:t xml:space="preserve"> billing and insurance, pharmacy and laboratory modules, in-patient (ward / bed) management, patient self-service portal, multi-terminal network operation, and integration with national health-record systems.</w:t>
+        <w:t>Out of scope for release 1.1: billing and insurance, pharmacy and laboratory modules, in-patient (ward / bed) management, patient self-service portal, multi-terminal network operation, and integration with national health-record systems.</w:t>
       </w:r>
     </w:p>
     <w:p>
@@ -2160,25 +2264,7 @@
           <w:sz w:val="23"/>
           <w:szCs w:val="23"/>
         </w:rPr>
-        <w:t xml:space="preserve">Team 11, </w:t>
-      </w:r>
-      <w:r>
-        <w:rPr>
-          <w:rFonts w:ascii="Times New Roman" w:cs="Times New Roman" w:eastAsia="Times New Roman" w:hAnsi="Times New Roman"/>
-          <w:i/>
-          <w:iCs/>
-          <w:sz w:val="23"/>
-          <w:szCs w:val="23"/>
-        </w:rPr>
-        <w:t xml:space="preserve">Software Architecture and Design Specification (SAD) v1.0</w:t>
-      </w:r>
-      <w:r>
-        <w:rPr>
-          <w:rFonts w:ascii="Times New Roman" w:cs="Times New Roman" w:eastAsia="Times New Roman" w:hAnsi="Times New Roman"/>
-          <w:sz w:val="23"/>
-          <w:szCs w:val="23"/>
-        </w:rPr>
-        <w:t xml:space="preserve">, 07-10-2026 (companion document).</w:t>
+        <w:t>Team 11, Software Architecture and Design Specification (SAD) v1.1, 26-10-2026 (companion document).</w:t>
       </w:r>
     </w:p>
     <w:p>
@@ -2196,25 +2282,7 @@
           <w:sz w:val="23"/>
           <w:szCs w:val="23"/>
         </w:rPr>
-        <w:t xml:space="preserve">Team 11, </w:t>
-      </w:r>
-      <w:r>
-        <w:rPr>
-          <w:rFonts w:ascii="Times New Roman" w:cs="Times New Roman" w:eastAsia="Times New Roman" w:hAnsi="Times New Roman"/>
-          <w:i/>
-          <w:iCs/>
-          <w:sz w:val="23"/>
-          <w:szCs w:val="23"/>
-        </w:rPr>
-        <w:t xml:space="preserve">Software Test Plan (STP) v1.0</w:t>
-      </w:r>
-      <w:r>
-        <w:rPr>
-          <w:rFonts w:ascii="Times New Roman" w:cs="Times New Roman" w:eastAsia="Times New Roman" w:hAnsi="Times New Roman"/>
-          <w:sz w:val="23"/>
-          <w:szCs w:val="23"/>
-        </w:rPr>
-        <w:t xml:space="preserve">, 07-10-2026 (companion document).</w:t>
+        <w:t>Team 11, Software Test Plan (STP) v1.1, 26-10-2026 (companion document).</w:t>
       </w:r>
     </w:p>
     <w:p>
@@ -2549,7 +2617,7 @@
           <w:sz w:val="23"/>
           <w:szCs w:val="23"/>
         </w:rPr>
-        <w:t xml:space="preserve">HMS is a new, self-contained product; it does not replace or interface with an existing software system (the current process is paper registers). It runs as a single process on one computer in the OPD. All data are kept in files on the local disk; the application therefore has no server, no network interface and no external software dependencies other than the C++ standard library (and, optionally, a SHA-256 routine from OpenSSL libcrypto or a bundled public-domain implementation).</w:t>
+        <w:t>HMS is a new, self-contained product; it does not replace or interface with an existing software system (the current process is paper registers). It runs as a single server process on one computer in the OPD, and staff use it through a web browser on that computer. All data are kept in files on the local disk; the application therefore has no server, no network interface and no external software dependencies other than the C++ standard library (and, optionally, a SHA-256 routine from OpenSSL libcrypto or a bundled public-domain implementation).</w:t>
       </w:r>
     </w:p>
     <w:tbl>
@@ -2712,7 +2780,7 @@
                 <w:sz w:val="20"/>
                 <w:szCs w:val="20"/>
               </w:rPr>
-              <w:t xml:space="preserve">Interact through the keyboard and the text console (Section 3.1).</w:t>
+              <w:t>Interact through a website in the web browser of the HMS computer, with mouse and keyboard (Section 3.1).</w:t>
             </w:r>
           </w:p>
         </w:tc>
@@ -2881,7 +2949,7 @@
           <w:sz w:val="23"/>
           <w:szCs w:val="23"/>
         </w:rPr>
-        <w:t xml:space="preserve">Internally the system is organised in layers (presentation, services, security services, data access, files); this is detailed in the SAD.</w:t>
+        <w:t>Internally the system is organised in layers (presentation = website in the browser, local web API, services, security services, data access, files); this is detailed in the SAD.</w:t>
       </w:r>
     </w:p>
     <w:p>
@@ -3544,7 +3612,7 @@
                 <w:sz w:val="19"/>
                 <w:szCs w:val="19"/>
               </w:rPr>
-              <w:t xml:space="preserve">Front-desk staff. Registers and searches patients, books / cancels / reschedules appointments, generates the daily appointment report. Needs speed and simple menus. Must not see clinical data.</w:t>
+              <w:t>Front-desk staff. Registers and searches patients, books / cancels / reschedules appointments, generates the daily appointment report. Needs speed and simple pages. Must not see clinical data.</w:t>
             </w:r>
           </w:p>
         </w:tc>
@@ -3861,15 +3929,7 @@
           <w:sz w:val="23"/>
           <w:szCs w:val="23"/>
         </w:rPr>
-        <w:t xml:space="preserve">Hardware:</w:t>
-      </w:r>
-      <w:r>
-        <w:rPr>
-          <w:rFonts w:ascii="Times New Roman" w:cs="Times New Roman" w:eastAsia="Times New Roman" w:hAnsi="Times New Roman"/>
-          <w:sz w:val="23"/>
-          <w:szCs w:val="23"/>
-        </w:rPr>
-        <w:t xml:space="preserve"> desktop or laptop PC, dual-core 2.0 GHz CPU or better, 4 GB RAM, 500 MB free disk space, keyboard and monitor.</w:t>
+        <w:t>Hardware: desktop or laptop PC, dual-core 2.0 GHz CPU or better, 4 GB RAM, 500 MB free disk space, keyboard, mouse and monitor (1280 × 720 or larger).</w:t>
       </w:r>
     </w:p>
     <w:p>
@@ -3917,15 +3977,27 @@
           <w:sz w:val="23"/>
           <w:szCs w:val="23"/>
         </w:rPr>
-        <w:t xml:space="preserve">Build and run-time software:</w:t>
+        <w:t>Build and run-time software: g++ 11 or later (C++17) or MSVC 2019, CMake 3.25 or later; Node.js 18 or later and npm (only to build the website); a current web browser (Chrome, Edge or Firefox) to use HMS.</w:t>
       </w:r>
+    </w:p>
+    <w:p>
+      <w:pPr>
+        <w:pStyle w:val="ListParagraph"/>
+        <w:numPr>
+          <w:ilvl w:val="0"/>
+          <w:numId w:val="2"/>
+        </w:numPr>
+        <w:spacing w:after="60" w:line="260"/>
+      </w:pPr>
       <w:r>
         <w:rPr>
           <w:rFonts w:ascii="Times New Roman" w:cs="Times New Roman" w:eastAsia="Times New Roman" w:hAnsi="Times New Roman"/>
+          <w:b/>
+          <w:bCs/>
           <w:sz w:val="23"/>
           <w:szCs w:val="23"/>
         </w:rPr>
-        <w:t xml:space="preserve"> g++ 11 or later (C++17) or MSVC 2019, CMake 3.20 or later; a console / terminal with UTF-8 support.</w:t>
+        <w:t>Network: none needed at run time. The HMS server listens only on 127.0.0.1 (this computer), port 8080 by default (HMS-SEC-009).</w:t>
       </w:r>
     </w:p>
     <w:p>
@@ -3994,6 +4066,26 @@
           <w:szCs w:val="23"/>
         </w:rPr>
         <w:t xml:space="preserve"> C / C++ is mandated by the problem statement; the team uses C++17.</w:t>
+      </w:r>
+    </w:p>
+    <w:p>
+      <w:pPr>
+        <w:pStyle w:val="ListParagraph"/>
+        <w:numPr>
+          <w:ilvl w:val="0"/>
+          <w:numId w:val="2"/>
+        </w:numPr>
+        <w:spacing w:after="60" w:line="260"/>
+      </w:pPr>
+      <w:r>
+        <w:rPr>
+          <w:rFonts w:ascii="Times New Roman" w:cs="Times New Roman" w:eastAsia="Times New Roman" w:hAnsi="Times New Roman"/>
+          <w:b/>
+          <w:bCs/>
+          <w:sz w:val="23"/>
+          <w:szCs w:val="23"/>
+        </w:rPr>
+        <w:t>User interface: a website written in TypeScript with React 18 (Vite build, Mantine components), served by the C++ program. All business rules, validation, access control and storage stay in C++; the website only displays data and sends the user's input.</w:t>
       </w:r>
     </w:p>
     <w:p>
@@ -4097,15 +4189,7 @@
           <w:sz w:val="23"/>
           <w:szCs w:val="23"/>
         </w:rPr>
-        <w:t xml:space="preserve">Build and quality tools:</w:t>
-      </w:r>
-      <w:r>
-        <w:rPr>
-          <w:rFonts w:ascii="Times New Roman" w:cs="Times New Roman" w:eastAsia="Times New Roman" w:hAnsi="Times New Roman"/>
-          <w:sz w:val="23"/>
-          <w:szCs w:val="23"/>
-        </w:rPr>
-        <w:t xml:space="preserve"> CMake, GoogleTest, gcov / lcov, cppcheck, Valgrind / AddressSanitizer, Git (course repository).</w:t>
+        <w:t>Build and quality tools: CMake, GoogleTest, npm, Vitest, TypeScript compiler, gcov / lcov, cppcheck, Valgrind / AddressSanitizer, Git (course repository).</w:t>
       </w:r>
     </w:p>
     <w:p>
@@ -4191,7 +4275,7 @@
           <w:sz w:val="23"/>
           <w:szCs w:val="23"/>
         </w:rPr>
-        <w:t xml:space="preserve">The hospital OPD is a single site with one HMS installation; one user works at a time (no concurrent multi-terminal use).</w:t>
+        <w:t>The hospital OPD is a single site with one HMS installation; one user works at a time (one browser window at a time; no multi-computer use).</w:t>
       </w:r>
     </w:p>
     <w:p>
@@ -4245,7 +4329,7 @@
           <w:sz w:val="23"/>
           <w:szCs w:val="23"/>
         </w:rPr>
-        <w:t xml:space="preserve">Users are trained staff who can read English; all screens are in English.</w:t>
+        <w:t>Users are trained staff who can read English; all pages are in English.</w:t>
       </w:r>
     </w:p>
     <w:p>
@@ -4286,6 +4370,24 @@
     </w:p>
     <w:p>
       <w:pPr>
+        <w:pStyle w:val="ListParagraph"/>
+        <w:numPr>
+          <w:ilvl w:val="0"/>
+          <w:numId w:val="2"/>
+        </w:numPr>
+        <w:spacing w:after="60" w:line="260"/>
+      </w:pPr>
+      <w:r>
+        <w:rPr>
+          <w:rFonts w:ascii="Times New Roman" w:cs="Times New Roman" w:eastAsia="Times New Roman" w:hAnsi="Times New Roman"/>
+          <w:sz w:val="23"/>
+          <w:szCs w:val="23"/>
+        </w:rPr>
+        <w:t>Node.js is needed only by developers to build the website; hospital users need only a web browser.</w:t>
+      </w:r>
+    </w:p>
+    <w:p>
+      <w:pPr>
         <w:pStyle w:val="Heading1"/>
         <w:keepNext/>
         <w:pageBreakBefore/>
@@ -4320,7 +4422,7 @@
           <w:sz w:val="23"/>
           <w:szCs w:val="23"/>
         </w:rPr>
-        <w:t xml:space="preserve">HMS has a text-mode (console) user interface. Details will be refined in the SAD (section 4.5). The following conventions apply to every screen:</w:t>
+        <w:t>HMS has a web user interface that runs in the web browser of the HMS computer (http://localhost:8080). Details are in the SAD (section 4.5). The following conventions apply to every page:</w:t>
       </w:r>
     </w:p>
     <w:p>
@@ -4338,7 +4440,7 @@
           <w:sz w:val="23"/>
           <w:szCs w:val="23"/>
         </w:rPr>
-        <w:t xml:space="preserve">The top line shows "HMS — Hospital Management System", the logged-in username and role, and the current date and time.</w:t>
+        <w:t>A header shows "HMS — Hospital Management System", the logged-in username and role, a light / dark switch and a Log out button.</w:t>
       </w:r>
     </w:p>
     <w:p>
@@ -4356,7 +4458,7 @@
           <w:sz w:val="23"/>
           <w:szCs w:val="23"/>
         </w:rPr>
-        <w:t xml:space="preserve">Choices are numbered; "0" always means Back / Exit; invalid choices re-display the menu with an error line.</w:t>
+        <w:t>A sidebar lists only the pages the user's role may use (HMS-F-003); every form has a Save (or action) button and a Cancel button.</w:t>
       </w:r>
     </w:p>
     <w:p>
@@ -4374,7 +4476,7 @@
           <w:sz w:val="23"/>
           <w:szCs w:val="23"/>
         </w:rPr>
-        <w:t xml:space="preserve">Errors are displayed as "ERROR Exxx: message" on one line, naming the field and the rule (error catalogue: SAD 4.4).</w:t>
+        <w:t>Errors are shown next to the form as "Exxx: message", naming the field and the rule (error catalogue: SAD 4.4).</w:t>
       </w:r>
     </w:p>
     <w:p>
@@ -4392,7 +4494,7 @@
           <w:sz w:val="23"/>
           <w:szCs w:val="23"/>
         </w:rPr>
-        <w:t xml:space="preserve">Successful operations end with a one-line confirmation containing the generated ID.</w:t>
+        <w:t>Successful operations show a green confirmation message containing the generated ID.</w:t>
       </w:r>
     </w:p>
     <w:p>
@@ -4410,7 +4512,7 @@
           <w:sz w:val="23"/>
           <w:szCs w:val="23"/>
         </w:rPr>
-        <w:t xml:space="preserve">Passwords are typed without echo (HMS-SEC-004). Destructive or irreversible actions (restore backup, deactivate patient) ask "Confirm (Y/N)?".</w:t>
+        <w:t>Passwords are typed in masked password fields (HMS-SEC-004). Destructive or irreversible actions (restore backup, deactivate patient, cancel appointment) ask for confirmation in a dialog with Yes / No buttons.</w:t>
       </w:r>
     </w:p>
     <w:p>
@@ -4428,7 +4530,7 @@
           <w:sz w:val="23"/>
           <w:szCs w:val="23"/>
         </w:rPr>
-        <w:t xml:space="preserve">Lists show at most 20 rows per page with "N = next page, P = previous page".</w:t>
+        <w:t>Lists show at most 20 rows per page with Previous / Next buttons.</w:t>
       </w:r>
     </w:p>
     <w:p>
@@ -4445,7 +4547,7 @@
           <w:sz w:val="23"/>
           <w:szCs w:val="23"/>
         </w:rPr>
-        <w:t xml:space="preserve">Sample screen (Receptionist main menu)</w:t>
+        <w:t>Sample page (Receptionist dashboard, simplified)</w:t>
       </w:r>
     </w:p>
     <w:tbl>
@@ -4495,7 +4597,7 @@
                 <w:sz w:val="16"/>
                 <w:szCs w:val="16"/>
               </w:rPr>
-              <w:t xml:space="preserve">HMS — Hospital Management System     rec01 (Receptionist)   2026-10-12 09:41</w:t>
+              <w:t>[HMS] Hospital Management System                rec01  [Receptionist]  [dark mode]  [Log out]</w:t>
             </w:r>
           </w:p>
           <w:p>
@@ -4509,7 +4611,7 @@
                 <w:sz w:val="16"/>
                 <w:szCs w:val="16"/>
               </w:rPr>
-              <w:t xml:space="preserve">--------------------------------------------------------------------------</w:t>
+              <w:t>-----------------------------------------------------------------------------------------------</w:t>
             </w:r>
           </w:p>
           <w:p>
@@ -4523,7 +4625,7 @@
                 <w:sz w:val="16"/>
                 <w:szCs w:val="16"/>
               </w:rPr>
-              <w:t xml:space="preserve">  1. Register patient          5. Cancel / reschedule appointment</w:t>
+              <w:t xml:space="preserve"> Dashboard           | Welcome, rec01                         Receptionist · 2026-10-26</w:t>
             </w:r>
           </w:p>
           <w:p>
@@ -4537,7 +4639,7 @@
                 <w:sz w:val="16"/>
                 <w:szCs w:val="16"/>
               </w:rPr>
-              <w:t xml:space="preserve">  2. Search patient            6. View doctor schedule</w:t>
+              <w:t xml:space="preserve"> Patients            | [Appointments today 12] [Scheduled 9] [Completed 2] [No-show 1]</w:t>
             </w:r>
           </w:p>
           <w:p>
@@ -4551,7 +4653,7 @@
                 <w:sz w:val="16"/>
                 <w:szCs w:val="16"/>
               </w:rPr>
-              <w:t xml:space="preserve">  3. Update patient details    7. Daily appointment report</w:t>
+              <w:t xml:space="preserve"> Doctors             |</w:t>
             </w:r>
           </w:p>
           <w:p>
@@ -4565,7 +4667,7 @@
                 <w:sz w:val="16"/>
                 <w:szCs w:val="16"/>
               </w:rPr>
-              <w:t xml:space="preserve">  4. Book appointment          8. Change password</w:t>
+              <w:t xml:space="preserve"> Appointments        | [Patients]  [Doctors]  [Appointments]</w:t>
             </w:r>
           </w:p>
           <w:p>
@@ -4579,7 +4681,7 @@
                 <w:sz w:val="16"/>
                 <w:szCs w:val="16"/>
               </w:rPr>
-              <w:t xml:space="preserve">  0. Log out</w:t>
+              <w:t xml:space="preserve"> Doctor schedules    | [Doctor schedules]  [Reports]  [Change my password]</w:t>
             </w:r>
           </w:p>
           <w:p>
@@ -4593,7 +4695,21 @@
                 <w:sz w:val="16"/>
                 <w:szCs w:val="16"/>
               </w:rPr>
-              <w:t xml:space="preserve">Enter choice: _</w:t>
+              <w:t xml:space="preserve"> Reports             |</w:t>
+            </w:r>
+          </w:p>
+          <w:p>
+            <w:pPr>
+              <w:spacing w:after="30" w:line="240"/>
+              <w:jc w:val="left"/>
+            </w:pPr>
+            <w:r>
+              <w:rPr>
+                <w:rFonts w:ascii="Consolas" w:cs="Consolas" w:eastAsia="Consolas" w:hAnsi="Consolas"/>
+                <w:sz w:val="16"/>
+                <w:szCs w:val="16"/>
+              </w:rPr>
+              <w:t xml:space="preserve"> Change my password  |</w:t>
             </w:r>
           </w:p>
         </w:tc>
@@ -5139,6 +5255,309 @@
                 <w:szCs w:val="19"/>
               </w:rPr>
               <w:t xml:space="preserve">Unit-test framework; not part of the delivered binary.</w:t>
+            </w:r>
+          </w:p>
+        </w:tc>
+      </w:tr>
+      <w:tr>
+        <w:trPr>
+          <w:cantSplit/>
+        </w:trPr>
+        <w:tc>
+          <w:tcPr>
+            <w:tcW w:type="dxa" w:w="2300"/>
+            <w:tcBorders>
+              <w:top w:val="single" w:color="808080" w:sz="4"/>
+              <w:left w:val="single" w:color="808080" w:sz="4"/>
+              <w:bottom w:val="single" w:color="808080" w:sz="4"/>
+              <w:right w:val="single" w:color="808080" w:sz="4"/>
+            </w:tcBorders>
+            <w:tcMar>
+              <w:top w:type="dxa" w:w="50"/>
+              <w:left w:type="dxa" w:w="90"/>
+              <w:bottom w:type="dxa" w:w="50"/>
+              <w:right w:type="dxa" w:w="90"/>
+            </w:tcMar>
+            <w:vAlign w:val="top"/>
+          </w:tcPr>
+          <w:p>
+            <w:pPr>
+              <w:spacing w:after="30" w:line="240"/>
+              <w:jc w:val="left"/>
+            </w:pPr>
+            <w:r>
+              <w:rPr>
+                <w:rFonts w:ascii="Times New Roman" w:cs="Times New Roman" w:eastAsia="Times New Roman" w:hAnsi="Times New Roman"/>
+                <w:sz w:val="19"/>
+                <w:szCs w:val="19"/>
+              </w:rPr>
+              <w:t>Web browser</w:t>
+            </w:r>
+          </w:p>
+        </w:tc>
+        <w:tc>
+          <w:tcPr>
+            <w:tcW w:type="dxa" w:w="3100"/>
+            <w:tcBorders>
+              <w:top w:val="single" w:color="808080" w:sz="4"/>
+              <w:left w:val="single" w:color="808080" w:sz="4"/>
+              <w:bottom w:val="single" w:color="808080" w:sz="4"/>
+              <w:right w:val="single" w:color="808080" w:sz="4"/>
+            </w:tcBorders>
+            <w:tcMar>
+              <w:top w:type="dxa" w:w="50"/>
+              <w:left w:type="dxa" w:w="90"/>
+              <w:bottom w:type="dxa" w:w="50"/>
+              <w:right w:type="dxa" w:w="90"/>
+            </w:tcMar>
+            <w:vAlign w:val="top"/>
+          </w:tcPr>
+          <w:p>
+            <w:pPr>
+              <w:spacing w:after="30" w:line="240"/>
+              <w:jc w:val="left"/>
+            </w:pPr>
+            <w:r>
+              <w:rPr>
+                <w:rFonts w:ascii="Times New Roman" w:cs="Times New Roman" w:eastAsia="Times New Roman" w:hAnsi="Times New Roman"/>
+                <w:sz w:val="19"/>
+                <w:szCs w:val="19"/>
+              </w:rPr>
+              <w:t>Chrome, Edge or Firefox (current)</w:t>
+            </w:r>
+          </w:p>
+        </w:tc>
+        <w:tc>
+          <w:tcPr>
+            <w:tcW w:type="dxa" w:w="4346"/>
+            <w:tcBorders>
+              <w:top w:val="single" w:color="808080" w:sz="4"/>
+              <w:left w:val="single" w:color="808080" w:sz="4"/>
+              <w:bottom w:val="single" w:color="808080" w:sz="4"/>
+              <w:right w:val="single" w:color="808080" w:sz="4"/>
+            </w:tcBorders>
+            <w:tcMar>
+              <w:top w:type="dxa" w:w="50"/>
+              <w:left w:type="dxa" w:w="90"/>
+              <w:bottom w:type="dxa" w:w="50"/>
+              <w:right w:type="dxa" w:w="90"/>
+            </w:tcMar>
+            <w:vAlign w:val="top"/>
+          </w:tcPr>
+          <w:p>
+            <w:pPr>
+              <w:spacing w:after="30" w:line="240"/>
+              <w:jc w:val="left"/>
+            </w:pPr>
+            <w:r>
+              <w:rPr>
+                <w:rFonts w:ascii="Times New Roman" w:cs="Times New Roman" w:eastAsia="Times New Roman" w:hAnsi="Times New Roman"/>
+                <w:sz w:val="19"/>
+                <w:szCs w:val="19"/>
+              </w:rPr>
+              <w:t>Shows the HMS website; exchanges JSON with the HMS server over HTTP on 127.0.0.1 only</w:t>
+            </w:r>
+          </w:p>
+        </w:tc>
+      </w:tr>
+      <w:tr>
+        <w:trPr>
+          <w:cantSplit/>
+        </w:trPr>
+        <w:tc>
+          <w:tcPr>
+            <w:tcW w:type="dxa" w:w="2300"/>
+            <w:tcBorders>
+              <w:top w:val="single" w:color="808080" w:sz="4"/>
+              <w:left w:val="single" w:color="808080" w:sz="4"/>
+              <w:bottom w:val="single" w:color="808080" w:sz="4"/>
+              <w:right w:val="single" w:color="808080" w:sz="4"/>
+            </w:tcBorders>
+            <w:tcMar>
+              <w:top w:type="dxa" w:w="50"/>
+              <w:left w:type="dxa" w:w="90"/>
+              <w:bottom w:type="dxa" w:w="50"/>
+              <w:right w:type="dxa" w:w="90"/>
+            </w:tcMar>
+            <w:vAlign w:val="top"/>
+          </w:tcPr>
+          <w:p>
+            <w:pPr>
+              <w:spacing w:after="30" w:line="240"/>
+              <w:jc w:val="left"/>
+            </w:pPr>
+            <w:r>
+              <w:rPr>
+                <w:rFonts w:ascii="Times New Roman" w:cs="Times New Roman" w:eastAsia="Times New Roman" w:hAnsi="Times New Roman"/>
+                <w:sz w:val="19"/>
+                <w:szCs w:val="19"/>
+              </w:rPr>
+              <w:t>React, Mantine, Vite</w:t>
+            </w:r>
+          </w:p>
+        </w:tc>
+        <w:tc>
+          <w:tcPr>
+            <w:tcW w:type="dxa" w:w="3100"/>
+            <w:tcBorders>
+              <w:top w:val="single" w:color="808080" w:sz="4"/>
+              <w:left w:val="single" w:color="808080" w:sz="4"/>
+              <w:bottom w:val="single" w:color="808080" w:sz="4"/>
+              <w:right w:val="single" w:color="808080" w:sz="4"/>
+            </w:tcBorders>
+            <w:tcMar>
+              <w:top w:type="dxa" w:w="50"/>
+              <w:left w:type="dxa" w:w="90"/>
+              <w:bottom w:type="dxa" w:w="50"/>
+              <w:right w:type="dxa" w:w="90"/>
+            </w:tcMar>
+            <w:vAlign w:val="top"/>
+          </w:tcPr>
+          <w:p>
+            <w:pPr>
+              <w:spacing w:after="30" w:line="240"/>
+              <w:jc w:val="left"/>
+            </w:pPr>
+            <w:r>
+              <w:rPr>
+                <w:rFonts w:ascii="Times New Roman" w:cs="Times New Roman" w:eastAsia="Times New Roman" w:hAnsi="Times New Roman"/>
+                <w:sz w:val="19"/>
+                <w:szCs w:val="19"/>
+              </w:rPr>
+              <w:t>18.3 / 7.17 / 5.4</w:t>
+            </w:r>
+          </w:p>
+        </w:tc>
+        <w:tc>
+          <w:tcPr>
+            <w:tcW w:type="dxa" w:w="4346"/>
+            <w:tcBorders>
+              <w:top w:val="single" w:color="808080" w:sz="4"/>
+              <w:left w:val="single" w:color="808080" w:sz="4"/>
+              <w:bottom w:val="single" w:color="808080" w:sz="4"/>
+              <w:right w:val="single" w:color="808080" w:sz="4"/>
+            </w:tcBorders>
+            <w:tcMar>
+              <w:top w:type="dxa" w:w="50"/>
+              <w:left w:type="dxa" w:w="90"/>
+              <w:bottom w:type="dxa" w:w="50"/>
+              <w:right w:type="dxa" w:w="90"/>
+            </w:tcMar>
+            <w:vAlign w:val="top"/>
+          </w:tcPr>
+          <w:p>
+            <w:pPr>
+              <w:spacing w:after="30" w:line="240"/>
+              <w:jc w:val="left"/>
+            </w:pPr>
+            <w:r>
+              <w:rPr>
+                <w:rFonts w:ascii="Times New Roman" w:cs="Times New Roman" w:eastAsia="Times New Roman" w:hAnsi="Times New Roman"/>
+                <w:sz w:val="19"/>
+                <w:szCs w:val="19"/>
+              </w:rPr>
+              <w:t>Website libraries, bundled into static files at build time (no internet needed at run time)</w:t>
+            </w:r>
+          </w:p>
+        </w:tc>
+      </w:tr>
+      <w:tr>
+        <w:trPr>
+          <w:cantSplit/>
+        </w:trPr>
+        <w:tc>
+          <w:tcPr>
+            <w:tcW w:type="dxa" w:w="2300"/>
+            <w:tcBorders>
+              <w:top w:val="single" w:color="808080" w:sz="4"/>
+              <w:left w:val="single" w:color="808080" w:sz="4"/>
+              <w:bottom w:val="single" w:color="808080" w:sz="4"/>
+              <w:right w:val="single" w:color="808080" w:sz="4"/>
+            </w:tcBorders>
+            <w:tcMar>
+              <w:top w:type="dxa" w:w="50"/>
+              <w:left w:type="dxa" w:w="90"/>
+              <w:bottom w:type="dxa" w:w="50"/>
+              <w:right w:type="dxa" w:w="90"/>
+            </w:tcMar>
+            <w:vAlign w:val="top"/>
+          </w:tcPr>
+          <w:p>
+            <w:pPr>
+              <w:spacing w:after="30" w:line="240"/>
+              <w:jc w:val="left"/>
+            </w:pPr>
+            <w:r>
+              <w:rPr>
+                <w:rFonts w:ascii="Times New Roman" w:cs="Times New Roman" w:eastAsia="Times New Roman" w:hAnsi="Times New Roman"/>
+                <w:sz w:val="19"/>
+                <w:szCs w:val="19"/>
+              </w:rPr>
+              <w:t>cpp-httplib, nlohmann/json</w:t>
+            </w:r>
+          </w:p>
+        </w:tc>
+        <w:tc>
+          <w:tcPr>
+            <w:tcW w:type="dxa" w:w="3100"/>
+            <w:tcBorders>
+              <w:top w:val="single" w:color="808080" w:sz="4"/>
+              <w:left w:val="single" w:color="808080" w:sz="4"/>
+              <w:bottom w:val="single" w:color="808080" w:sz="4"/>
+              <w:right w:val="single" w:color="808080" w:sz="4"/>
+            </w:tcBorders>
+            <w:tcMar>
+              <w:top w:type="dxa" w:w="50"/>
+              <w:left w:type="dxa" w:w="90"/>
+              <w:bottom w:type="dxa" w:w="50"/>
+              <w:right w:type="dxa" w:w="90"/>
+            </w:tcMar>
+            <w:vAlign w:val="top"/>
+          </w:tcPr>
+          <w:p>
+            <w:pPr>
+              <w:spacing w:after="30" w:line="240"/>
+              <w:jc w:val="left"/>
+            </w:pPr>
+            <w:r>
+              <w:rPr>
+                <w:rFonts w:ascii="Times New Roman" w:cs="Times New Roman" w:eastAsia="Times New Roman" w:hAnsi="Times New Roman"/>
+                <w:sz w:val="19"/>
+                <w:szCs w:val="19"/>
+              </w:rPr>
+              <w:t>0.18 / 3.11</w:t>
+            </w:r>
+          </w:p>
+        </w:tc>
+        <w:tc>
+          <w:tcPr>
+            <w:tcW w:type="dxa" w:w="4346"/>
+            <w:tcBorders>
+              <w:top w:val="single" w:color="808080" w:sz="4"/>
+              <w:left w:val="single" w:color="808080" w:sz="4"/>
+              <w:bottom w:val="single" w:color="808080" w:sz="4"/>
+              <w:right w:val="single" w:color="808080" w:sz="4"/>
+            </w:tcBorders>
+            <w:tcMar>
+              <w:top w:type="dxa" w:w="50"/>
+              <w:left w:type="dxa" w:w="90"/>
+              <w:bottom w:type="dxa" w:w="50"/>
+              <w:right w:type="dxa" w:w="90"/>
+            </w:tcMar>
+            <w:vAlign w:val="top"/>
+          </w:tcPr>
+          <w:p>
+            <w:pPr>
+              <w:spacing w:after="30" w:line="240"/>
+              <w:jc w:val="left"/>
+            </w:pPr>
+            <w:r>
+              <w:rPr>
+                <w:rFonts w:ascii="Times New Roman" w:cs="Times New Roman" w:eastAsia="Times New Roman" w:hAnsi="Times New Roman"/>
+                <w:sz w:val="19"/>
+                <w:szCs w:val="19"/>
+              </w:rPr>
+              <w:t>HTTP server and JSON handling inside the C++ program (header-only)</w:t>
             </w:r>
           </w:p>
         </w:tc>
@@ -5187,25 +5606,7 @@
           <w:sz w:val="23"/>
           <w:szCs w:val="23"/>
         </w:rPr>
-        <w:t xml:space="preserve">HMS has </w:t>
-      </w:r>
-      <w:r>
-        <w:rPr>
-          <w:rFonts w:ascii="Times New Roman" w:cs="Times New Roman" w:eastAsia="Times New Roman" w:hAnsi="Times New Roman"/>
-          <w:b/>
-          <w:bCs/>
-          <w:sz w:val="23"/>
-          <w:szCs w:val="23"/>
-        </w:rPr>
-        <w:t xml:space="preserve">no network communication</w:t>
-      </w:r>
-      <w:r>
-        <w:rPr>
-          <w:rFonts w:ascii="Times New Roman" w:cs="Times New Roman" w:eastAsia="Times New Roman" w:hAnsi="Times New Roman"/>
-          <w:sz w:val="23"/>
-          <w:szCs w:val="23"/>
-        </w:rPr>
-        <w:t xml:space="preserve">: it opens no sockets and calls no remote services, so there is no remote attack surface in release 1.0. The only outward data flows are CSV report files written to a user-selected folder (UTF-8, comma-separated, first row = column names) and backup folders written to the local disk. Should a network interface be added later, TLS 1.2 or higher must be used (open issue in the SAD).</w:t>
+        <w:t>The website and the HMS program communicate over HTTP with JSON messages on the loopback address 127.0.0.1 only (port 8080 by default). The server never listens on a network interface, so it cannot be reached from other computers (HMS-SEC-009). Every request other than status, first-run set-up and login carries a random session token. HMS calls no remote services and needs no internet connection at run time. The only outward data flows are CSV report files (UTF-8, comma-separated, first row = column names) downloaded through the browser.</w:t>
       </w:r>
     </w:p>
     <w:p>
@@ -5231,7 +5632,7 @@
           <w:sz w:val="23"/>
           <w:szCs w:val="23"/>
         </w:rPr>
-        <w:t xml:space="preserve">HMS uses only a standard keyboard (input), a display (text output) and local disk storage through the operating system. It has no direct hardware interface; printing is done by the user from the exported CSV file.</w:t>
+        <w:t>HMS uses only a standard keyboard and mouse (input), a display showing the web browser, and local disk storage through the operating system. It has no direct hardware interface; printing is done by the user from the browser or from the exported CSV file.</w:t>
       </w:r>
     </w:p>
     <w:p>
@@ -7955,7 +8356,7 @@
                 <w:sz w:val="19"/>
                 <w:szCs w:val="19"/>
               </w:rPr>
-              <w:t xml:space="preserve">1. The system shows the login prompt.</w:t>
+              <w:t>1. The system shows the login page.</w:t>
             </w:r>
           </w:p>
           <w:p>
@@ -7971,7 +8372,7 @@
                 <w:sz w:val="19"/>
                 <w:szCs w:val="19"/>
               </w:rPr>
-              <w:t xml:space="preserve">2. The user enters username and password (password masked).</w:t>
+              <w:t>2. The user enters username and password (password masked).</w:t>
             </w:r>
           </w:p>
           <w:p>
@@ -7987,7 +8388,7 @@
                 <w:sz w:val="19"/>
                 <w:szCs w:val="19"/>
               </w:rPr>
-              <w:t xml:space="preserve">3. The system validates the input, verifies the password hash and creates a session.</w:t>
+              <w:t>3. The system validates the input, verifies the password hash and creates a session.</w:t>
             </w:r>
           </w:p>
           <w:p>
@@ -8003,7 +8404,7 @@
                 <w:sz w:val="19"/>
                 <w:szCs w:val="19"/>
               </w:rPr>
-              <w:t xml:space="preserve">4. The system shows the main menu for the user's role.</w:t>
+              <w:t>4. The system shows the dashboard for the user's role.</w:t>
             </w:r>
           </w:p>
         </w:tc>
@@ -9469,25 +9870,7 @@
           <w:sz w:val="23"/>
           <w:szCs w:val="23"/>
         </w:rPr>
-        <w:t xml:space="preserve">Each requirement has a unique identifier of the form </w:t>
-      </w:r>
-      <w:r>
-        <w:rPr>
-          <w:rFonts w:ascii="Times New Roman" w:cs="Times New Roman" w:eastAsia="Times New Roman" w:hAnsi="Times New Roman"/>
-          <w:b/>
-          <w:bCs/>
-          <w:sz w:val="23"/>
-          <w:szCs w:val="23"/>
-        </w:rPr>
-        <w:t xml:space="preserve">HMS-F-nnn</w:t>
-      </w:r>
-      <w:r>
-        <w:rPr>
-          <w:rFonts w:ascii="Times New Roman" w:cs="Times New Roman" w:eastAsia="Times New Roman" w:hAnsi="Times New Roman"/>
-          <w:sz w:val="23"/>
-          <w:szCs w:val="23"/>
-        </w:rPr>
-        <w:t xml:space="preserve"> and is written as one "shall" statement that is clear (one meaning), concise, measurable or directly verifiable (limits, formats and counts are stated), and testable by at least one test case listed in Appendix C. Priority: High = must be delivered for release 1.0; Medium = should be delivered; Low = may be postponed.</w:t>
+        <w:t>Each requirement has a unique identifier of the form HMS-F-nnn and is written as one "shall" statement that is clear (one meaning), concise, measurable or directly verifiable (limits, formats and counts are stated), and testable by at least one test case listed in Appendix C. Priority: High = must be delivered for release 1.1; Medium = should be delivered; Low = may be postponed.</w:t>
       </w:r>
     </w:p>
     <w:p>
@@ -9682,7 +10065,7 @@
                 <w:sz w:val="19"/>
                 <w:szCs w:val="19"/>
               </w:rPr>
-              <w:t xml:space="preserve">User starts HMS</w:t>
+              <w:t>User opens http://localhost:8080</w:t>
             </w:r>
           </w:p>
         </w:tc>
@@ -9714,7 +10097,7 @@
                 <w:sz w:val="19"/>
                 <w:szCs w:val="19"/>
               </w:rPr>
-              <w:t xml:space="preserve">Login prompt is displayed; nothing else is reachable.</w:t>
+              <w:t>Login page is displayed; nothing else is reachable.</w:t>
             </w:r>
           </w:p>
         </w:tc>
@@ -9783,7 +10166,7 @@
                 <w:sz w:val="19"/>
                 <w:szCs w:val="19"/>
               </w:rPr>
-              <w:t xml:space="preserve">Main menu for the role is displayed.</w:t>
+              <w:t>The dashboard and the sidebar for the role are displayed.</w:t>
             </w:r>
           </w:p>
         </w:tc>
@@ -9990,7 +10373,7 @@
                 <w:sz w:val="19"/>
                 <w:szCs w:val="19"/>
               </w:rPr>
-              <w:t xml:space="preserve">Session ends; login prompt is shown.</w:t>
+              <w:t>Session ends; login page is shown.</w:t>
             </w:r>
           </w:p>
         </w:tc>
@@ -15188,6 +15571,703 @@
     </w:tbl>
     <w:p>
       <w:pPr>
+        <w:spacing w:after="100" w:before="0" w:line="264"/>
+        <w:jc w:val="left"/>
+      </w:pPr>
+      <w:r>
+        <w:rPr>
+          <w:rFonts w:ascii="Times New Roman" w:cs="Times New Roman" w:eastAsia="Times New Roman" w:hAnsi="Times New Roman"/>
+          <w:sz w:val="23"/>
+          <w:szCs w:val="23"/>
+        </w:rPr>
+      </w:r>
+    </w:p>
+    <w:p>
+      <w:pPr>
+        <w:pStyle w:val="Heading2"/>
+        <w:keepNext/>
+        <w:pageBreakBefore/>
+      </w:pPr>
+      <w:r>
+        <w:rPr>
+          <w:rFonts w:ascii="Times New Roman" w:cs="Times New Roman" w:eastAsia="Times New Roman" w:hAnsi="Times New Roman"/>
+        </w:rPr>
+        <w:t>5.5 Web User Interface</w:t>
+      </w:r>
+    </w:p>
+    <w:p>
+      <w:pPr>
+        <w:pStyle w:val="Heading3"/>
+        <w:keepNext/>
+      </w:pPr>
+      <w:r>
+        <w:rPr>
+          <w:rFonts w:ascii="Times New Roman" w:cs="Times New Roman" w:eastAsia="Times New Roman" w:hAnsi="Times New Roman"/>
+        </w:rPr>
+        <w:t>5.5.1 Description and Priority</w:t>
+      </w:r>
+    </w:p>
+    <w:p>
+      <w:pPr>
+        <w:spacing w:after="100" w:before="0" w:line="264"/>
+        <w:jc w:val="left"/>
+      </w:pPr>
+      <w:r>
+        <w:rPr>
+          <w:rFonts w:ascii="Times New Roman" w:cs="Times New Roman" w:eastAsia="Times New Roman" w:hAnsi="Times New Roman"/>
+          <w:sz w:val="23"/>
+          <w:szCs w:val="23"/>
+        </w:rPr>
+        <w:t>Priority: High. Every function of Sections 5.1 to 5.4 is used through a website that runs in the web browser of the HMS computer. The website is only a presentation layer: it calls the HMS program for every action, and the HMS program applies all rules, validation and access control. Benefit: familiar point-and-click pages for staff; risk: an extra build tool (Node.js) for the developers.</w:t>
+      </w:r>
+    </w:p>
+    <w:p>
+      <w:pPr>
+        <w:pStyle w:val="Heading3"/>
+        <w:keepNext/>
+      </w:pPr>
+      <w:r>
+        <w:rPr>
+          <w:rFonts w:ascii="Times New Roman" w:cs="Times New Roman" w:eastAsia="Times New Roman" w:hAnsi="Times New Roman"/>
+        </w:rPr>
+        <w:t>5.5.2 Functional Requirements</w:t>
+      </w:r>
+    </w:p>
+    <w:tbl>
+      <w:tblPr>
+        <w:tblW w:type="dxa" w:w="9746"/>
+        <w:tblBorders>
+          <w:top w:val="single" w:color="auto" w:sz="4"/>
+          <w:left w:val="single" w:color="auto" w:sz="4"/>
+          <w:bottom w:val="single" w:color="auto" w:sz="4"/>
+          <w:right w:val="single" w:color="auto" w:sz="4"/>
+          <w:insideH w:val="single" w:color="auto" w:sz="4"/>
+          <w:insideV w:val="single" w:color="auto" w:sz="4"/>
+        </w:tblBorders>
+      </w:tblPr>
+      <w:tblGrid>
+        <w:gridCol w:w="1400"/>
+        <w:gridCol w:w="7100"/>
+        <w:gridCol w:w="1246"/>
+      </w:tblGrid>
+      <w:tr>
+        <w:trPr>
+          <w:tblHeader/>
+        </w:trPr>
+        <w:tc>
+          <w:tcPr>
+            <w:tcW w:type="dxa" w:w="1400"/>
+            <w:tcBorders>
+              <w:top w:val="single" w:color="808080" w:sz="4"/>
+              <w:left w:val="single" w:color="808080" w:sz="4"/>
+              <w:bottom w:val="single" w:color="808080" w:sz="4"/>
+              <w:right w:val="single" w:color="808080" w:sz="4"/>
+            </w:tcBorders>
+            <w:shd w:fill="DCE6F2" w:color="auto" w:val="clear"/>
+            <w:tcMar>
+              <w:top w:type="dxa" w:w="50"/>
+              <w:left w:type="dxa" w:w="90"/>
+              <w:bottom w:type="dxa" w:w="50"/>
+              <w:right w:type="dxa" w:w="90"/>
+            </w:tcMar>
+            <w:vAlign w:val="top"/>
+          </w:tcPr>
+          <w:p>
+            <w:pPr>
+              <w:spacing w:after="30" w:line="240"/>
+              <w:jc w:val="left"/>
+            </w:pPr>
+            <w:r>
+              <w:rPr>
+                <w:rFonts w:ascii="Times New Roman" w:cs="Times New Roman" w:eastAsia="Times New Roman" w:hAnsi="Times New Roman"/>
+                <w:b/>
+                <w:bCs/>
+                <w:sz w:val="19"/>
+                <w:szCs w:val="19"/>
+              </w:rPr>
+              <w:t xml:space="preserve">ID</w:t>
+            </w:r>
+          </w:p>
+        </w:tc>
+        <w:tc>
+          <w:tcPr>
+            <w:tcW w:type="dxa" w:w="7100"/>
+            <w:tcBorders>
+              <w:top w:val="single" w:color="808080" w:sz="4"/>
+              <w:left w:val="single" w:color="808080" w:sz="4"/>
+              <w:bottom w:val="single" w:color="808080" w:sz="4"/>
+              <w:right w:val="single" w:color="808080" w:sz="4"/>
+            </w:tcBorders>
+            <w:shd w:fill="DCE6F2" w:color="auto" w:val="clear"/>
+            <w:tcMar>
+              <w:top w:type="dxa" w:w="50"/>
+              <w:left w:type="dxa" w:w="90"/>
+              <w:bottom w:type="dxa" w:w="50"/>
+              <w:right w:type="dxa" w:w="90"/>
+            </w:tcMar>
+            <w:vAlign w:val="top"/>
+          </w:tcPr>
+          <w:p>
+            <w:pPr>
+              <w:spacing w:after="30" w:line="240"/>
+              <w:jc w:val="left"/>
+            </w:pPr>
+            <w:r>
+              <w:rPr>
+                <w:rFonts w:ascii="Times New Roman" w:cs="Times New Roman" w:eastAsia="Times New Roman" w:hAnsi="Times New Roman"/>
+                <w:b/>
+                <w:bCs/>
+                <w:sz w:val="19"/>
+                <w:szCs w:val="19"/>
+              </w:rPr>
+              <w:t xml:space="preserve">Requirement</w:t>
+            </w:r>
+          </w:p>
+        </w:tc>
+        <w:tc>
+          <w:tcPr>
+            <w:tcW w:type="dxa" w:w="1246"/>
+            <w:tcBorders>
+              <w:top w:val="single" w:color="808080" w:sz="4"/>
+              <w:left w:val="single" w:color="808080" w:sz="4"/>
+              <w:bottom w:val="single" w:color="808080" w:sz="4"/>
+              <w:right w:val="single" w:color="808080" w:sz="4"/>
+            </w:tcBorders>
+            <w:shd w:fill="DCE6F2" w:color="auto" w:val="clear"/>
+            <w:tcMar>
+              <w:top w:type="dxa" w:w="50"/>
+              <w:left w:type="dxa" w:w="90"/>
+              <w:bottom w:type="dxa" w:w="50"/>
+              <w:right w:type="dxa" w:w="90"/>
+            </w:tcMar>
+            <w:vAlign w:val="top"/>
+          </w:tcPr>
+          <w:p>
+            <w:pPr>
+              <w:spacing w:after="30" w:line="240"/>
+              <w:jc w:val="left"/>
+            </w:pPr>
+            <w:r>
+              <w:rPr>
+                <w:rFonts w:ascii="Times New Roman" w:cs="Times New Roman" w:eastAsia="Times New Roman" w:hAnsi="Times New Roman"/>
+                <w:b/>
+                <w:bCs/>
+                <w:sz w:val="19"/>
+                <w:szCs w:val="19"/>
+              </w:rPr>
+              <w:t xml:space="preserve">Priority</w:t>
+            </w:r>
+          </w:p>
+        </w:tc>
+      </w:tr>
+      <w:tr>
+        <w:trPr/>
+        <w:tc>
+          <w:tcPr>
+            <w:tcW w:type="dxa" w:w="1400"/>
+            <w:tcBorders>
+              <w:top w:val="single" w:color="808080" w:sz="4"/>
+              <w:left w:val="single" w:color="808080" w:sz="4"/>
+              <w:bottom w:val="single" w:color="808080" w:sz="4"/>
+              <w:right w:val="single" w:color="808080" w:sz="4"/>
+            </w:tcBorders>
+            <w:tcMar>
+              <w:top w:type="dxa" w:w="50"/>
+              <w:left w:type="dxa" w:w="90"/>
+              <w:bottom w:type="dxa" w:w="50"/>
+              <w:right w:type="dxa" w:w="90"/>
+            </w:tcMar>
+            <w:vAlign w:val="top"/>
+          </w:tcPr>
+          <w:p>
+            <w:pPr>
+              <w:spacing w:after="30" w:line="240"/>
+              <w:jc w:val="left"/>
+            </w:pPr>
+            <w:r>
+              <w:rPr>
+                <w:rFonts w:ascii="Times New Roman" w:cs="Times New Roman" w:eastAsia="Times New Roman" w:hAnsi="Times New Roman"/>
+                <w:b/>
+                <w:bCs/>
+                <w:sz w:val="19"/>
+                <w:szCs w:val="19"/>
+              </w:rPr>
+              <w:t>HMS-F-070</w:t>
+            </w:r>
+          </w:p>
+        </w:tc>
+        <w:tc>
+          <w:tcPr>
+            <w:tcW w:type="dxa" w:w="7100"/>
+            <w:tcBorders>
+              <w:top w:val="single" w:color="808080" w:sz="4"/>
+              <w:left w:val="single" w:color="808080" w:sz="4"/>
+              <w:bottom w:val="single" w:color="808080" w:sz="4"/>
+              <w:right w:val="single" w:color="808080" w:sz="4"/>
+            </w:tcBorders>
+            <w:tcMar>
+              <w:top w:type="dxa" w:w="50"/>
+              <w:left w:type="dxa" w:w="90"/>
+              <w:bottom w:type="dxa" w:w="50"/>
+              <w:right w:type="dxa" w:w="90"/>
+            </w:tcMar>
+            <w:vAlign w:val="top"/>
+          </w:tcPr>
+          <w:p>
+            <w:pPr>
+              <w:spacing w:after="30" w:line="240"/>
+              <w:jc w:val="left"/>
+            </w:pPr>
+            <w:r>
+              <w:rPr>
+                <w:rFonts w:ascii="Times New Roman" w:cs="Times New Roman" w:eastAsia="Times New Roman" w:hAnsi="Times New Roman"/>
+                <w:sz w:val="19"/>
+                <w:szCs w:val="19"/>
+              </w:rPr>
+              <w:t>The system shall provide all its functions through a website served by the HMS program at http://localhost:8080, with a login page, a dashboard and a sidebar that lists only the pages allowed for the logged-in role (Table 6.5-1).</w:t>
+            </w:r>
+          </w:p>
+        </w:tc>
+        <w:tc>
+          <w:tcPr>
+            <w:tcW w:type="dxa" w:w="1246"/>
+            <w:tcBorders>
+              <w:top w:val="single" w:color="808080" w:sz="4"/>
+              <w:left w:val="single" w:color="808080" w:sz="4"/>
+              <w:bottom w:val="single" w:color="808080" w:sz="4"/>
+              <w:right w:val="single" w:color="808080" w:sz="4"/>
+            </w:tcBorders>
+            <w:tcMar>
+              <w:top w:type="dxa" w:w="50"/>
+              <w:left w:type="dxa" w:w="90"/>
+              <w:bottom w:type="dxa" w:w="50"/>
+              <w:right w:type="dxa" w:w="90"/>
+            </w:tcMar>
+            <w:vAlign w:val="top"/>
+          </w:tcPr>
+          <w:p>
+            <w:pPr>
+              <w:spacing w:after="30" w:line="240"/>
+              <w:jc w:val="left"/>
+            </w:pPr>
+            <w:r>
+              <w:rPr>
+                <w:rFonts w:ascii="Times New Roman" w:cs="Times New Roman" w:eastAsia="Times New Roman" w:hAnsi="Times New Roman"/>
+                <w:sz w:val="19"/>
+                <w:szCs w:val="19"/>
+              </w:rPr>
+              <w:t>High</w:t>
+            </w:r>
+          </w:p>
+        </w:tc>
+      </w:tr>
+      <w:tr>
+        <w:trPr/>
+        <w:tc>
+          <w:tcPr>
+            <w:tcW w:type="dxa" w:w="1400"/>
+            <w:tcBorders>
+              <w:top w:val="single" w:color="808080" w:sz="4"/>
+              <w:left w:val="single" w:color="808080" w:sz="4"/>
+              <w:bottom w:val="single" w:color="808080" w:sz="4"/>
+              <w:right w:val="single" w:color="808080" w:sz="4"/>
+            </w:tcBorders>
+            <w:tcMar>
+              <w:top w:type="dxa" w:w="50"/>
+              <w:left w:type="dxa" w:w="90"/>
+              <w:bottom w:type="dxa" w:w="50"/>
+              <w:right w:type="dxa" w:w="90"/>
+            </w:tcMar>
+            <w:vAlign w:val="top"/>
+          </w:tcPr>
+          <w:p>
+            <w:pPr>
+              <w:spacing w:after="30" w:line="240"/>
+              <w:jc w:val="left"/>
+            </w:pPr>
+            <w:r>
+              <w:rPr>
+                <w:rFonts w:ascii="Times New Roman" w:cs="Times New Roman" w:eastAsia="Times New Roman" w:hAnsi="Times New Roman"/>
+                <w:b/>
+                <w:bCs/>
+                <w:sz w:val="19"/>
+                <w:szCs w:val="19"/>
+              </w:rPr>
+              <w:t>HMS-F-071</w:t>
+            </w:r>
+          </w:p>
+        </w:tc>
+        <w:tc>
+          <w:tcPr>
+            <w:tcW w:type="dxa" w:w="7100"/>
+            <w:tcBorders>
+              <w:top w:val="single" w:color="808080" w:sz="4"/>
+              <w:left w:val="single" w:color="808080" w:sz="4"/>
+              <w:bottom w:val="single" w:color="808080" w:sz="4"/>
+              <w:right w:val="single" w:color="808080" w:sz="4"/>
+            </w:tcBorders>
+            <w:tcMar>
+              <w:top w:type="dxa" w:w="50"/>
+              <w:left w:type="dxa" w:w="90"/>
+              <w:bottom w:type="dxa" w:w="50"/>
+              <w:right w:type="dxa" w:w="90"/>
+            </w:tcMar>
+            <w:vAlign w:val="top"/>
+          </w:tcPr>
+          <w:p>
+            <w:pPr>
+              <w:spacing w:after="30" w:line="240"/>
+              <w:jc w:val="left"/>
+            </w:pPr>
+            <w:r>
+              <w:rPr>
+                <w:rFonts w:ascii="Times New Roman" w:cs="Times New Roman" w:eastAsia="Times New Roman" w:hAnsi="Times New Roman"/>
+                <w:sz w:val="19"/>
+                <w:szCs w:val="19"/>
+              </w:rPr>
+              <w:t>The website shall provide pages to manage user accounts, to view the audit log filtered by date range and username, and to change one's own password, each available only to the roles allowed in Table 6.5-1.</w:t>
+            </w:r>
+          </w:p>
+        </w:tc>
+        <w:tc>
+          <w:tcPr>
+            <w:tcW w:type="dxa" w:w="1246"/>
+            <w:tcBorders>
+              <w:top w:val="single" w:color="808080" w:sz="4"/>
+              <w:left w:val="single" w:color="808080" w:sz="4"/>
+              <w:bottom w:val="single" w:color="808080" w:sz="4"/>
+              <w:right w:val="single" w:color="808080" w:sz="4"/>
+            </w:tcBorders>
+            <w:tcMar>
+              <w:top w:type="dxa" w:w="50"/>
+              <w:left w:type="dxa" w:w="90"/>
+              <w:bottom w:type="dxa" w:w="50"/>
+              <w:right w:type="dxa" w:w="90"/>
+            </w:tcMar>
+            <w:vAlign w:val="top"/>
+          </w:tcPr>
+          <w:p>
+            <w:pPr>
+              <w:spacing w:after="30" w:line="240"/>
+              <w:jc w:val="left"/>
+            </w:pPr>
+            <w:r>
+              <w:rPr>
+                <w:rFonts w:ascii="Times New Roman" w:cs="Times New Roman" w:eastAsia="Times New Roman" w:hAnsi="Times New Roman"/>
+                <w:sz w:val="19"/>
+                <w:szCs w:val="19"/>
+              </w:rPr>
+              <w:t>Medium</w:t>
+            </w:r>
+          </w:p>
+        </w:tc>
+      </w:tr>
+      <w:tr>
+        <w:trPr/>
+        <w:tc>
+          <w:tcPr>
+            <w:tcW w:type="dxa" w:w="1400"/>
+            <w:tcBorders>
+              <w:top w:val="single" w:color="808080" w:sz="4"/>
+              <w:left w:val="single" w:color="808080" w:sz="4"/>
+              <w:bottom w:val="single" w:color="808080" w:sz="4"/>
+              <w:right w:val="single" w:color="808080" w:sz="4"/>
+            </w:tcBorders>
+            <w:tcMar>
+              <w:top w:type="dxa" w:w="50"/>
+              <w:left w:type="dxa" w:w="90"/>
+              <w:bottom w:type="dxa" w:w="50"/>
+              <w:right w:type="dxa" w:w="90"/>
+            </w:tcMar>
+            <w:vAlign w:val="top"/>
+          </w:tcPr>
+          <w:p>
+            <w:pPr>
+              <w:spacing w:after="30" w:line="240"/>
+              <w:jc w:val="left"/>
+            </w:pPr>
+            <w:r>
+              <w:rPr>
+                <w:rFonts w:ascii="Times New Roman" w:cs="Times New Roman" w:eastAsia="Times New Roman" w:hAnsi="Times New Roman"/>
+                <w:b/>
+                <w:bCs/>
+                <w:sz w:val="19"/>
+                <w:szCs w:val="19"/>
+              </w:rPr>
+              <w:t>HMS-F-072</w:t>
+            </w:r>
+          </w:p>
+        </w:tc>
+        <w:tc>
+          <w:tcPr>
+            <w:tcW w:type="dxa" w:w="7100"/>
+            <w:tcBorders>
+              <w:top w:val="single" w:color="808080" w:sz="4"/>
+              <w:left w:val="single" w:color="808080" w:sz="4"/>
+              <w:bottom w:val="single" w:color="808080" w:sz="4"/>
+              <w:right w:val="single" w:color="808080" w:sz="4"/>
+            </w:tcBorders>
+            <w:tcMar>
+              <w:top w:type="dxa" w:w="50"/>
+              <w:left w:type="dxa" w:w="90"/>
+              <w:bottom w:type="dxa" w:w="50"/>
+              <w:right w:type="dxa" w:w="90"/>
+            </w:tcMar>
+            <w:vAlign w:val="top"/>
+          </w:tcPr>
+          <w:p>
+            <w:pPr>
+              <w:spacing w:after="30" w:line="240"/>
+              <w:jc w:val="left"/>
+            </w:pPr>
+            <w:r>
+              <w:rPr>
+                <w:rFonts w:ascii="Times New Roman" w:cs="Times New Roman" w:eastAsia="Times New Roman" w:hAnsi="Times New Roman"/>
+                <w:sz w:val="19"/>
+                <w:szCs w:val="19"/>
+              </w:rPr>
+              <w:t>The website shall provide a Patients page to search by patient ID, part of the name or phone (20 results per page), register a patient (showing the existing patient ID and asking for confirmation when a duplicate is found), update details and deactivate a patient.</w:t>
+            </w:r>
+          </w:p>
+        </w:tc>
+        <w:tc>
+          <w:tcPr>
+            <w:tcW w:type="dxa" w:w="1246"/>
+            <w:tcBorders>
+              <w:top w:val="single" w:color="808080" w:sz="4"/>
+              <w:left w:val="single" w:color="808080" w:sz="4"/>
+              <w:bottom w:val="single" w:color="808080" w:sz="4"/>
+              <w:right w:val="single" w:color="808080" w:sz="4"/>
+            </w:tcBorders>
+            <w:tcMar>
+              <w:top w:type="dxa" w:w="50"/>
+              <w:left w:type="dxa" w:w="90"/>
+              <w:bottom w:type="dxa" w:w="50"/>
+              <w:right w:type="dxa" w:w="90"/>
+            </w:tcMar>
+            <w:vAlign w:val="top"/>
+          </w:tcPr>
+          <w:p>
+            <w:pPr>
+              <w:spacing w:after="30" w:line="240"/>
+              <w:jc w:val="left"/>
+            </w:pPr>
+            <w:r>
+              <w:rPr>
+                <w:rFonts w:ascii="Times New Roman" w:cs="Times New Roman" w:eastAsia="Times New Roman" w:hAnsi="Times New Roman"/>
+                <w:sz w:val="19"/>
+                <w:szCs w:val="19"/>
+              </w:rPr>
+              <w:t>High</w:t>
+            </w:r>
+          </w:p>
+        </w:tc>
+      </w:tr>
+      <w:tr>
+        <w:trPr/>
+        <w:tc>
+          <w:tcPr>
+            <w:tcW w:type="dxa" w:w="1400"/>
+            <w:tcBorders>
+              <w:top w:val="single" w:color="808080" w:sz="4"/>
+              <w:left w:val="single" w:color="808080" w:sz="4"/>
+              <w:bottom w:val="single" w:color="808080" w:sz="4"/>
+              <w:right w:val="single" w:color="808080" w:sz="4"/>
+            </w:tcBorders>
+            <w:tcMar>
+              <w:top w:type="dxa" w:w="50"/>
+              <w:left w:type="dxa" w:w="90"/>
+              <w:bottom w:type="dxa" w:w="50"/>
+              <w:right w:type="dxa" w:w="90"/>
+            </w:tcMar>
+            <w:vAlign w:val="top"/>
+          </w:tcPr>
+          <w:p>
+            <w:pPr>
+              <w:spacing w:after="30" w:line="240"/>
+              <w:jc w:val="left"/>
+            </w:pPr>
+            <w:r>
+              <w:rPr>
+                <w:rFonts w:ascii="Times New Roman" w:cs="Times New Roman" w:eastAsia="Times New Roman" w:hAnsi="Times New Roman"/>
+                <w:b/>
+                <w:bCs/>
+                <w:sz w:val="19"/>
+                <w:szCs w:val="19"/>
+              </w:rPr>
+              <w:t>HMS-F-073</w:t>
+            </w:r>
+          </w:p>
+        </w:tc>
+        <w:tc>
+          <w:tcPr>
+            <w:tcW w:type="dxa" w:w="7100"/>
+            <w:tcBorders>
+              <w:top w:val="single" w:color="808080" w:sz="4"/>
+              <w:left w:val="single" w:color="808080" w:sz="4"/>
+              <w:bottom w:val="single" w:color="808080" w:sz="4"/>
+              <w:right w:val="single" w:color="808080" w:sz="4"/>
+            </w:tcBorders>
+            <w:tcMar>
+              <w:top w:type="dxa" w:w="50"/>
+              <w:left w:type="dxa" w:w="90"/>
+              <w:bottom w:type="dxa" w:w="50"/>
+              <w:right w:type="dxa" w:w="90"/>
+            </w:tcMar>
+            <w:vAlign w:val="top"/>
+          </w:tcPr>
+          <w:p>
+            <w:pPr>
+              <w:spacing w:after="30" w:line="240"/>
+              <w:jc w:val="left"/>
+            </w:pPr>
+            <w:r>
+              <w:rPr>
+                <w:rFonts w:ascii="Times New Roman" w:cs="Times New Roman" w:eastAsia="Times New Roman" w:hAnsi="Times New Roman"/>
+                <w:sz w:val="19"/>
+                <w:szCs w:val="19"/>
+              </w:rPr>
+              <w:t>The website shall provide pages to manage doctors and their weekly working hours, to book appointments (offering the next 3 free slots as buttons when a slot is refused), to cancel, reschedule or mark an appointment as no-show, and to view a doctor's schedule for a date.</w:t>
+            </w:r>
+          </w:p>
+        </w:tc>
+        <w:tc>
+          <w:tcPr>
+            <w:tcW w:type="dxa" w:w="1246"/>
+            <w:tcBorders>
+              <w:top w:val="single" w:color="808080" w:sz="4"/>
+              <w:left w:val="single" w:color="808080" w:sz="4"/>
+              <w:bottom w:val="single" w:color="808080" w:sz="4"/>
+              <w:right w:val="single" w:color="808080" w:sz="4"/>
+            </w:tcBorders>
+            <w:tcMar>
+              <w:top w:type="dxa" w:w="50"/>
+              <w:left w:type="dxa" w:w="90"/>
+              <w:bottom w:type="dxa" w:w="50"/>
+              <w:right w:type="dxa" w:w="90"/>
+            </w:tcMar>
+            <w:vAlign w:val="top"/>
+          </w:tcPr>
+          <w:p>
+            <w:pPr>
+              <w:spacing w:after="30" w:line="240"/>
+              <w:jc w:val="left"/>
+            </w:pPr>
+            <w:r>
+              <w:rPr>
+                <w:rFonts w:ascii="Times New Roman" w:cs="Times New Roman" w:eastAsia="Times New Roman" w:hAnsi="Times New Roman"/>
+                <w:sz w:val="19"/>
+                <w:szCs w:val="19"/>
+              </w:rPr>
+              <w:t>High</w:t>
+            </w:r>
+          </w:p>
+        </w:tc>
+      </w:tr>
+      <w:tr>
+        <w:trPr/>
+        <w:tc>
+          <w:tcPr>
+            <w:tcW w:type="dxa" w:w="1400"/>
+            <w:tcBorders>
+              <w:top w:val="single" w:color="808080" w:sz="4"/>
+              <w:left w:val="single" w:color="808080" w:sz="4"/>
+              <w:bottom w:val="single" w:color="808080" w:sz="4"/>
+              <w:right w:val="single" w:color="808080" w:sz="4"/>
+            </w:tcBorders>
+            <w:tcMar>
+              <w:top w:type="dxa" w:w="50"/>
+              <w:left w:type="dxa" w:w="90"/>
+              <w:bottom w:type="dxa" w:w="50"/>
+              <w:right w:type="dxa" w:w="90"/>
+            </w:tcMar>
+            <w:vAlign w:val="top"/>
+          </w:tcPr>
+          <w:p>
+            <w:pPr>
+              <w:spacing w:after="30" w:line="240"/>
+              <w:jc w:val="left"/>
+            </w:pPr>
+            <w:r>
+              <w:rPr>
+                <w:rFonts w:ascii="Times New Roman" w:cs="Times New Roman" w:eastAsia="Times New Roman" w:hAnsi="Times New Roman"/>
+                <w:b/>
+                <w:bCs/>
+                <w:sz w:val="19"/>
+                <w:szCs w:val="19"/>
+              </w:rPr>
+              <w:t>HMS-F-074</w:t>
+            </w:r>
+          </w:p>
+        </w:tc>
+        <w:tc>
+          <w:tcPr>
+            <w:tcW w:type="dxa" w:w="7100"/>
+            <w:tcBorders>
+              <w:top w:val="single" w:color="808080" w:sz="4"/>
+              <w:left w:val="single" w:color="808080" w:sz="4"/>
+              <w:bottom w:val="single" w:color="808080" w:sz="4"/>
+              <w:right w:val="single" w:color="808080" w:sz="4"/>
+            </w:tcBorders>
+            <w:tcMar>
+              <w:top w:type="dxa" w:w="50"/>
+              <w:left w:type="dxa" w:w="90"/>
+              <w:bottom w:type="dxa" w:w="50"/>
+              <w:right w:type="dxa" w:w="90"/>
+            </w:tcMar>
+            <w:vAlign w:val="top"/>
+          </w:tcPr>
+          <w:p>
+            <w:pPr>
+              <w:spacing w:after="30" w:line="240"/>
+              <w:jc w:val="left"/>
+            </w:pPr>
+            <w:r>
+              <w:rPr>
+                <w:rFonts w:ascii="Times New Roman" w:cs="Times New Roman" w:eastAsia="Times New Roman" w:hAnsi="Times New Roman"/>
+                <w:sz w:val="19"/>
+                <w:szCs w:val="19"/>
+              </w:rPr>
+              <w:t>The website shall provide, for Doctors, pages to record a consultation (showing patient ID, name and age for confirmation before saving), view a patient's history and add addenda; and pages for the daily report with CSV download, the doctor workload report and backup / restore.</w:t>
+            </w:r>
+          </w:p>
+        </w:tc>
+        <w:tc>
+          <w:tcPr>
+            <w:tcW w:type="dxa" w:w="1246"/>
+            <w:tcBorders>
+              <w:top w:val="single" w:color="808080" w:sz="4"/>
+              <w:left w:val="single" w:color="808080" w:sz="4"/>
+              <w:bottom w:val="single" w:color="808080" w:sz="4"/>
+              <w:right w:val="single" w:color="808080" w:sz="4"/>
+            </w:tcBorders>
+            <w:tcMar>
+              <w:top w:type="dxa" w:w="50"/>
+              <w:left w:type="dxa" w:w="90"/>
+              <w:bottom w:type="dxa" w:w="50"/>
+              <w:right w:type="dxa" w:w="90"/>
+            </w:tcMar>
+            <w:vAlign w:val="top"/>
+          </w:tcPr>
+          <w:p>
+            <w:pPr>
+              <w:spacing w:after="30" w:line="240"/>
+              <w:jc w:val="left"/>
+            </w:pPr>
+            <w:r>
+              <w:rPr>
+                <w:rFonts w:ascii="Times New Roman" w:cs="Times New Roman" w:eastAsia="Times New Roman" w:hAnsi="Times New Roman"/>
+                <w:sz w:val="19"/>
+                <w:szCs w:val="19"/>
+              </w:rPr>
+              <w:t>High</w:t>
+            </w:r>
+          </w:p>
+        </w:tc>
+      </w:tr>
+    </w:tbl>
+    <w:p>
+      <w:pPr>
         <w:spacing w:after="60" w:before="0" w:line="264"/>
         <w:jc w:val="left"/>
       </w:pPr>
@@ -15631,7 +16711,7 @@
                 <w:sz w:val="19"/>
                 <w:szCs w:val="19"/>
               </w:rPr>
-              <w:t xml:space="preserve">The system shall complete start-up (login prompt displayed) within 5 seconds when loading 10,000 patients, 100 doctors and 50,000 appointments.</w:t>
+              <w:t>The system shall complete start-up (login page displayed) within 5 seconds when loading 10,000 patients, 100 doctors and 50,000 appointments.</w:t>
             </w:r>
           </w:p>
         </w:tc>
@@ -17441,7 +18521,7 @@
                 <w:sz w:val="19"/>
                 <w:szCs w:val="19"/>
               </w:rPr>
-              <w:t xml:space="preserve">The system shall not echo password characters on the screen while they are typed.</w:t>
+              <w:t>The system shall never display password characters while they are typed (masked password fields) and shall never send a password back to the browser.</w:t>
             </w:r>
           </w:p>
         </w:tc>
@@ -18014,6 +19094,141 @@
                 <w:szCs w:val="19"/>
               </w:rPr>
               <w:t xml:space="preserve">Medium</w:t>
+            </w:r>
+          </w:p>
+        </w:tc>
+      </w:tr>
+      <w:tr>
+        <w:trPr>
+          <w:cantSplit/>
+        </w:trPr>
+        <w:tc>
+          <w:tcPr>
+            <w:tcW w:type="dxa" w:w="1400"/>
+            <w:tcBorders>
+              <w:top w:val="single" w:color="808080" w:sz="4"/>
+              <w:left w:val="single" w:color="808080" w:sz="4"/>
+              <w:bottom w:val="single" w:color="808080" w:sz="4"/>
+              <w:right w:val="single" w:color="808080" w:sz="4"/>
+            </w:tcBorders>
+            <w:tcMar>
+              <w:top w:type="dxa" w:w="50"/>
+              <w:left w:type="dxa" w:w="90"/>
+              <w:bottom w:type="dxa" w:w="50"/>
+              <w:right w:type="dxa" w:w="90"/>
+            </w:tcMar>
+            <w:vAlign w:val="top"/>
+          </w:tcPr>
+          <w:p>
+            <w:pPr>
+              <w:spacing w:after="30" w:line="240"/>
+              <w:jc w:val="left"/>
+            </w:pPr>
+            <w:r>
+              <w:rPr>
+                <w:rFonts w:ascii="Times New Roman" w:cs="Times New Roman" w:eastAsia="Times New Roman" w:hAnsi="Times New Roman"/>
+                <w:b/>
+                <w:bCs/>
+                <w:sz w:val="19"/>
+                <w:szCs w:val="19"/>
+              </w:rPr>
+              <w:t>HMS-SEC-009</w:t>
+            </w:r>
+          </w:p>
+        </w:tc>
+        <w:tc>
+          <w:tcPr>
+            <w:tcW w:type="dxa" w:w="1150"/>
+            <w:tcBorders>
+              <w:top w:val="single" w:color="808080" w:sz="4"/>
+              <w:left w:val="single" w:color="808080" w:sz="4"/>
+              <w:bottom w:val="single" w:color="808080" w:sz="4"/>
+              <w:right w:val="single" w:color="808080" w:sz="4"/>
+            </w:tcBorders>
+            <w:tcMar>
+              <w:top w:type="dxa" w:w="50"/>
+              <w:left w:type="dxa" w:w="90"/>
+              <w:bottom w:type="dxa" w:w="50"/>
+              <w:right w:type="dxa" w:w="90"/>
+            </w:tcMar>
+            <w:vAlign w:val="top"/>
+          </w:tcPr>
+          <w:p>
+            <w:pPr>
+              <w:spacing w:after="30" w:line="240"/>
+              <w:jc w:val="left"/>
+            </w:pPr>
+            <w:r>
+              <w:rPr>
+                <w:rFonts w:ascii="Times New Roman" w:cs="Times New Roman" w:eastAsia="Times New Roman" w:hAnsi="Times New Roman"/>
+                <w:sz w:val="19"/>
+                <w:szCs w:val="19"/>
+              </w:rPr>
+              <w:t>SO-1</w:t>
+            </w:r>
+          </w:p>
+        </w:tc>
+        <w:tc>
+          <w:tcPr>
+            <w:tcW w:type="dxa" w:w="5950"/>
+            <w:tcBorders>
+              <w:top w:val="single" w:color="808080" w:sz="4"/>
+              <w:left w:val="single" w:color="808080" w:sz="4"/>
+              <w:bottom w:val="single" w:color="808080" w:sz="4"/>
+              <w:right w:val="single" w:color="808080" w:sz="4"/>
+            </w:tcBorders>
+            <w:tcMar>
+              <w:top w:type="dxa" w:w="50"/>
+              <w:left w:type="dxa" w:w="90"/>
+              <w:bottom w:type="dxa" w:w="50"/>
+              <w:right w:type="dxa" w:w="90"/>
+            </w:tcMar>
+            <w:vAlign w:val="top"/>
+          </w:tcPr>
+          <w:p>
+            <w:pPr>
+              <w:spacing w:after="30" w:line="240"/>
+              <w:jc w:val="left"/>
+            </w:pPr>
+            <w:r>
+              <w:rPr>
+                <w:rFonts w:ascii="Times New Roman" w:cs="Times New Roman" w:eastAsia="Times New Roman" w:hAnsi="Times New Roman"/>
+                <w:sz w:val="19"/>
+                <w:szCs w:val="19"/>
+              </w:rPr>
+              <w:t>The HMS server shall accept connections only on the loopback address 127.0.0.1, every session token shall contain at least 128 random bits, and every request without a valid token (except status, first-run set-up and login) shall be refused with E003.</w:t>
+            </w:r>
+          </w:p>
+        </w:tc>
+        <w:tc>
+          <w:tcPr>
+            <w:tcW w:type="dxa" w:w="1246"/>
+            <w:tcBorders>
+              <w:top w:val="single" w:color="808080" w:sz="4"/>
+              <w:left w:val="single" w:color="808080" w:sz="4"/>
+              <w:bottom w:val="single" w:color="808080" w:sz="4"/>
+              <w:right w:val="single" w:color="808080" w:sz="4"/>
+            </w:tcBorders>
+            <w:tcMar>
+              <w:top w:type="dxa" w:w="50"/>
+              <w:left w:type="dxa" w:w="90"/>
+              <w:bottom w:type="dxa" w:w="50"/>
+              <w:right w:type="dxa" w:w="90"/>
+            </w:tcMar>
+            <w:vAlign w:val="top"/>
+          </w:tcPr>
+          <w:p>
+            <w:pPr>
+              <w:spacing w:after="30" w:line="240"/>
+              <w:jc w:val="left"/>
+            </w:pPr>
+            <w:r>
+              <w:rPr>
+                <w:rFonts w:ascii="Times New Roman" w:cs="Times New Roman" w:eastAsia="Times New Roman" w:hAnsi="Times New Roman"/>
+                <w:sz w:val="19"/>
+                <w:szCs w:val="19"/>
+              </w:rPr>
+              <w:t>High</w:t>
             </w:r>
           </w:p>
         </w:tc>
@@ -18380,7 +19595,7 @@
                 <w:sz w:val="19"/>
                 <w:szCs w:val="19"/>
               </w:rPr>
-              <w:t xml:space="preserve">After a 30-minute walkthrough, at least 90% of first-time users shall complete patient registration and appointment booking, each within 2 minutes; every screen shall show numbered options with "0" for Back, and every error message shall name the field and the rule violated.</w:t>
+              <w:t>After a 30-minute walkthrough, at least 90% of first-time users shall complete patient registration and appointment booking, each within 2 minutes; every page shall be reachable from the sidebar, every form shall have a Cancel button, and every error message shall name the field and the rule violated.</w:t>
             </w:r>
           </w:p>
         </w:tc>
@@ -18483,7 +19698,7 @@
                 <w:sz w:val="19"/>
                 <w:szCs w:val="19"/>
               </w:rPr>
-              <w:t xml:space="preserve">The same source code shall compile without modification using g++ 11 or later (C++17) on Ubuntu 22.04 and on Windows 10/11 (MSYS2 g++ or MSVC 2019), and shall pass the same system tests on both.</w:t>
+              <w:t>The same source code shall compile without modification using g++ 11 or later (C++17) on Ubuntu 22.04 and on Windows 10/11 (MSYS2 g++ or MSVC 2019), and shall pass the same system tests on both; the website shall work in current versions of Chrome, Edge and Firefox.</w:t>
             </w:r>
           </w:p>
         </w:tc>
@@ -21226,15 +22441,7 @@
           <w:sz w:val="23"/>
           <w:szCs w:val="23"/>
         </w:rPr>
-        <w:t xml:space="preserve">Domain requirements.</w:t>
-      </w:r>
-      <w:r>
-        <w:rPr>
-          <w:rFonts w:ascii="Times New Roman" w:cs="Times New Roman" w:eastAsia="Times New Roman" w:hAnsi="Times New Roman"/>
-          <w:sz w:val="23"/>
-          <w:szCs w:val="23"/>
-        </w:rPr>
-        <w:t xml:space="preserve"> Patient identification uses a unique Patient ID, not the name; blood group values are limited to A+, A−, B+, B−, AB+, AB−, O+, O−; ages shown to doctors are computed from the date of birth; medicine dosage and duration are free text within the stated limits (no drug-interaction checking in release 1.0).</w:t>
+        <w:t>Domain requirements. Patient identification uses a unique Patient ID, not the name; blood group values are limited to A+, A−, B+, B−, AB+, AB−, O+, O−; ages shown to doctors are computed from the date of birth; medicine dosage and duration are free text within the stated limits (no drug-interaction checking in release 1.1).</w:t>
       </w:r>
     </w:p>
     <w:p>
@@ -21311,15 +22518,7 @@
           <w:sz w:val="23"/>
           <w:szCs w:val="23"/>
         </w:rPr>
-        <w:t xml:space="preserve">Internationalisation:</w:t>
-      </w:r>
-      <w:r>
-        <w:rPr>
-          <w:rFonts w:ascii="Times New Roman" w:cs="Times New Roman" w:eastAsia="Times New Roman" w:hAnsi="Times New Roman"/>
-          <w:sz w:val="23"/>
-          <w:szCs w:val="23"/>
-        </w:rPr>
-        <w:t xml:space="preserve"> English only; dates in YYYY-MM-DD, times in 24-hour HH:MM; no support for other languages in release 1.0.</w:t>
+        <w:t>Internationalisation: English only; dates in YYYY-MM-DD, times in 24-hour HH:MM; no support for other languages in release 1.1.</w:t>
       </w:r>
     </w:p>
     <w:p>
@@ -21367,15 +22566,7 @@
           <w:sz w:val="23"/>
           <w:szCs w:val="23"/>
         </w:rPr>
-        <w:t xml:space="preserve">Reuse:</w:t>
-      </w:r>
-      <w:r>
-        <w:rPr>
-          <w:rFonts w:ascii="Times New Roman" w:cs="Times New Roman" w:eastAsia="Times New Roman" w:hAnsi="Times New Roman"/>
-          <w:sz w:val="23"/>
-          <w:szCs w:val="23"/>
-        </w:rPr>
-        <w:t xml:space="preserve"> the service and repository layers shall not depend on the console, so that a different user interface can reuse them in a later release.</w:t>
+        <w:t>Reuse: the service and repository layers shall not depend on the user interface; the website reaches them only through the local web API (SAD 4.3.8).</w:t>
       </w:r>
     </w:p>
     <w:p>
@@ -32656,7 +33847,7 @@
                 <w:sz w:val="15"/>
                 <w:szCs w:val="15"/>
               </w:rPr>
-              <w:t xml:space="preserve">access_control.cpp, menu_controller.cpp</w:t>
+              <w:t>access_control.cpp, Layout.tsx, App.tsx</w:t>
             </w:r>
           </w:p>
         </w:tc>
@@ -41469,7 +42660,7 @@
                 <w:sz w:val="15"/>
                 <w:szCs w:val="15"/>
               </w:rPr>
-              <w:t xml:space="preserve">console_ui.cpp, menu_controller.cpp</w:t>
+              <w:t>LoginPage.tsx, api.cpp</w:t>
             </w:r>
           </w:p>
         </w:tc>
@@ -42537,7 +43728,7 @@
                 <w:sz w:val="15"/>
                 <w:szCs w:val="15"/>
               </w:rPr>
-              <w:t xml:space="preserve">consultation_service.cpp, menu_controller.cpp</w:t>
+              <w:t>consultation_service.cpp, ConsultationsPage.tsx</w:t>
             </w:r>
           </w:p>
         </w:tc>
@@ -43870,7 +45061,7 @@
                 <w:sz w:val="15"/>
                 <w:szCs w:val="15"/>
               </w:rPr>
-              <w:t xml:space="preserve">console_ui.cpp</w:t>
+              <w:t>api.cpp, auth.tsx</w:t>
             </w:r>
           </w:p>
         </w:tc>
@@ -45007,10 +46198,1590 @@
           </w:p>
         </w:tc>
       </w:tr>
+      <w:tr>
+        <w:trPr>
+          <w:cantSplit/>
+        </w:trPr>
+        <w:tc>
+          <w:tcPr>
+            <w:tcW w:type="dxa" w:w="450"/>
+            <w:tcBorders>
+              <w:top w:val="single" w:color="808080" w:sz="4"/>
+              <w:left w:val="single" w:color="808080" w:sz="4"/>
+              <w:bottom w:val="single" w:color="808080" w:sz="4"/>
+              <w:right w:val="single" w:color="808080" w:sz="4"/>
+            </w:tcBorders>
+            <w:tcMar>
+              <w:top w:type="dxa" w:w="50"/>
+              <w:left w:type="dxa" w:w="90"/>
+              <w:bottom w:type="dxa" w:w="50"/>
+              <w:right w:type="dxa" w:w="90"/>
+            </w:tcMar>
+            <w:vAlign w:val="top"/>
+          </w:tcPr>
+          <w:p>
+            <w:pPr>
+              <w:spacing w:after="30" w:line="240"/>
+              <w:jc w:val="left"/>
+            </w:pPr>
+            <w:r>
+              <w:rPr>
+                <w:rFonts w:ascii="Times New Roman" w:cs="Times New Roman" w:eastAsia="Times New Roman" w:hAnsi="Times New Roman"/>
+                <w:sz w:val="15"/>
+                <w:szCs w:val="15"/>
+              </w:rPr>
+              <w:t>50</w:t>
+            </w:r>
+          </w:p>
+        </w:tc>
+        <w:tc>
+          <w:tcPr>
+            <w:tcW w:type="dxa" w:w="1150"/>
+            <w:tcBorders>
+              <w:top w:val="single" w:color="808080" w:sz="4"/>
+              <w:left w:val="single" w:color="808080" w:sz="4"/>
+              <w:bottom w:val="single" w:color="808080" w:sz="4"/>
+              <w:right w:val="single" w:color="808080" w:sz="4"/>
+            </w:tcBorders>
+            <w:tcMar>
+              <w:top w:type="dxa" w:w="50"/>
+              <w:left w:type="dxa" w:w="90"/>
+              <w:bottom w:type="dxa" w:w="50"/>
+              <w:right w:type="dxa" w:w="90"/>
+            </w:tcMar>
+            <w:vAlign w:val="top"/>
+          </w:tcPr>
+          <w:p>
+            <w:pPr>
+              <w:spacing w:after="30" w:line="240"/>
+              <w:jc w:val="left"/>
+            </w:pPr>
+            <w:r>
+              <w:rPr>
+                <w:rFonts w:ascii="Times New Roman" w:cs="Times New Roman" w:eastAsia="Times New Roman" w:hAnsi="Times New Roman"/>
+                <w:b/>
+                <w:bCs/>
+                <w:sz w:val="15"/>
+                <w:szCs w:val="15"/>
+              </w:rPr>
+              <w:t>HMS-F-070</w:t>
+            </w:r>
+          </w:p>
+        </w:tc>
+        <w:tc>
+          <w:tcPr>
+            <w:tcW w:type="dxa" w:w="1650"/>
+            <w:tcBorders>
+              <w:top w:val="single" w:color="808080" w:sz="4"/>
+              <w:left w:val="single" w:color="808080" w:sz="4"/>
+              <w:bottom w:val="single" w:color="808080" w:sz="4"/>
+              <w:right w:val="single" w:color="808080" w:sz="4"/>
+            </w:tcBorders>
+            <w:tcMar>
+              <w:top w:type="dxa" w:w="50"/>
+              <w:left w:type="dxa" w:w="90"/>
+              <w:bottom w:type="dxa" w:w="50"/>
+              <w:right w:type="dxa" w:w="90"/>
+            </w:tcMar>
+            <w:vAlign w:val="top"/>
+          </w:tcPr>
+          <w:p>
+            <w:pPr>
+              <w:spacing w:after="30" w:line="240"/>
+              <w:jc w:val="left"/>
+            </w:pPr>
+            <w:r>
+              <w:rPr>
+                <w:rFonts w:ascii="Times New Roman" w:cs="Times New Roman" w:eastAsia="Times New Roman" w:hAnsi="Times New Roman"/>
+                <w:sz w:val="15"/>
+                <w:szCs w:val="15"/>
+              </w:rPr>
+              <w:t>Website, login page, role sidebar</w:t>
+            </w:r>
+          </w:p>
+        </w:tc>
+        <w:tc>
+          <w:tcPr>
+            <w:tcW w:type="dxa" w:w="850"/>
+            <w:tcBorders>
+              <w:top w:val="single" w:color="808080" w:sz="4"/>
+              <w:left w:val="single" w:color="808080" w:sz="4"/>
+              <w:bottom w:val="single" w:color="808080" w:sz="4"/>
+              <w:right w:val="single" w:color="808080" w:sz="4"/>
+            </w:tcBorders>
+            <w:tcMar>
+              <w:top w:type="dxa" w:w="50"/>
+              <w:left w:type="dxa" w:w="90"/>
+              <w:bottom w:type="dxa" w:w="50"/>
+              <w:right w:type="dxa" w:w="90"/>
+            </w:tcMar>
+            <w:vAlign w:val="top"/>
+          </w:tcPr>
+          <w:p>
+            <w:pPr>
+              <w:spacing w:after="30" w:line="240"/>
+              <w:jc w:val="left"/>
+            </w:pPr>
+            <w:r>
+              <w:rPr>
+                <w:rFonts w:ascii="Times New Roman" w:cs="Times New Roman" w:eastAsia="Times New Roman" w:hAnsi="Times New Roman"/>
+                <w:sz w:val="15"/>
+                <w:szCs w:val="15"/>
+              </w:rPr>
+              <w:t>C1, C16</w:t>
+            </w:r>
+          </w:p>
+        </w:tc>
+        <w:tc>
+          <w:tcPr>
+            <w:tcW w:type="dxa" w:w="1750"/>
+            <w:tcBorders>
+              <w:top w:val="single" w:color="808080" w:sz="4"/>
+              <w:left w:val="single" w:color="808080" w:sz="4"/>
+              <w:bottom w:val="single" w:color="808080" w:sz="4"/>
+              <w:right w:val="single" w:color="808080" w:sz="4"/>
+            </w:tcBorders>
+            <w:tcMar>
+              <w:top w:type="dxa" w:w="50"/>
+              <w:left w:type="dxa" w:w="90"/>
+              <w:bottom w:type="dxa" w:w="50"/>
+              <w:right w:type="dxa" w:w="90"/>
+            </w:tcMar>
+            <w:vAlign w:val="top"/>
+          </w:tcPr>
+          <w:p>
+            <w:pPr>
+              <w:spacing w:after="30" w:line="240"/>
+              <w:jc w:val="left"/>
+            </w:pPr>
+            <w:r>
+              <w:rPr>
+                <w:rFonts w:ascii="Times New Roman" w:cs="Times New Roman" w:eastAsia="Times New Roman" w:hAnsi="Times New Roman"/>
+                <w:sz w:val="15"/>
+                <w:szCs w:val="15"/>
+              </w:rPr>
+              <w:t>SAD 3.3, 4.3.8, 4.5</w:t>
+            </w:r>
+          </w:p>
+        </w:tc>
+        <w:tc>
+          <w:tcPr>
+            <w:tcW w:type="dxa" w:w="1500"/>
+            <w:tcBorders>
+              <w:top w:val="single" w:color="808080" w:sz="4"/>
+              <w:left w:val="single" w:color="808080" w:sz="4"/>
+              <w:bottom w:val="single" w:color="808080" w:sz="4"/>
+              <w:right w:val="single" w:color="808080" w:sz="4"/>
+            </w:tcBorders>
+            <w:tcMar>
+              <w:top w:type="dxa" w:w="50"/>
+              <w:left w:type="dxa" w:w="90"/>
+              <w:bottom w:type="dxa" w:w="50"/>
+              <w:right w:type="dxa" w:w="90"/>
+            </w:tcMar>
+            <w:vAlign w:val="top"/>
+          </w:tcPr>
+          <w:p>
+            <w:pPr>
+              <w:spacing w:after="30" w:line="240"/>
+              <w:jc w:val="left"/>
+            </w:pPr>
+            <w:r>
+              <w:rPr>
+                <w:rFonts w:ascii="Times New Roman" w:cs="Times New Roman" w:eastAsia="Times New Roman" w:hAnsi="Times New Roman"/>
+                <w:sz w:val="15"/>
+                <w:szCs w:val="15"/>
+              </w:rPr>
+              <w:t>api.cpp, routes_status.cpp, App.tsx, Layout.tsx</w:t>
+            </w:r>
+          </w:p>
+        </w:tc>
+        <w:tc>
+          <w:tcPr>
+            <w:tcW w:type="dxa" w:w="900"/>
+            <w:tcBorders>
+              <w:top w:val="single" w:color="808080" w:sz="4"/>
+              <w:left w:val="single" w:color="808080" w:sz="4"/>
+              <w:bottom w:val="single" w:color="808080" w:sz="4"/>
+              <w:right w:val="single" w:color="808080" w:sz="4"/>
+            </w:tcBorders>
+            <w:tcMar>
+              <w:top w:type="dxa" w:w="50"/>
+              <w:left w:type="dxa" w:w="90"/>
+              <w:bottom w:type="dxa" w:w="50"/>
+              <w:right w:type="dxa" w:w="90"/>
+            </w:tcMar>
+            <w:vAlign w:val="top"/>
+          </w:tcPr>
+          <w:p>
+            <w:pPr>
+              <w:spacing w:after="30" w:line="240"/>
+              <w:jc w:val="left"/>
+            </w:pPr>
+            <w:r>
+              <w:rPr>
+                <w:rFonts w:ascii="Times New Roman" w:cs="Times New Roman" w:eastAsia="Times New Roman" w:hAnsi="Times New Roman"/>
+                <w:sz w:val="15"/>
+                <w:szCs w:val="15"/>
+              </w:rPr>
+              <w:t>UT-WEB</w:t>
+            </w:r>
+          </w:p>
+        </w:tc>
+        <w:tc>
+          <w:tcPr>
+            <w:tcW w:type="dxa" w:w="1496"/>
+            <w:tcBorders>
+              <w:top w:val="single" w:color="808080" w:sz="4"/>
+              <w:left w:val="single" w:color="808080" w:sz="4"/>
+              <w:bottom w:val="single" w:color="808080" w:sz="4"/>
+              <w:right w:val="single" w:color="808080" w:sz="4"/>
+            </w:tcBorders>
+            <w:tcMar>
+              <w:top w:type="dxa" w:w="50"/>
+              <w:left w:type="dxa" w:w="90"/>
+              <w:bottom w:type="dxa" w:w="50"/>
+              <w:right w:type="dxa" w:w="90"/>
+            </w:tcMar>
+            <w:vAlign w:val="top"/>
+          </w:tcPr>
+          <w:p>
+            <w:pPr>
+              <w:spacing w:after="30" w:line="240"/>
+              <w:jc w:val="left"/>
+            </w:pPr>
+            <w:r>
+              <w:rPr>
+                <w:rFonts w:ascii="Times New Roman" w:cs="Times New Roman" w:eastAsia="Times New Roman" w:hAnsi="Times New Roman"/>
+                <w:sz w:val="15"/>
+                <w:szCs w:val="15"/>
+              </w:rPr>
+              <w:t>TC-WEB-01</w:t>
+            </w:r>
+          </w:p>
+        </w:tc>
+      </w:tr>
+      <w:tr>
+        <w:trPr>
+          <w:cantSplit/>
+        </w:trPr>
+        <w:tc>
+          <w:tcPr>
+            <w:tcW w:type="dxa" w:w="450"/>
+            <w:tcBorders>
+              <w:top w:val="single" w:color="808080" w:sz="4"/>
+              <w:left w:val="single" w:color="808080" w:sz="4"/>
+              <w:bottom w:val="single" w:color="808080" w:sz="4"/>
+              <w:right w:val="single" w:color="808080" w:sz="4"/>
+            </w:tcBorders>
+            <w:tcMar>
+              <w:top w:type="dxa" w:w="50"/>
+              <w:left w:type="dxa" w:w="90"/>
+              <w:bottom w:type="dxa" w:w="50"/>
+              <w:right w:type="dxa" w:w="90"/>
+            </w:tcMar>
+            <w:vAlign w:val="top"/>
+          </w:tcPr>
+          <w:p>
+            <w:pPr>
+              <w:spacing w:after="30" w:line="240"/>
+              <w:jc w:val="left"/>
+            </w:pPr>
+            <w:r>
+              <w:rPr>
+                <w:rFonts w:ascii="Times New Roman" w:cs="Times New Roman" w:eastAsia="Times New Roman" w:hAnsi="Times New Roman"/>
+                <w:sz w:val="15"/>
+                <w:szCs w:val="15"/>
+              </w:rPr>
+              <w:t>51</w:t>
+            </w:r>
+          </w:p>
+        </w:tc>
+        <w:tc>
+          <w:tcPr>
+            <w:tcW w:type="dxa" w:w="1150"/>
+            <w:tcBorders>
+              <w:top w:val="single" w:color="808080" w:sz="4"/>
+              <w:left w:val="single" w:color="808080" w:sz="4"/>
+              <w:bottom w:val="single" w:color="808080" w:sz="4"/>
+              <w:right w:val="single" w:color="808080" w:sz="4"/>
+            </w:tcBorders>
+            <w:tcMar>
+              <w:top w:type="dxa" w:w="50"/>
+              <w:left w:type="dxa" w:w="90"/>
+              <w:bottom w:type="dxa" w:w="50"/>
+              <w:right w:type="dxa" w:w="90"/>
+            </w:tcMar>
+            <w:vAlign w:val="top"/>
+          </w:tcPr>
+          <w:p>
+            <w:pPr>
+              <w:spacing w:after="30" w:line="240"/>
+              <w:jc w:val="left"/>
+            </w:pPr>
+            <w:r>
+              <w:rPr>
+                <w:rFonts w:ascii="Times New Roman" w:cs="Times New Roman" w:eastAsia="Times New Roman" w:hAnsi="Times New Roman"/>
+                <w:b/>
+                <w:bCs/>
+                <w:sz w:val="15"/>
+                <w:szCs w:val="15"/>
+              </w:rPr>
+              <w:t>HMS-F-071</w:t>
+            </w:r>
+          </w:p>
+        </w:tc>
+        <w:tc>
+          <w:tcPr>
+            <w:tcW w:type="dxa" w:w="1650"/>
+            <w:tcBorders>
+              <w:top w:val="single" w:color="808080" w:sz="4"/>
+              <w:left w:val="single" w:color="808080" w:sz="4"/>
+              <w:bottom w:val="single" w:color="808080" w:sz="4"/>
+              <w:right w:val="single" w:color="808080" w:sz="4"/>
+            </w:tcBorders>
+            <w:tcMar>
+              <w:top w:type="dxa" w:w="50"/>
+              <w:left w:type="dxa" w:w="90"/>
+              <w:bottom w:type="dxa" w:w="50"/>
+              <w:right w:type="dxa" w:w="90"/>
+            </w:tcMar>
+            <w:vAlign w:val="top"/>
+          </w:tcPr>
+          <w:p>
+            <w:pPr>
+              <w:spacing w:after="30" w:line="240"/>
+              <w:jc w:val="left"/>
+            </w:pPr>
+            <w:r>
+              <w:rPr>
+                <w:rFonts w:ascii="Times New Roman" w:cs="Times New Roman" w:eastAsia="Times New Roman" w:hAnsi="Times New Roman"/>
+                <w:sz w:val="15"/>
+                <w:szCs w:val="15"/>
+              </w:rPr>
+              <w:t>Users, audit log, password pages</w:t>
+            </w:r>
+          </w:p>
+        </w:tc>
+        <w:tc>
+          <w:tcPr>
+            <w:tcW w:type="dxa" w:w="850"/>
+            <w:tcBorders>
+              <w:top w:val="single" w:color="808080" w:sz="4"/>
+              <w:left w:val="single" w:color="808080" w:sz="4"/>
+              <w:bottom w:val="single" w:color="808080" w:sz="4"/>
+              <w:right w:val="single" w:color="808080" w:sz="4"/>
+            </w:tcBorders>
+            <w:tcMar>
+              <w:top w:type="dxa" w:w="50"/>
+              <w:left w:type="dxa" w:w="90"/>
+              <w:bottom w:type="dxa" w:w="50"/>
+              <w:right w:type="dxa" w:w="90"/>
+            </w:tcMar>
+            <w:vAlign w:val="top"/>
+          </w:tcPr>
+          <w:p>
+            <w:pPr>
+              <w:spacing w:after="30" w:line="240"/>
+              <w:jc w:val="left"/>
+            </w:pPr>
+            <w:r>
+              <w:rPr>
+                <w:rFonts w:ascii="Times New Roman" w:cs="Times New Roman" w:eastAsia="Times New Roman" w:hAnsi="Times New Roman"/>
+                <w:sz w:val="15"/>
+                <w:szCs w:val="15"/>
+              </w:rPr>
+              <w:t>C1, C16, C3, C12</w:t>
+            </w:r>
+          </w:p>
+        </w:tc>
+        <w:tc>
+          <w:tcPr>
+            <w:tcW w:type="dxa" w:w="1750"/>
+            <w:tcBorders>
+              <w:top w:val="single" w:color="808080" w:sz="4"/>
+              <w:left w:val="single" w:color="808080" w:sz="4"/>
+              <w:bottom w:val="single" w:color="808080" w:sz="4"/>
+              <w:right w:val="single" w:color="808080" w:sz="4"/>
+            </w:tcBorders>
+            <w:tcMar>
+              <w:top w:type="dxa" w:w="50"/>
+              <w:left w:type="dxa" w:w="90"/>
+              <w:bottom w:type="dxa" w:w="50"/>
+              <w:right w:type="dxa" w:w="90"/>
+            </w:tcMar>
+            <w:vAlign w:val="top"/>
+          </w:tcPr>
+          <w:p>
+            <w:pPr>
+              <w:spacing w:after="30" w:line="240"/>
+              <w:jc w:val="left"/>
+            </w:pPr>
+            <w:r>
+              <w:rPr>
+                <w:rFonts w:ascii="Times New Roman" w:cs="Times New Roman" w:eastAsia="Times New Roman" w:hAnsi="Times New Roman"/>
+                <w:sz w:val="15"/>
+                <w:szCs w:val="15"/>
+              </w:rPr>
+              <w:t>SAD 4.3.8, 4.5</w:t>
+            </w:r>
+          </w:p>
+        </w:tc>
+        <w:tc>
+          <w:tcPr>
+            <w:tcW w:type="dxa" w:w="1500"/>
+            <w:tcBorders>
+              <w:top w:val="single" w:color="808080" w:sz="4"/>
+              <w:left w:val="single" w:color="808080" w:sz="4"/>
+              <w:bottom w:val="single" w:color="808080" w:sz="4"/>
+              <w:right w:val="single" w:color="808080" w:sz="4"/>
+            </w:tcBorders>
+            <w:tcMar>
+              <w:top w:type="dxa" w:w="50"/>
+              <w:left w:type="dxa" w:w="90"/>
+              <w:bottom w:type="dxa" w:w="50"/>
+              <w:right w:type="dxa" w:w="90"/>
+            </w:tcMar>
+            <w:vAlign w:val="top"/>
+          </w:tcPr>
+          <w:p>
+            <w:pPr>
+              <w:spacing w:after="30" w:line="240"/>
+              <w:jc w:val="left"/>
+            </w:pPr>
+            <w:r>
+              <w:rPr>
+                <w:rFonts w:ascii="Times New Roman" w:cs="Times New Roman" w:eastAsia="Times New Roman" w:hAnsi="Times New Roman"/>
+                <w:sz w:val="15"/>
+                <w:szCs w:val="15"/>
+              </w:rPr>
+              <w:t>routes_auth.cpp, UsersPage.tsx, AuditPage.tsx, PasswordPage.tsx</w:t>
+            </w:r>
+          </w:p>
+        </w:tc>
+        <w:tc>
+          <w:tcPr>
+            <w:tcW w:type="dxa" w:w="900"/>
+            <w:tcBorders>
+              <w:top w:val="single" w:color="808080" w:sz="4"/>
+              <w:left w:val="single" w:color="808080" w:sz="4"/>
+              <w:bottom w:val="single" w:color="808080" w:sz="4"/>
+              <w:right w:val="single" w:color="808080" w:sz="4"/>
+            </w:tcBorders>
+            <w:tcMar>
+              <w:top w:type="dxa" w:w="50"/>
+              <w:left w:type="dxa" w:w="90"/>
+              <w:bottom w:type="dxa" w:w="50"/>
+              <w:right w:type="dxa" w:w="90"/>
+            </w:tcMar>
+            <w:vAlign w:val="top"/>
+          </w:tcPr>
+          <w:p>
+            <w:pPr>
+              <w:spacing w:after="30" w:line="240"/>
+              <w:jc w:val="left"/>
+            </w:pPr>
+            <w:r>
+              <w:rPr>
+                <w:rFonts w:ascii="Times New Roman" w:cs="Times New Roman" w:eastAsia="Times New Roman" w:hAnsi="Times New Roman"/>
+                <w:sz w:val="15"/>
+                <w:szCs w:val="15"/>
+              </w:rPr>
+              <w:t>UT-WEB</w:t>
+            </w:r>
+          </w:p>
+        </w:tc>
+        <w:tc>
+          <w:tcPr>
+            <w:tcW w:type="dxa" w:w="1496"/>
+            <w:tcBorders>
+              <w:top w:val="single" w:color="808080" w:sz="4"/>
+              <w:left w:val="single" w:color="808080" w:sz="4"/>
+              <w:bottom w:val="single" w:color="808080" w:sz="4"/>
+              <w:right w:val="single" w:color="808080" w:sz="4"/>
+            </w:tcBorders>
+            <w:tcMar>
+              <w:top w:type="dxa" w:w="50"/>
+              <w:left w:type="dxa" w:w="90"/>
+              <w:bottom w:type="dxa" w:w="50"/>
+              <w:right w:type="dxa" w:w="90"/>
+            </w:tcMar>
+            <w:vAlign w:val="top"/>
+          </w:tcPr>
+          <w:p>
+            <w:pPr>
+              <w:spacing w:after="30" w:line="240"/>
+              <w:jc w:val="left"/>
+            </w:pPr>
+            <w:r>
+              <w:rPr>
+                <w:rFonts w:ascii="Times New Roman" w:cs="Times New Roman" w:eastAsia="Times New Roman" w:hAnsi="Times New Roman"/>
+                <w:sz w:val="15"/>
+                <w:szCs w:val="15"/>
+              </w:rPr>
+              <w:t>TC-WEB-02</w:t>
+            </w:r>
+          </w:p>
+        </w:tc>
+      </w:tr>
+      <w:tr>
+        <w:trPr>
+          <w:cantSplit/>
+        </w:trPr>
+        <w:tc>
+          <w:tcPr>
+            <w:tcW w:type="dxa" w:w="450"/>
+            <w:tcBorders>
+              <w:top w:val="single" w:color="808080" w:sz="4"/>
+              <w:left w:val="single" w:color="808080" w:sz="4"/>
+              <w:bottom w:val="single" w:color="808080" w:sz="4"/>
+              <w:right w:val="single" w:color="808080" w:sz="4"/>
+            </w:tcBorders>
+            <w:tcMar>
+              <w:top w:type="dxa" w:w="50"/>
+              <w:left w:type="dxa" w:w="90"/>
+              <w:bottom w:type="dxa" w:w="50"/>
+              <w:right w:type="dxa" w:w="90"/>
+            </w:tcMar>
+            <w:vAlign w:val="top"/>
+          </w:tcPr>
+          <w:p>
+            <w:pPr>
+              <w:spacing w:after="30" w:line="240"/>
+              <w:jc w:val="left"/>
+            </w:pPr>
+            <w:r>
+              <w:rPr>
+                <w:rFonts w:ascii="Times New Roman" w:cs="Times New Roman" w:eastAsia="Times New Roman" w:hAnsi="Times New Roman"/>
+                <w:sz w:val="15"/>
+                <w:szCs w:val="15"/>
+              </w:rPr>
+              <w:t>52</w:t>
+            </w:r>
+          </w:p>
+        </w:tc>
+        <w:tc>
+          <w:tcPr>
+            <w:tcW w:type="dxa" w:w="1150"/>
+            <w:tcBorders>
+              <w:top w:val="single" w:color="808080" w:sz="4"/>
+              <w:left w:val="single" w:color="808080" w:sz="4"/>
+              <w:bottom w:val="single" w:color="808080" w:sz="4"/>
+              <w:right w:val="single" w:color="808080" w:sz="4"/>
+            </w:tcBorders>
+            <w:tcMar>
+              <w:top w:type="dxa" w:w="50"/>
+              <w:left w:type="dxa" w:w="90"/>
+              <w:bottom w:type="dxa" w:w="50"/>
+              <w:right w:type="dxa" w:w="90"/>
+            </w:tcMar>
+            <w:vAlign w:val="top"/>
+          </w:tcPr>
+          <w:p>
+            <w:pPr>
+              <w:spacing w:after="30" w:line="240"/>
+              <w:jc w:val="left"/>
+            </w:pPr>
+            <w:r>
+              <w:rPr>
+                <w:rFonts w:ascii="Times New Roman" w:cs="Times New Roman" w:eastAsia="Times New Roman" w:hAnsi="Times New Roman"/>
+                <w:b/>
+                <w:bCs/>
+                <w:sz w:val="15"/>
+                <w:szCs w:val="15"/>
+              </w:rPr>
+              <w:t>HMS-F-072</w:t>
+            </w:r>
+          </w:p>
+        </w:tc>
+        <w:tc>
+          <w:tcPr>
+            <w:tcW w:type="dxa" w:w="1650"/>
+            <w:tcBorders>
+              <w:top w:val="single" w:color="808080" w:sz="4"/>
+              <w:left w:val="single" w:color="808080" w:sz="4"/>
+              <w:bottom w:val="single" w:color="808080" w:sz="4"/>
+              <w:right w:val="single" w:color="808080" w:sz="4"/>
+            </w:tcBorders>
+            <w:tcMar>
+              <w:top w:type="dxa" w:w="50"/>
+              <w:left w:type="dxa" w:w="90"/>
+              <w:bottom w:type="dxa" w:w="50"/>
+              <w:right w:type="dxa" w:w="90"/>
+            </w:tcMar>
+            <w:vAlign w:val="top"/>
+          </w:tcPr>
+          <w:p>
+            <w:pPr>
+              <w:spacing w:after="30" w:line="240"/>
+              <w:jc w:val="left"/>
+            </w:pPr>
+            <w:r>
+              <w:rPr>
+                <w:rFonts w:ascii="Times New Roman" w:cs="Times New Roman" w:eastAsia="Times New Roman" w:hAnsi="Times New Roman"/>
+                <w:sz w:val="15"/>
+                <w:szCs w:val="15"/>
+              </w:rPr>
+              <w:t>Patients page</w:t>
+            </w:r>
+          </w:p>
+        </w:tc>
+        <w:tc>
+          <w:tcPr>
+            <w:tcW w:type="dxa" w:w="850"/>
+            <w:tcBorders>
+              <w:top w:val="single" w:color="808080" w:sz="4"/>
+              <w:left w:val="single" w:color="808080" w:sz="4"/>
+              <w:bottom w:val="single" w:color="808080" w:sz="4"/>
+              <w:right w:val="single" w:color="808080" w:sz="4"/>
+            </w:tcBorders>
+            <w:tcMar>
+              <w:top w:type="dxa" w:w="50"/>
+              <w:left w:type="dxa" w:w="90"/>
+              <w:bottom w:type="dxa" w:w="50"/>
+              <w:right w:type="dxa" w:w="90"/>
+            </w:tcMar>
+            <w:vAlign w:val="top"/>
+          </w:tcPr>
+          <w:p>
+            <w:pPr>
+              <w:spacing w:after="30" w:line="240"/>
+              <w:jc w:val="left"/>
+            </w:pPr>
+            <w:r>
+              <w:rPr>
+                <w:rFonts w:ascii="Times New Roman" w:cs="Times New Roman" w:eastAsia="Times New Roman" w:hAnsi="Times New Roman"/>
+                <w:sz w:val="15"/>
+                <w:szCs w:val="15"/>
+              </w:rPr>
+              <w:t>C1, C16, C4</w:t>
+            </w:r>
+          </w:p>
+        </w:tc>
+        <w:tc>
+          <w:tcPr>
+            <w:tcW w:type="dxa" w:w="1750"/>
+            <w:tcBorders>
+              <w:top w:val="single" w:color="808080" w:sz="4"/>
+              <w:left w:val="single" w:color="808080" w:sz="4"/>
+              <w:bottom w:val="single" w:color="808080" w:sz="4"/>
+              <w:right w:val="single" w:color="808080" w:sz="4"/>
+            </w:tcBorders>
+            <w:tcMar>
+              <w:top w:type="dxa" w:w="50"/>
+              <w:left w:type="dxa" w:w="90"/>
+              <w:bottom w:type="dxa" w:w="50"/>
+              <w:right w:type="dxa" w:w="90"/>
+            </w:tcMar>
+            <w:vAlign w:val="top"/>
+          </w:tcPr>
+          <w:p>
+            <w:pPr>
+              <w:spacing w:after="30" w:line="240"/>
+              <w:jc w:val="left"/>
+            </w:pPr>
+            <w:r>
+              <w:rPr>
+                <w:rFonts w:ascii="Times New Roman" w:cs="Times New Roman" w:eastAsia="Times New Roman" w:hAnsi="Times New Roman"/>
+                <w:sz w:val="15"/>
+                <w:szCs w:val="15"/>
+              </w:rPr>
+              <w:t>SAD 4.3.8, 4.5</w:t>
+            </w:r>
+          </w:p>
+        </w:tc>
+        <w:tc>
+          <w:tcPr>
+            <w:tcW w:type="dxa" w:w="1500"/>
+            <w:tcBorders>
+              <w:top w:val="single" w:color="808080" w:sz="4"/>
+              <w:left w:val="single" w:color="808080" w:sz="4"/>
+              <w:bottom w:val="single" w:color="808080" w:sz="4"/>
+              <w:right w:val="single" w:color="808080" w:sz="4"/>
+            </w:tcBorders>
+            <w:tcMar>
+              <w:top w:type="dxa" w:w="50"/>
+              <w:left w:type="dxa" w:w="90"/>
+              <w:bottom w:type="dxa" w:w="50"/>
+              <w:right w:type="dxa" w:w="90"/>
+            </w:tcMar>
+            <w:vAlign w:val="top"/>
+          </w:tcPr>
+          <w:p>
+            <w:pPr>
+              <w:spacing w:after="30" w:line="240"/>
+              <w:jc w:val="left"/>
+            </w:pPr>
+            <w:r>
+              <w:rPr>
+                <w:rFonts w:ascii="Times New Roman" w:cs="Times New Roman" w:eastAsia="Times New Roman" w:hAnsi="Times New Roman"/>
+                <w:sz w:val="15"/>
+                <w:szCs w:val="15"/>
+              </w:rPr>
+              <w:t>routes_patients.cpp, PatientsPage.tsx</w:t>
+            </w:r>
+          </w:p>
+        </w:tc>
+        <w:tc>
+          <w:tcPr>
+            <w:tcW w:type="dxa" w:w="900"/>
+            <w:tcBorders>
+              <w:top w:val="single" w:color="808080" w:sz="4"/>
+              <w:left w:val="single" w:color="808080" w:sz="4"/>
+              <w:bottom w:val="single" w:color="808080" w:sz="4"/>
+              <w:right w:val="single" w:color="808080" w:sz="4"/>
+            </w:tcBorders>
+            <w:tcMar>
+              <w:top w:type="dxa" w:w="50"/>
+              <w:left w:type="dxa" w:w="90"/>
+              <w:bottom w:type="dxa" w:w="50"/>
+              <w:right w:type="dxa" w:w="90"/>
+            </w:tcMar>
+            <w:vAlign w:val="top"/>
+          </w:tcPr>
+          <w:p>
+            <w:pPr>
+              <w:spacing w:after="30" w:line="240"/>
+              <w:jc w:val="left"/>
+            </w:pPr>
+            <w:r>
+              <w:rPr>
+                <w:rFonts w:ascii="Times New Roman" w:cs="Times New Roman" w:eastAsia="Times New Roman" w:hAnsi="Times New Roman"/>
+                <w:sz w:val="15"/>
+                <w:szCs w:val="15"/>
+              </w:rPr>
+              <w:t>UT-WEB</w:t>
+            </w:r>
+          </w:p>
+        </w:tc>
+        <w:tc>
+          <w:tcPr>
+            <w:tcW w:type="dxa" w:w="1496"/>
+            <w:tcBorders>
+              <w:top w:val="single" w:color="808080" w:sz="4"/>
+              <w:left w:val="single" w:color="808080" w:sz="4"/>
+              <w:bottom w:val="single" w:color="808080" w:sz="4"/>
+              <w:right w:val="single" w:color="808080" w:sz="4"/>
+            </w:tcBorders>
+            <w:tcMar>
+              <w:top w:type="dxa" w:w="50"/>
+              <w:left w:type="dxa" w:w="90"/>
+              <w:bottom w:type="dxa" w:w="50"/>
+              <w:right w:type="dxa" w:w="90"/>
+            </w:tcMar>
+            <w:vAlign w:val="top"/>
+          </w:tcPr>
+          <w:p>
+            <w:pPr>
+              <w:spacing w:after="30" w:line="240"/>
+              <w:jc w:val="left"/>
+            </w:pPr>
+            <w:r>
+              <w:rPr>
+                <w:rFonts w:ascii="Times New Roman" w:cs="Times New Roman" w:eastAsia="Times New Roman" w:hAnsi="Times New Roman"/>
+                <w:sz w:val="15"/>
+                <w:szCs w:val="15"/>
+              </w:rPr>
+              <w:t>TC-WEB-03</w:t>
+            </w:r>
+          </w:p>
+        </w:tc>
+      </w:tr>
+      <w:tr>
+        <w:trPr>
+          <w:cantSplit/>
+        </w:trPr>
+        <w:tc>
+          <w:tcPr>
+            <w:tcW w:type="dxa" w:w="450"/>
+            <w:tcBorders>
+              <w:top w:val="single" w:color="808080" w:sz="4"/>
+              <w:left w:val="single" w:color="808080" w:sz="4"/>
+              <w:bottom w:val="single" w:color="808080" w:sz="4"/>
+              <w:right w:val="single" w:color="808080" w:sz="4"/>
+            </w:tcBorders>
+            <w:tcMar>
+              <w:top w:type="dxa" w:w="50"/>
+              <w:left w:type="dxa" w:w="90"/>
+              <w:bottom w:type="dxa" w:w="50"/>
+              <w:right w:type="dxa" w:w="90"/>
+            </w:tcMar>
+            <w:vAlign w:val="top"/>
+          </w:tcPr>
+          <w:p>
+            <w:pPr>
+              <w:spacing w:after="30" w:line="240"/>
+              <w:jc w:val="left"/>
+            </w:pPr>
+            <w:r>
+              <w:rPr>
+                <w:rFonts w:ascii="Times New Roman" w:cs="Times New Roman" w:eastAsia="Times New Roman" w:hAnsi="Times New Roman"/>
+                <w:sz w:val="15"/>
+                <w:szCs w:val="15"/>
+              </w:rPr>
+              <w:t>53</w:t>
+            </w:r>
+          </w:p>
+        </w:tc>
+        <w:tc>
+          <w:tcPr>
+            <w:tcW w:type="dxa" w:w="1150"/>
+            <w:tcBorders>
+              <w:top w:val="single" w:color="808080" w:sz="4"/>
+              <w:left w:val="single" w:color="808080" w:sz="4"/>
+              <w:bottom w:val="single" w:color="808080" w:sz="4"/>
+              <w:right w:val="single" w:color="808080" w:sz="4"/>
+            </w:tcBorders>
+            <w:tcMar>
+              <w:top w:type="dxa" w:w="50"/>
+              <w:left w:type="dxa" w:w="90"/>
+              <w:bottom w:type="dxa" w:w="50"/>
+              <w:right w:type="dxa" w:w="90"/>
+            </w:tcMar>
+            <w:vAlign w:val="top"/>
+          </w:tcPr>
+          <w:p>
+            <w:pPr>
+              <w:spacing w:after="30" w:line="240"/>
+              <w:jc w:val="left"/>
+            </w:pPr>
+            <w:r>
+              <w:rPr>
+                <w:rFonts w:ascii="Times New Roman" w:cs="Times New Roman" w:eastAsia="Times New Roman" w:hAnsi="Times New Roman"/>
+                <w:b/>
+                <w:bCs/>
+                <w:sz w:val="15"/>
+                <w:szCs w:val="15"/>
+              </w:rPr>
+              <w:t>HMS-F-073</w:t>
+            </w:r>
+          </w:p>
+        </w:tc>
+        <w:tc>
+          <w:tcPr>
+            <w:tcW w:type="dxa" w:w="1650"/>
+            <w:tcBorders>
+              <w:top w:val="single" w:color="808080" w:sz="4"/>
+              <w:left w:val="single" w:color="808080" w:sz="4"/>
+              <w:bottom w:val="single" w:color="808080" w:sz="4"/>
+              <w:right w:val="single" w:color="808080" w:sz="4"/>
+            </w:tcBorders>
+            <w:tcMar>
+              <w:top w:type="dxa" w:w="50"/>
+              <w:left w:type="dxa" w:w="90"/>
+              <w:bottom w:type="dxa" w:w="50"/>
+              <w:right w:type="dxa" w:w="90"/>
+            </w:tcMar>
+            <w:vAlign w:val="top"/>
+          </w:tcPr>
+          <w:p>
+            <w:pPr>
+              <w:spacing w:after="30" w:line="240"/>
+              <w:jc w:val="left"/>
+            </w:pPr>
+            <w:r>
+              <w:rPr>
+                <w:rFonts w:ascii="Times New Roman" w:cs="Times New Roman" w:eastAsia="Times New Roman" w:hAnsi="Times New Roman"/>
+                <w:sz w:val="15"/>
+                <w:szCs w:val="15"/>
+              </w:rPr>
+              <w:t>Doctors, appointments, schedule pages</w:t>
+            </w:r>
+          </w:p>
+        </w:tc>
+        <w:tc>
+          <w:tcPr>
+            <w:tcW w:type="dxa" w:w="850"/>
+            <w:tcBorders>
+              <w:top w:val="single" w:color="808080" w:sz="4"/>
+              <w:left w:val="single" w:color="808080" w:sz="4"/>
+              <w:bottom w:val="single" w:color="808080" w:sz="4"/>
+              <w:right w:val="single" w:color="808080" w:sz="4"/>
+            </w:tcBorders>
+            <w:tcMar>
+              <w:top w:type="dxa" w:w="50"/>
+              <w:left w:type="dxa" w:w="90"/>
+              <w:bottom w:type="dxa" w:w="50"/>
+              <w:right w:type="dxa" w:w="90"/>
+            </w:tcMar>
+            <w:vAlign w:val="top"/>
+          </w:tcPr>
+          <w:p>
+            <w:pPr>
+              <w:spacing w:after="30" w:line="240"/>
+              <w:jc w:val="left"/>
+            </w:pPr>
+            <w:r>
+              <w:rPr>
+                <w:rFonts w:ascii="Times New Roman" w:cs="Times New Roman" w:eastAsia="Times New Roman" w:hAnsi="Times New Roman"/>
+                <w:sz w:val="15"/>
+                <w:szCs w:val="15"/>
+              </w:rPr>
+              <w:t>C1, C16, C5, C6</w:t>
+            </w:r>
+          </w:p>
+        </w:tc>
+        <w:tc>
+          <w:tcPr>
+            <w:tcW w:type="dxa" w:w="1750"/>
+            <w:tcBorders>
+              <w:top w:val="single" w:color="808080" w:sz="4"/>
+              <w:left w:val="single" w:color="808080" w:sz="4"/>
+              <w:bottom w:val="single" w:color="808080" w:sz="4"/>
+              <w:right w:val="single" w:color="808080" w:sz="4"/>
+            </w:tcBorders>
+            <w:tcMar>
+              <w:top w:type="dxa" w:w="50"/>
+              <w:left w:type="dxa" w:w="90"/>
+              <w:bottom w:type="dxa" w:w="50"/>
+              <w:right w:type="dxa" w:w="90"/>
+            </w:tcMar>
+            <w:vAlign w:val="top"/>
+          </w:tcPr>
+          <w:p>
+            <w:pPr>
+              <w:spacing w:after="30" w:line="240"/>
+              <w:jc w:val="left"/>
+            </w:pPr>
+            <w:r>
+              <w:rPr>
+                <w:rFonts w:ascii="Times New Roman" w:cs="Times New Roman" w:eastAsia="Times New Roman" w:hAnsi="Times New Roman"/>
+                <w:sz w:val="15"/>
+                <w:szCs w:val="15"/>
+              </w:rPr>
+              <w:t>SAD 4.3.8, 4.5</w:t>
+            </w:r>
+          </w:p>
+        </w:tc>
+        <w:tc>
+          <w:tcPr>
+            <w:tcW w:type="dxa" w:w="1500"/>
+            <w:tcBorders>
+              <w:top w:val="single" w:color="808080" w:sz="4"/>
+              <w:left w:val="single" w:color="808080" w:sz="4"/>
+              <w:bottom w:val="single" w:color="808080" w:sz="4"/>
+              <w:right w:val="single" w:color="808080" w:sz="4"/>
+            </w:tcBorders>
+            <w:tcMar>
+              <w:top w:type="dxa" w:w="50"/>
+              <w:left w:type="dxa" w:w="90"/>
+              <w:bottom w:type="dxa" w:w="50"/>
+              <w:right w:type="dxa" w:w="90"/>
+            </w:tcMar>
+            <w:vAlign w:val="top"/>
+          </w:tcPr>
+          <w:p>
+            <w:pPr>
+              <w:spacing w:after="30" w:line="240"/>
+              <w:jc w:val="left"/>
+            </w:pPr>
+            <w:r>
+              <w:rPr>
+                <w:rFonts w:ascii="Times New Roman" w:cs="Times New Roman" w:eastAsia="Times New Roman" w:hAnsi="Times New Roman"/>
+                <w:sz w:val="15"/>
+                <w:szCs w:val="15"/>
+              </w:rPr>
+              <w:t>routes_doctors.cpp, routes_appointments.cpp, DoctorsPage.tsx, AppointmentsPage.tsx, SchedulePage.tsx</w:t>
+            </w:r>
+          </w:p>
+        </w:tc>
+        <w:tc>
+          <w:tcPr>
+            <w:tcW w:type="dxa" w:w="900"/>
+            <w:tcBorders>
+              <w:top w:val="single" w:color="808080" w:sz="4"/>
+              <w:left w:val="single" w:color="808080" w:sz="4"/>
+              <w:bottom w:val="single" w:color="808080" w:sz="4"/>
+              <w:right w:val="single" w:color="808080" w:sz="4"/>
+            </w:tcBorders>
+            <w:tcMar>
+              <w:top w:type="dxa" w:w="50"/>
+              <w:left w:type="dxa" w:w="90"/>
+              <w:bottom w:type="dxa" w:w="50"/>
+              <w:right w:type="dxa" w:w="90"/>
+            </w:tcMar>
+            <w:vAlign w:val="top"/>
+          </w:tcPr>
+          <w:p>
+            <w:pPr>
+              <w:spacing w:after="30" w:line="240"/>
+              <w:jc w:val="left"/>
+            </w:pPr>
+            <w:r>
+              <w:rPr>
+                <w:rFonts w:ascii="Times New Roman" w:cs="Times New Roman" w:eastAsia="Times New Roman" w:hAnsi="Times New Roman"/>
+                <w:sz w:val="15"/>
+                <w:szCs w:val="15"/>
+              </w:rPr>
+              <w:t>UT-WEB</w:t>
+            </w:r>
+          </w:p>
+        </w:tc>
+        <w:tc>
+          <w:tcPr>
+            <w:tcW w:type="dxa" w:w="1496"/>
+            <w:tcBorders>
+              <w:top w:val="single" w:color="808080" w:sz="4"/>
+              <w:left w:val="single" w:color="808080" w:sz="4"/>
+              <w:bottom w:val="single" w:color="808080" w:sz="4"/>
+              <w:right w:val="single" w:color="808080" w:sz="4"/>
+            </w:tcBorders>
+            <w:tcMar>
+              <w:top w:type="dxa" w:w="50"/>
+              <w:left w:type="dxa" w:w="90"/>
+              <w:bottom w:type="dxa" w:w="50"/>
+              <w:right w:type="dxa" w:w="90"/>
+            </w:tcMar>
+            <w:vAlign w:val="top"/>
+          </w:tcPr>
+          <w:p>
+            <w:pPr>
+              <w:spacing w:after="30" w:line="240"/>
+              <w:jc w:val="left"/>
+            </w:pPr>
+            <w:r>
+              <w:rPr>
+                <w:rFonts w:ascii="Times New Roman" w:cs="Times New Roman" w:eastAsia="Times New Roman" w:hAnsi="Times New Roman"/>
+                <w:sz w:val="15"/>
+                <w:szCs w:val="15"/>
+              </w:rPr>
+              <w:t>TC-WEB-04</w:t>
+            </w:r>
+          </w:p>
+        </w:tc>
+      </w:tr>
+      <w:tr>
+        <w:trPr>
+          <w:cantSplit/>
+        </w:trPr>
+        <w:tc>
+          <w:tcPr>
+            <w:tcW w:type="dxa" w:w="450"/>
+            <w:tcBorders>
+              <w:top w:val="single" w:color="808080" w:sz="4"/>
+              <w:left w:val="single" w:color="808080" w:sz="4"/>
+              <w:bottom w:val="single" w:color="808080" w:sz="4"/>
+              <w:right w:val="single" w:color="808080" w:sz="4"/>
+            </w:tcBorders>
+            <w:tcMar>
+              <w:top w:type="dxa" w:w="50"/>
+              <w:left w:type="dxa" w:w="90"/>
+              <w:bottom w:type="dxa" w:w="50"/>
+              <w:right w:type="dxa" w:w="90"/>
+            </w:tcMar>
+            <w:vAlign w:val="top"/>
+          </w:tcPr>
+          <w:p>
+            <w:pPr>
+              <w:spacing w:after="30" w:line="240"/>
+              <w:jc w:val="left"/>
+            </w:pPr>
+            <w:r>
+              <w:rPr>
+                <w:rFonts w:ascii="Times New Roman" w:cs="Times New Roman" w:eastAsia="Times New Roman" w:hAnsi="Times New Roman"/>
+                <w:sz w:val="15"/>
+                <w:szCs w:val="15"/>
+              </w:rPr>
+              <w:t>54</w:t>
+            </w:r>
+          </w:p>
+        </w:tc>
+        <w:tc>
+          <w:tcPr>
+            <w:tcW w:type="dxa" w:w="1150"/>
+            <w:tcBorders>
+              <w:top w:val="single" w:color="808080" w:sz="4"/>
+              <w:left w:val="single" w:color="808080" w:sz="4"/>
+              <w:bottom w:val="single" w:color="808080" w:sz="4"/>
+              <w:right w:val="single" w:color="808080" w:sz="4"/>
+            </w:tcBorders>
+            <w:tcMar>
+              <w:top w:type="dxa" w:w="50"/>
+              <w:left w:type="dxa" w:w="90"/>
+              <w:bottom w:type="dxa" w:w="50"/>
+              <w:right w:type="dxa" w:w="90"/>
+            </w:tcMar>
+            <w:vAlign w:val="top"/>
+          </w:tcPr>
+          <w:p>
+            <w:pPr>
+              <w:spacing w:after="30" w:line="240"/>
+              <w:jc w:val="left"/>
+            </w:pPr>
+            <w:r>
+              <w:rPr>
+                <w:rFonts w:ascii="Times New Roman" w:cs="Times New Roman" w:eastAsia="Times New Roman" w:hAnsi="Times New Roman"/>
+                <w:b/>
+                <w:bCs/>
+                <w:sz w:val="15"/>
+                <w:szCs w:val="15"/>
+              </w:rPr>
+              <w:t>HMS-F-074</w:t>
+            </w:r>
+          </w:p>
+        </w:tc>
+        <w:tc>
+          <w:tcPr>
+            <w:tcW w:type="dxa" w:w="1650"/>
+            <w:tcBorders>
+              <w:top w:val="single" w:color="808080" w:sz="4"/>
+              <w:left w:val="single" w:color="808080" w:sz="4"/>
+              <w:bottom w:val="single" w:color="808080" w:sz="4"/>
+              <w:right w:val="single" w:color="808080" w:sz="4"/>
+            </w:tcBorders>
+            <w:tcMar>
+              <w:top w:type="dxa" w:w="50"/>
+              <w:left w:type="dxa" w:w="90"/>
+              <w:bottom w:type="dxa" w:w="50"/>
+              <w:right w:type="dxa" w:w="90"/>
+            </w:tcMar>
+            <w:vAlign w:val="top"/>
+          </w:tcPr>
+          <w:p>
+            <w:pPr>
+              <w:spacing w:after="30" w:line="240"/>
+              <w:jc w:val="left"/>
+            </w:pPr>
+            <w:r>
+              <w:rPr>
+                <w:rFonts w:ascii="Times New Roman" w:cs="Times New Roman" w:eastAsia="Times New Roman" w:hAnsi="Times New Roman"/>
+                <w:sz w:val="15"/>
+                <w:szCs w:val="15"/>
+              </w:rPr>
+              <w:t>Consultation, report, backup pages</w:t>
+            </w:r>
+          </w:p>
+        </w:tc>
+        <w:tc>
+          <w:tcPr>
+            <w:tcW w:type="dxa" w:w="850"/>
+            <w:tcBorders>
+              <w:top w:val="single" w:color="808080" w:sz="4"/>
+              <w:left w:val="single" w:color="808080" w:sz="4"/>
+              <w:bottom w:val="single" w:color="808080" w:sz="4"/>
+              <w:right w:val="single" w:color="808080" w:sz="4"/>
+            </w:tcBorders>
+            <w:tcMar>
+              <w:top w:type="dxa" w:w="50"/>
+              <w:left w:type="dxa" w:w="90"/>
+              <w:bottom w:type="dxa" w:w="50"/>
+              <w:right w:type="dxa" w:w="90"/>
+            </w:tcMar>
+            <w:vAlign w:val="top"/>
+          </w:tcPr>
+          <w:p>
+            <w:pPr>
+              <w:spacing w:after="30" w:line="240"/>
+              <w:jc w:val="left"/>
+            </w:pPr>
+            <w:r>
+              <w:rPr>
+                <w:rFonts w:ascii="Times New Roman" w:cs="Times New Roman" w:eastAsia="Times New Roman" w:hAnsi="Times New Roman"/>
+                <w:sz w:val="15"/>
+                <w:szCs w:val="15"/>
+              </w:rPr>
+              <w:t>C1, C16, C7, C8, C9</w:t>
+            </w:r>
+          </w:p>
+        </w:tc>
+        <w:tc>
+          <w:tcPr>
+            <w:tcW w:type="dxa" w:w="1750"/>
+            <w:tcBorders>
+              <w:top w:val="single" w:color="808080" w:sz="4"/>
+              <w:left w:val="single" w:color="808080" w:sz="4"/>
+              <w:bottom w:val="single" w:color="808080" w:sz="4"/>
+              <w:right w:val="single" w:color="808080" w:sz="4"/>
+            </w:tcBorders>
+            <w:tcMar>
+              <w:top w:type="dxa" w:w="50"/>
+              <w:left w:type="dxa" w:w="90"/>
+              <w:bottom w:type="dxa" w:w="50"/>
+              <w:right w:type="dxa" w:w="90"/>
+            </w:tcMar>
+            <w:vAlign w:val="top"/>
+          </w:tcPr>
+          <w:p>
+            <w:pPr>
+              <w:spacing w:after="30" w:line="240"/>
+              <w:jc w:val="left"/>
+            </w:pPr>
+            <w:r>
+              <w:rPr>
+                <w:rFonts w:ascii="Times New Roman" w:cs="Times New Roman" w:eastAsia="Times New Roman" w:hAnsi="Times New Roman"/>
+                <w:sz w:val="15"/>
+                <w:szCs w:val="15"/>
+              </w:rPr>
+              <w:t>SAD 4.3.8, 4.5</w:t>
+            </w:r>
+          </w:p>
+        </w:tc>
+        <w:tc>
+          <w:tcPr>
+            <w:tcW w:type="dxa" w:w="1500"/>
+            <w:tcBorders>
+              <w:top w:val="single" w:color="808080" w:sz="4"/>
+              <w:left w:val="single" w:color="808080" w:sz="4"/>
+              <w:bottom w:val="single" w:color="808080" w:sz="4"/>
+              <w:right w:val="single" w:color="808080" w:sz="4"/>
+            </w:tcBorders>
+            <w:tcMar>
+              <w:top w:type="dxa" w:w="50"/>
+              <w:left w:type="dxa" w:w="90"/>
+              <w:bottom w:type="dxa" w:w="50"/>
+              <w:right w:type="dxa" w:w="90"/>
+            </w:tcMar>
+            <w:vAlign w:val="top"/>
+          </w:tcPr>
+          <w:p>
+            <w:pPr>
+              <w:spacing w:after="30" w:line="240"/>
+              <w:jc w:val="left"/>
+            </w:pPr>
+            <w:r>
+              <w:rPr>
+                <w:rFonts w:ascii="Times New Roman" w:cs="Times New Roman" w:eastAsia="Times New Roman" w:hAnsi="Times New Roman"/>
+                <w:sz w:val="15"/>
+                <w:szCs w:val="15"/>
+              </w:rPr>
+              <w:t>routes_clinical.cpp, routes_reports.cpp, routes_backup.cpp, ConsultationsPage.tsx, ReportsPage.tsx, BackupPage.tsx</w:t>
+            </w:r>
+          </w:p>
+        </w:tc>
+        <w:tc>
+          <w:tcPr>
+            <w:tcW w:type="dxa" w:w="900"/>
+            <w:tcBorders>
+              <w:top w:val="single" w:color="808080" w:sz="4"/>
+              <w:left w:val="single" w:color="808080" w:sz="4"/>
+              <w:bottom w:val="single" w:color="808080" w:sz="4"/>
+              <w:right w:val="single" w:color="808080" w:sz="4"/>
+            </w:tcBorders>
+            <w:tcMar>
+              <w:top w:type="dxa" w:w="50"/>
+              <w:left w:type="dxa" w:w="90"/>
+              <w:bottom w:type="dxa" w:w="50"/>
+              <w:right w:type="dxa" w:w="90"/>
+            </w:tcMar>
+            <w:vAlign w:val="top"/>
+          </w:tcPr>
+          <w:p>
+            <w:pPr>
+              <w:spacing w:after="30" w:line="240"/>
+              <w:jc w:val="left"/>
+            </w:pPr>
+            <w:r>
+              <w:rPr>
+                <w:rFonts w:ascii="Times New Roman" w:cs="Times New Roman" w:eastAsia="Times New Roman" w:hAnsi="Times New Roman"/>
+                <w:sz w:val="15"/>
+                <w:szCs w:val="15"/>
+              </w:rPr>
+              <w:t>UT-WEB</w:t>
+            </w:r>
+          </w:p>
+        </w:tc>
+        <w:tc>
+          <w:tcPr>
+            <w:tcW w:type="dxa" w:w="1496"/>
+            <w:tcBorders>
+              <w:top w:val="single" w:color="808080" w:sz="4"/>
+              <w:left w:val="single" w:color="808080" w:sz="4"/>
+              <w:bottom w:val="single" w:color="808080" w:sz="4"/>
+              <w:right w:val="single" w:color="808080" w:sz="4"/>
+            </w:tcBorders>
+            <w:tcMar>
+              <w:top w:type="dxa" w:w="50"/>
+              <w:left w:type="dxa" w:w="90"/>
+              <w:bottom w:type="dxa" w:w="50"/>
+              <w:right w:type="dxa" w:w="90"/>
+            </w:tcMar>
+            <w:vAlign w:val="top"/>
+          </w:tcPr>
+          <w:p>
+            <w:pPr>
+              <w:spacing w:after="30" w:line="240"/>
+              <w:jc w:val="left"/>
+            </w:pPr>
+            <w:r>
+              <w:rPr>
+                <w:rFonts w:ascii="Times New Roman" w:cs="Times New Roman" w:eastAsia="Times New Roman" w:hAnsi="Times New Roman"/>
+                <w:sz w:val="15"/>
+                <w:szCs w:val="15"/>
+              </w:rPr>
+              <w:t>TC-WEB-05</w:t>
+            </w:r>
+          </w:p>
+        </w:tc>
+      </w:tr>
+      <w:tr>
+        <w:trPr>
+          <w:cantSplit/>
+        </w:trPr>
+        <w:tc>
+          <w:tcPr>
+            <w:tcW w:type="dxa" w:w="450"/>
+            <w:tcBorders>
+              <w:top w:val="single" w:color="808080" w:sz="4"/>
+              <w:left w:val="single" w:color="808080" w:sz="4"/>
+              <w:bottom w:val="single" w:color="808080" w:sz="4"/>
+              <w:right w:val="single" w:color="808080" w:sz="4"/>
+            </w:tcBorders>
+            <w:tcMar>
+              <w:top w:type="dxa" w:w="50"/>
+              <w:left w:type="dxa" w:w="90"/>
+              <w:bottom w:type="dxa" w:w="50"/>
+              <w:right w:type="dxa" w:w="90"/>
+            </w:tcMar>
+            <w:vAlign w:val="top"/>
+          </w:tcPr>
+          <w:p>
+            <w:pPr>
+              <w:spacing w:after="30" w:line="240"/>
+              <w:jc w:val="left"/>
+            </w:pPr>
+            <w:r>
+              <w:rPr>
+                <w:rFonts w:ascii="Times New Roman" w:cs="Times New Roman" w:eastAsia="Times New Roman" w:hAnsi="Times New Roman"/>
+                <w:sz w:val="15"/>
+                <w:szCs w:val="15"/>
+              </w:rPr>
+              <w:t>55</w:t>
+            </w:r>
+          </w:p>
+        </w:tc>
+        <w:tc>
+          <w:tcPr>
+            <w:tcW w:type="dxa" w:w="1150"/>
+            <w:tcBorders>
+              <w:top w:val="single" w:color="808080" w:sz="4"/>
+              <w:left w:val="single" w:color="808080" w:sz="4"/>
+              <w:bottom w:val="single" w:color="808080" w:sz="4"/>
+              <w:right w:val="single" w:color="808080" w:sz="4"/>
+            </w:tcBorders>
+            <w:tcMar>
+              <w:top w:type="dxa" w:w="50"/>
+              <w:left w:type="dxa" w:w="90"/>
+              <w:bottom w:type="dxa" w:w="50"/>
+              <w:right w:type="dxa" w:w="90"/>
+            </w:tcMar>
+            <w:vAlign w:val="top"/>
+          </w:tcPr>
+          <w:p>
+            <w:pPr>
+              <w:spacing w:after="30" w:line="240"/>
+              <w:jc w:val="left"/>
+            </w:pPr>
+            <w:r>
+              <w:rPr>
+                <w:rFonts w:ascii="Times New Roman" w:cs="Times New Roman" w:eastAsia="Times New Roman" w:hAnsi="Times New Roman"/>
+                <w:b/>
+                <w:bCs/>
+                <w:sz w:val="15"/>
+                <w:szCs w:val="15"/>
+              </w:rPr>
+              <w:t>HMS-SEC-009</w:t>
+            </w:r>
+          </w:p>
+        </w:tc>
+        <w:tc>
+          <w:tcPr>
+            <w:tcW w:type="dxa" w:w="1650"/>
+            <w:tcBorders>
+              <w:top w:val="single" w:color="808080" w:sz="4"/>
+              <w:left w:val="single" w:color="808080" w:sz="4"/>
+              <w:bottom w:val="single" w:color="808080" w:sz="4"/>
+              <w:right w:val="single" w:color="808080" w:sz="4"/>
+            </w:tcBorders>
+            <w:tcMar>
+              <w:top w:type="dxa" w:w="50"/>
+              <w:left w:type="dxa" w:w="90"/>
+              <w:bottom w:type="dxa" w:w="50"/>
+              <w:right w:type="dxa" w:w="90"/>
+            </w:tcMar>
+            <w:vAlign w:val="top"/>
+          </w:tcPr>
+          <w:p>
+            <w:pPr>
+              <w:spacing w:after="30" w:line="240"/>
+              <w:jc w:val="left"/>
+            </w:pPr>
+            <w:r>
+              <w:rPr>
+                <w:rFonts w:ascii="Times New Roman" w:cs="Times New Roman" w:eastAsia="Times New Roman" w:hAnsi="Times New Roman"/>
+                <w:sz w:val="15"/>
+                <w:szCs w:val="15"/>
+              </w:rPr>
+              <w:t>Local-only server, random session tokens</w:t>
+            </w:r>
+          </w:p>
+        </w:tc>
+        <w:tc>
+          <w:tcPr>
+            <w:tcW w:type="dxa" w:w="850"/>
+            <w:tcBorders>
+              <w:top w:val="single" w:color="808080" w:sz="4"/>
+              <w:left w:val="single" w:color="808080" w:sz="4"/>
+              <w:bottom w:val="single" w:color="808080" w:sz="4"/>
+              <w:right w:val="single" w:color="808080" w:sz="4"/>
+            </w:tcBorders>
+            <w:tcMar>
+              <w:top w:type="dxa" w:w="50"/>
+              <w:left w:type="dxa" w:w="90"/>
+              <w:bottom w:type="dxa" w:w="50"/>
+              <w:right w:type="dxa" w:w="90"/>
+            </w:tcMar>
+            <w:vAlign w:val="top"/>
+          </w:tcPr>
+          <w:p>
+            <w:pPr>
+              <w:spacing w:after="30" w:line="240"/>
+              <w:jc w:val="left"/>
+            </w:pPr>
+            <w:r>
+              <w:rPr>
+                <w:rFonts w:ascii="Times New Roman" w:cs="Times New Roman" w:eastAsia="Times New Roman" w:hAnsi="Times New Roman"/>
+                <w:sz w:val="15"/>
+                <w:szCs w:val="15"/>
+              </w:rPr>
+              <w:t>C16, C11</w:t>
+            </w:r>
+          </w:p>
+        </w:tc>
+        <w:tc>
+          <w:tcPr>
+            <w:tcW w:type="dxa" w:w="1750"/>
+            <w:tcBorders>
+              <w:top w:val="single" w:color="808080" w:sz="4"/>
+              <w:left w:val="single" w:color="808080" w:sz="4"/>
+              <w:bottom w:val="single" w:color="808080" w:sz="4"/>
+              <w:right w:val="single" w:color="808080" w:sz="4"/>
+            </w:tcBorders>
+            <w:tcMar>
+              <w:top w:type="dxa" w:w="50"/>
+              <w:left w:type="dxa" w:w="90"/>
+              <w:bottom w:type="dxa" w:w="50"/>
+              <w:right w:type="dxa" w:w="90"/>
+            </w:tcMar>
+            <w:vAlign w:val="top"/>
+          </w:tcPr>
+          <w:p>
+            <w:pPr>
+              <w:spacing w:after="30" w:line="240"/>
+              <w:jc w:val="left"/>
+            </w:pPr>
+            <w:r>
+              <w:rPr>
+                <w:rFonts w:ascii="Times New Roman" w:cs="Times New Roman" w:eastAsia="Times New Roman" w:hAnsi="Times New Roman"/>
+                <w:sz w:val="15"/>
+                <w:szCs w:val="15"/>
+              </w:rPr>
+              <w:t>SAD 3.9</w:t>
+            </w:r>
+          </w:p>
+        </w:tc>
+        <w:tc>
+          <w:tcPr>
+            <w:tcW w:type="dxa" w:w="1500"/>
+            <w:tcBorders>
+              <w:top w:val="single" w:color="808080" w:sz="4"/>
+              <w:left w:val="single" w:color="808080" w:sz="4"/>
+              <w:bottom w:val="single" w:color="808080" w:sz="4"/>
+              <w:right w:val="single" w:color="808080" w:sz="4"/>
+            </w:tcBorders>
+            <w:tcMar>
+              <w:top w:type="dxa" w:w="50"/>
+              <w:left w:type="dxa" w:w="90"/>
+              <w:bottom w:type="dxa" w:w="50"/>
+              <w:right w:type="dxa" w:w="90"/>
+            </w:tcMar>
+            <w:vAlign w:val="top"/>
+          </w:tcPr>
+          <w:p>
+            <w:pPr>
+              <w:spacing w:after="30" w:line="240"/>
+              <w:jc w:val="left"/>
+            </w:pPr>
+            <w:r>
+              <w:rPr>
+                <w:rFonts w:ascii="Times New Roman" w:cs="Times New Roman" w:eastAsia="Times New Roman" w:hAnsi="Times New Roman"/>
+                <w:sz w:val="15"/>
+                <w:szCs w:val="15"/>
+              </w:rPr>
+              <w:t>main.cpp, api.cpp, session_manager.cpp</w:t>
+            </w:r>
+          </w:p>
+        </w:tc>
+        <w:tc>
+          <w:tcPr>
+            <w:tcW w:type="dxa" w:w="900"/>
+            <w:tcBorders>
+              <w:top w:val="single" w:color="808080" w:sz="4"/>
+              <w:left w:val="single" w:color="808080" w:sz="4"/>
+              <w:bottom w:val="single" w:color="808080" w:sz="4"/>
+              <w:right w:val="single" w:color="808080" w:sz="4"/>
+            </w:tcBorders>
+            <w:tcMar>
+              <w:top w:type="dxa" w:w="50"/>
+              <w:left w:type="dxa" w:w="90"/>
+              <w:bottom w:type="dxa" w:w="50"/>
+              <w:right w:type="dxa" w:w="90"/>
+            </w:tcMar>
+            <w:vAlign w:val="top"/>
+          </w:tcPr>
+          <w:p>
+            <w:pPr>
+              <w:spacing w:after="30" w:line="240"/>
+              <w:jc w:val="left"/>
+            </w:pPr>
+            <w:r>
+              <w:rPr>
+                <w:rFonts w:ascii="Times New Roman" w:cs="Times New Roman" w:eastAsia="Times New Roman" w:hAnsi="Times New Roman"/>
+                <w:sz w:val="15"/>
+                <w:szCs w:val="15"/>
+              </w:rPr>
+              <w:t>UT-SEC</w:t>
+            </w:r>
+          </w:p>
+        </w:tc>
+        <w:tc>
+          <w:tcPr>
+            <w:tcW w:type="dxa" w:w="1496"/>
+            <w:tcBorders>
+              <w:top w:val="single" w:color="808080" w:sz="4"/>
+              <w:left w:val="single" w:color="808080" w:sz="4"/>
+              <w:bottom w:val="single" w:color="808080" w:sz="4"/>
+              <w:right w:val="single" w:color="808080" w:sz="4"/>
+            </w:tcBorders>
+            <w:tcMar>
+              <w:top w:type="dxa" w:w="50"/>
+              <w:left w:type="dxa" w:w="90"/>
+              <w:bottom w:type="dxa" w:w="50"/>
+              <w:right w:type="dxa" w:w="90"/>
+            </w:tcMar>
+            <w:vAlign w:val="top"/>
+          </w:tcPr>
+          <w:p>
+            <w:pPr>
+              <w:spacing w:after="30" w:line="240"/>
+              <w:jc w:val="left"/>
+            </w:pPr>
+            <w:r>
+              <w:rPr>
+                <w:rFonts w:ascii="Times New Roman" w:cs="Times New Roman" w:eastAsia="Times New Roman" w:hAnsi="Times New Roman"/>
+                <w:sz w:val="15"/>
+                <w:szCs w:val="15"/>
+              </w:rPr>
+              <w:t>TC-SEC-07</w:t>
+            </w:r>
+          </w:p>
+        </w:tc>
+      </w:tr>
     </w:tbl>
     <w:sectPr>
       <w:headerReference w:type="default" r:id="rId7"/>
       <w:footerReference w:type="default" r:id="rId8"/>
+      <w:footerReference w:type="first" r:id="rId12"/>
+      <w:headerReference w:type="first" r:id="rId13"/>
       <w:pgSz w:w="11906" w:h="16838" w:orient="portrait"/>
       <w:pgMar w:top="1500" w:right="1080" w:bottom="1000" w:left="1080" w:header="400" w:footer="400" w:gutter="0"/>
       <w:pgNumType/>
@@ -45079,7 +47850,7 @@
         <w:sz w:val="16"/>
         <w:szCs w:val="16"/>
       </w:rPr>
-      <w:t xml:space="preserve">HMS — Software Requirements Specification v1.0 — Team 11</w:t>
+      <w:t>HMS — Software Requirements Specification v1.1 — Team 11</w:t>
     </w:r>
     <w:r>
       <w:rPr>
@@ -45123,6 +47894,16 @@
       <w:fldChar w:fldCharType="separate"/>
       <w:fldChar w:fldCharType="end"/>
     </w:r>
+  </w:p>
+</w:ftr>
+</file>
+
+<file path=word/footer2.xml><?xml version="1.0" encoding="utf-8"?>
+<w:ftr xmlns:m="http://schemas.openxmlformats.org/officeDocument/2006/math" xmlns:mc="http://schemas.openxmlformats.org/markup-compatibility/2006" xmlns:mo="http://schemas.microsoft.com/office/mac/office/2008/main" xmlns:mv="urn:schemas-microsoft-com:mac:vml" xmlns:o="urn:schemas-microsoft-com:office:office" xmlns:r="http://schemas.openxmlformats.org/officeDocument/2006/relationships" xmlns:v="urn:schemas-microsoft-com:vml" xmlns:w10="urn:schemas-microsoft-com:office:word" xmlns:w14="http://schemas.microsoft.com/office/word/2010/wordml" xmlns:w="http://schemas.openxmlformats.org/wordprocessingml/2006/main" xmlns:wne="http://schemas.microsoft.com/office/word/2006/wordml" xmlns:wp14="http://schemas.microsoft.com/office/word/2010/wordprocessingDrawing" xmlns:wp="http://schemas.openxmlformats.org/drawingml/2006/wordprocessingDrawing" xmlns:wpc="http://schemas.microsoft.com/office/word/2010/wordprocessingCanvas" xmlns:wpg="http://schemas.microsoft.com/office/word/2010/wordprocessingGroup" xmlns:wpi="http://schemas.microsoft.com/office/word/2010/wordprocessingInk" xmlns:wps="http://schemas.microsoft.com/office/word/2010/wordprocessingShape" mc:Ignorable="w14 wp14">
+  <w:p>
+    <w:pPr>
+      <w:pStyle w:val="Footer"/>
+    </w:pPr>
   </w:p>
 </w:ftr>
 </file>
@@ -45244,6 +48025,16 @@
       </w:rPr>
       <w:t xml:space="preserve">Department of Computer Science and Engineering</w:t>
     </w:r>
+  </w:p>
+</w:hdr>
+</file>
+
+<file path=word/header2.xml><?xml version="1.0" encoding="utf-8"?>
+<w:hdr xmlns:m="http://schemas.openxmlformats.org/officeDocument/2006/math" xmlns:mc="http://schemas.openxmlformats.org/markup-compatibility/2006" xmlns:mo="http://schemas.microsoft.com/office/mac/office/2008/main" xmlns:mv="urn:schemas-microsoft-com:mac:vml" xmlns:o="urn:schemas-microsoft-com:office:office" xmlns:r="http://schemas.openxmlformats.org/officeDocument/2006/relationships" xmlns:v="urn:schemas-microsoft-com:vml" xmlns:w10="urn:schemas-microsoft-com:office:word" xmlns:w14="http://schemas.microsoft.com/office/word/2010/wordml" xmlns:w="http://schemas.openxmlformats.org/wordprocessingml/2006/main" xmlns:wne="http://schemas.microsoft.com/office/word/2006/wordml" xmlns:wp14="http://schemas.microsoft.com/office/word/2010/wordprocessingDrawing" xmlns:wp="http://schemas.openxmlformats.org/drawingml/2006/wordprocessingDrawing" xmlns:wpc="http://schemas.microsoft.com/office/word/2010/wordprocessingCanvas" xmlns:wpg="http://schemas.microsoft.com/office/word/2010/wordprocessingGroup" xmlns:wpi="http://schemas.microsoft.com/office/word/2010/wordprocessingInk" xmlns:wps="http://schemas.microsoft.com/office/word/2010/wordprocessingShape" mc:Ignorable="w14 wp14">
+  <w:p>
+    <w:pPr>
+      <w:pStyle w:val="Header"/>
+    </w:pPr>
   </w:p>
 </w:hdr>
 </file>

</xml_diff>

<commit_message>
DOCS: SRS, SAD and Test Plan v1.1 for the web interface (#98)
</commit_message>
<xml_diff>
--- a/docs/HMS_SRS.docx
+++ b/docs/HMS_SRS.docx
@@ -50,7 +50,7 @@
           <w:sz w:val="24"/>
           <w:szCs w:val="24"/>
         </w:rPr>
-        <w:t xml:space="preserve">Version 1.0 approved</w:t>
+        <w:t>Version 1.1 approved (web user interface)</w:t>
       </w:r>
     </w:p>
     <w:p>
@@ -188,7 +188,7 @@
           <w:sz w:val="24"/>
           <w:szCs w:val="24"/>
         </w:rPr>
-        <w:t xml:space="preserve">07-10-2026</w:t>
+        <w:t>26-10-2026</w:t>
       </w:r>
     </w:p>
     <w:p>
@@ -621,6 +621,21 @@
     <w:p>
       <w:pPr>
         <w:spacing w:after="30" w:before="0" w:line="264"/>
+        <w:ind w:left="400"/>
+        <w:jc w:val="left"/>
+      </w:pPr>
+      <w:r>
+        <w:rPr>
+          <w:rFonts w:ascii="Times New Roman" w:cs="Times New Roman" w:eastAsia="Times New Roman" w:hAnsi="Times New Roman"/>
+          <w:sz w:val="23"/>
+          <w:szCs w:val="23"/>
+        </w:rPr>
+        <w:t>5.5 Web User Interface</w:t>
+      </w:r>
+    </w:p>
+    <w:p>
+      <w:pPr>
+        <w:spacing w:after="30" w:before="0" w:line="264"/>
         <w:jc w:val="left"/>
       </w:pPr>
       <w:r>
@@ -1219,6 +1234,139 @@
           </w:p>
         </w:tc>
       </w:tr>
+      <w:tr>
+        <w:trPr>
+          <w:cantSplit/>
+        </w:trPr>
+        <w:tc>
+          <w:tcPr>
+            <w:tcW w:type="dxa" w:w="2700"/>
+            <w:tcBorders>
+              <w:top w:val="single" w:color="808080" w:sz="4"/>
+              <w:left w:val="single" w:color="808080" w:sz="4"/>
+              <w:bottom w:val="single" w:color="808080" w:sz="4"/>
+              <w:right w:val="single" w:color="808080" w:sz="4"/>
+            </w:tcBorders>
+            <w:tcMar>
+              <w:top w:type="dxa" w:w="50"/>
+              <w:left w:type="dxa" w:w="90"/>
+              <w:bottom w:type="dxa" w:w="50"/>
+              <w:right w:type="dxa" w:w="90"/>
+            </w:tcMar>
+            <w:vAlign w:val="top"/>
+          </w:tcPr>
+          <w:p>
+            <w:pPr>
+              <w:spacing w:after="30" w:line="240"/>
+              <w:jc w:val="left"/>
+            </w:pPr>
+            <w:r>
+              <w:rPr>
+                <w:rFonts w:ascii="Times New Roman" w:cs="Times New Roman" w:eastAsia="Times New Roman" w:hAnsi="Times New Roman"/>
+                <w:sz w:val="20"/>
+                <w:szCs w:val="20"/>
+              </w:rPr>
+              <w:t>Team 11</w:t>
+            </w:r>
+          </w:p>
+        </w:tc>
+        <w:tc>
+          <w:tcPr>
+            <w:tcW w:type="dxa" w:w="1500"/>
+            <w:tcBorders>
+              <w:top w:val="single" w:color="808080" w:sz="4"/>
+              <w:left w:val="single" w:color="808080" w:sz="4"/>
+              <w:bottom w:val="single" w:color="808080" w:sz="4"/>
+              <w:right w:val="single" w:color="808080" w:sz="4"/>
+            </w:tcBorders>
+            <w:tcMar>
+              <w:top w:type="dxa" w:w="50"/>
+              <w:left w:type="dxa" w:w="90"/>
+              <w:bottom w:type="dxa" w:w="50"/>
+              <w:right w:type="dxa" w:w="90"/>
+            </w:tcMar>
+            <w:vAlign w:val="top"/>
+          </w:tcPr>
+          <w:p>
+            <w:pPr>
+              <w:spacing w:after="30" w:line="240"/>
+              <w:jc w:val="left"/>
+            </w:pPr>
+            <w:r>
+              <w:rPr>
+                <w:rFonts w:ascii="Times New Roman" w:cs="Times New Roman" w:eastAsia="Times New Roman" w:hAnsi="Times New Roman"/>
+                <w:sz w:val="20"/>
+                <w:szCs w:val="20"/>
+              </w:rPr>
+              <w:t>26-10-2026</w:t>
+            </w:r>
+          </w:p>
+        </w:tc>
+        <w:tc>
+          <w:tcPr>
+            <w:tcW w:type="dxa" w:w="4200"/>
+            <w:tcBorders>
+              <w:top w:val="single" w:color="808080" w:sz="4"/>
+              <w:left w:val="single" w:color="808080" w:sz="4"/>
+              <w:bottom w:val="single" w:color="808080" w:sz="4"/>
+              <w:right w:val="single" w:color="808080" w:sz="4"/>
+            </w:tcBorders>
+            <w:tcMar>
+              <w:top w:type="dxa" w:w="50"/>
+              <w:left w:type="dxa" w:w="90"/>
+              <w:bottom w:type="dxa" w:w="50"/>
+              <w:right w:type="dxa" w:w="90"/>
+            </w:tcMar>
+            <w:vAlign w:val="top"/>
+          </w:tcPr>
+          <w:p>
+            <w:pPr>
+              <w:spacing w:after="30" w:line="240"/>
+              <w:jc w:val="left"/>
+            </w:pPr>
+            <w:r>
+              <w:rPr>
+                <w:rFonts w:ascii="Times New Roman" w:cs="Times New Roman" w:eastAsia="Times New Roman" w:hAnsi="Times New Roman"/>
+                <w:sz w:val="20"/>
+                <w:szCs w:val="20"/>
+              </w:rPr>
+              <w:t>Web user interface: React + TypeScript website served by the C++ program on the same computer; console interface removed. Added HMS-F-070 to F-074 (Section 5.5) and HMS-SEC-009; updated Sections 1.3, 2.1, 2.3–2.6, 3.1–3.4, 4.2, 6.3, 6.4, 7 and Appendix C</w:t>
+            </w:r>
+          </w:p>
+        </w:tc>
+        <w:tc>
+          <w:tcPr>
+            <w:tcW w:type="dxa" w:w="1346"/>
+            <w:tcBorders>
+              <w:top w:val="single" w:color="808080" w:sz="4"/>
+              <w:left w:val="single" w:color="808080" w:sz="4"/>
+              <w:bottom w:val="single" w:color="808080" w:sz="4"/>
+              <w:right w:val="single" w:color="808080" w:sz="4"/>
+            </w:tcBorders>
+            <w:tcMar>
+              <w:top w:type="dxa" w:w="50"/>
+              <w:left w:type="dxa" w:w="90"/>
+              <w:bottom w:type="dxa" w:w="50"/>
+              <w:right w:type="dxa" w:w="90"/>
+            </w:tcMar>
+            <w:vAlign w:val="top"/>
+          </w:tcPr>
+          <w:p>
+            <w:pPr>
+              <w:spacing w:after="30" w:line="240"/>
+              <w:jc w:val="left"/>
+            </w:pPr>
+            <w:r>
+              <w:rPr>
+                <w:rFonts w:ascii="Times New Roman" w:cs="Times New Roman" w:eastAsia="Times New Roman" w:hAnsi="Times New Roman"/>
+                <w:sz w:val="20"/>
+                <w:szCs w:val="20"/>
+              </w:rPr>
+              <w:t>1.1</w:t>
+            </w:r>
+          </w:p>
+        </w:tc>
+      </w:tr>
     </w:tbl>
     <w:p>
       <w:pPr>
@@ -1256,25 +1404,7 @@
           <w:sz w:val="23"/>
           <w:szCs w:val="23"/>
         </w:rPr>
-        <w:t xml:space="preserve">This document specifies the software requirements of the </w:t>
-      </w:r>
-      <w:r>
-        <w:rPr>
-          <w:rFonts w:ascii="Times New Roman" w:cs="Times New Roman" w:eastAsia="Times New Roman" w:hAnsi="Times New Roman"/>
-          <w:b/>
-          <w:bCs/>
-          <w:sz w:val="23"/>
-          <w:szCs w:val="23"/>
-        </w:rPr>
-        <w:t xml:space="preserve">Hospital Management System (HMS), release 1.0</w:t>
-      </w:r>
-      <w:r>
-        <w:rPr>
-          <w:rFonts w:ascii="Times New Roman" w:cs="Times New Roman" w:eastAsia="Times New Roman" w:hAnsi="Times New Roman"/>
-          <w:sz w:val="23"/>
-          <w:szCs w:val="23"/>
-        </w:rPr>
-        <w:t xml:space="preserve">, a patient-record and appointment-management application for the out-patient department (OPD) of a hospital. It is written to the IEEE 830 / ISO/IEC/IEEE 29148 structure supplied as the course template. The SRS covers the complete HMS 1.0 product; no part of it is delegated to another subsystem.</w:t>
+        <w:t>This document specifies the software requirements of the Hospital Management System (HMS), release 1.1, a patient-record and appointment-management application for the out-patient department (OPD) of a hospital. It is written to the IEEE 830 / ISO/IEC/IEEE 29148 structure supplied as the course template. The SRS covers the complete HMS 1.1 product; no part of it is delegated to another subsystem.</w:t>
       </w:r>
     </w:p>
     <w:p>
@@ -1814,25 +1944,7 @@
           <w:sz w:val="23"/>
           <w:szCs w:val="23"/>
         </w:rPr>
-        <w:t xml:space="preserve">HMS is a stand-alone, menu-driven console application written in C++17. It lets hospital staff </w:t>
-      </w:r>
-      <w:r>
-        <w:rPr>
-          <w:rFonts w:ascii="Times New Roman" w:cs="Times New Roman" w:eastAsia="Times New Roman" w:hAnsi="Times New Roman"/>
-          <w:b/>
-          <w:bCs/>
-          <w:sz w:val="23"/>
-          <w:szCs w:val="23"/>
-        </w:rPr>
-        <w:t xml:space="preserve">register and find patients, manage doctors and their weekly availability, book, cancel and reschedule appointments, record consultations (diagnosis and prescription), produce daily reports, and back up the data</w:t>
-      </w:r>
-      <w:r>
-        <w:rPr>
-          <w:rFonts w:ascii="Times New Roman" w:cs="Times New Roman" w:eastAsia="Times New Roman" w:hAnsi="Times New Roman"/>
-          <w:sz w:val="23"/>
-          <w:szCs w:val="23"/>
-        </w:rPr>
-        <w:t xml:space="preserve">. Three kinds of staff use it: Administrator, Receptionist and Doctor.</w:t>
+        <w:t>HMS is a stand-alone application for one hospital computer: a C++17 program holds all data and rules, and staff use it through a website (React + TypeScript) that opens in the web browser of the same computer. It lets hospital staff register and find patients, manage doctors and their weekly availability, book, cancel and reschedule appointments, record consultations (diagnosis and prescription), produce daily reports, and back up the data. Three kinds of staff use it: Administrator, Receptionist and Doctor.</w:t>
       </w:r>
     </w:p>
     <w:p>
@@ -1920,7 +2032,7 @@
           <w:sz w:val="23"/>
           <w:szCs w:val="23"/>
         </w:rPr>
-        <w:t xml:space="preserve">Run on an ordinary hospital desktop (4 GB RAM) with no database server and no network.</w:t>
+        <w:t>Run on an ordinary hospital desktop (4 GB RAM) with no database server and no network connection (the website is served only to the same computer).</w:t>
       </w:r>
     </w:p>
     <w:p>
@@ -1936,15 +2048,7 @@
           <w:sz w:val="23"/>
           <w:szCs w:val="23"/>
         </w:rPr>
-        <w:t xml:space="preserve">Out of scope for release 1.0:</w:t>
-      </w:r>
-      <w:r>
-        <w:rPr>
-          <w:rFonts w:ascii="Times New Roman" w:cs="Times New Roman" w:eastAsia="Times New Roman" w:hAnsi="Times New Roman"/>
-          <w:sz w:val="23"/>
-          <w:szCs w:val="23"/>
-        </w:rPr>
-        <w:t xml:space="preserve"> billing and insurance, pharmacy and laboratory modules, in-patient (ward / bed) management, patient self-service portal, multi-terminal network operation, and integration with national health-record systems.</w:t>
+        <w:t>Out of scope for release 1.1: billing and insurance, pharmacy and laboratory modules, in-patient (ward / bed) management, patient self-service portal, multi-terminal network operation, and integration with national health-record systems.</w:t>
       </w:r>
     </w:p>
     <w:p>
@@ -2160,25 +2264,7 @@
           <w:sz w:val="23"/>
           <w:szCs w:val="23"/>
         </w:rPr>
-        <w:t xml:space="preserve">Team 11, </w:t>
-      </w:r>
-      <w:r>
-        <w:rPr>
-          <w:rFonts w:ascii="Times New Roman" w:cs="Times New Roman" w:eastAsia="Times New Roman" w:hAnsi="Times New Roman"/>
-          <w:i/>
-          <w:iCs/>
-          <w:sz w:val="23"/>
-          <w:szCs w:val="23"/>
-        </w:rPr>
-        <w:t xml:space="preserve">Software Architecture and Design Specification (SAD) v1.0</w:t>
-      </w:r>
-      <w:r>
-        <w:rPr>
-          <w:rFonts w:ascii="Times New Roman" w:cs="Times New Roman" w:eastAsia="Times New Roman" w:hAnsi="Times New Roman"/>
-          <w:sz w:val="23"/>
-          <w:szCs w:val="23"/>
-        </w:rPr>
-        <w:t xml:space="preserve">, 07-10-2026 (companion document).</w:t>
+        <w:t>Team 11, Software Architecture and Design Specification (SAD) v1.1, 26-10-2026 (companion document).</w:t>
       </w:r>
     </w:p>
     <w:p>
@@ -2196,25 +2282,7 @@
           <w:sz w:val="23"/>
           <w:szCs w:val="23"/>
         </w:rPr>
-        <w:t xml:space="preserve">Team 11, </w:t>
-      </w:r>
-      <w:r>
-        <w:rPr>
-          <w:rFonts w:ascii="Times New Roman" w:cs="Times New Roman" w:eastAsia="Times New Roman" w:hAnsi="Times New Roman"/>
-          <w:i/>
-          <w:iCs/>
-          <w:sz w:val="23"/>
-          <w:szCs w:val="23"/>
-        </w:rPr>
-        <w:t xml:space="preserve">Software Test Plan (STP) v1.0</w:t>
-      </w:r>
-      <w:r>
-        <w:rPr>
-          <w:rFonts w:ascii="Times New Roman" w:cs="Times New Roman" w:eastAsia="Times New Roman" w:hAnsi="Times New Roman"/>
-          <w:sz w:val="23"/>
-          <w:szCs w:val="23"/>
-        </w:rPr>
-        <w:t xml:space="preserve">, 07-10-2026 (companion document).</w:t>
+        <w:t>Team 11, Software Test Plan (STP) v1.1, 26-10-2026 (companion document).</w:t>
       </w:r>
     </w:p>
     <w:p>
@@ -2549,7 +2617,7 @@
           <w:sz w:val="23"/>
           <w:szCs w:val="23"/>
         </w:rPr>
-        <w:t xml:space="preserve">HMS is a new, self-contained product; it does not replace or interface with an existing software system (the current process is paper registers). It runs as a single process on one computer in the OPD. All data are kept in files on the local disk; the application therefore has no server, no network interface and no external software dependencies other than the C++ standard library (and, optionally, a SHA-256 routine from OpenSSL libcrypto or a bundled public-domain implementation).</w:t>
+        <w:t>HMS is a new, self-contained product; it does not replace or interface with an existing software system (the current process is paper registers). It runs as a single server process on one computer in the OPD, and staff use it through a web browser on that computer. All data are kept in files on the local disk; the application therefore has no server, no network interface and no external software dependencies other than the C++ standard library (and, optionally, a SHA-256 routine from OpenSSL libcrypto or a bundled public-domain implementation).</w:t>
       </w:r>
     </w:p>
     <w:tbl>
@@ -2712,7 +2780,7 @@
                 <w:sz w:val="20"/>
                 <w:szCs w:val="20"/>
               </w:rPr>
-              <w:t xml:space="preserve">Interact through the keyboard and the text console (Section 3.1).</w:t>
+              <w:t>Interact through a website in the web browser of the HMS computer, with mouse and keyboard (Section 3.1).</w:t>
             </w:r>
           </w:p>
         </w:tc>
@@ -2881,7 +2949,7 @@
           <w:sz w:val="23"/>
           <w:szCs w:val="23"/>
         </w:rPr>
-        <w:t xml:space="preserve">Internally the system is organised in layers (presentation, services, security services, data access, files); this is detailed in the SAD.</w:t>
+        <w:t>Internally the system is organised in layers (presentation = website in the browser, local web API, services, security services, data access, files); this is detailed in the SAD.</w:t>
       </w:r>
     </w:p>
     <w:p>
@@ -3544,7 +3612,7 @@
                 <w:sz w:val="19"/>
                 <w:szCs w:val="19"/>
               </w:rPr>
-              <w:t xml:space="preserve">Front-desk staff. Registers and searches patients, books / cancels / reschedules appointments, generates the daily appointment report. Needs speed and simple menus. Must not see clinical data.</w:t>
+              <w:t>Front-desk staff. Registers and searches patients, books / cancels / reschedules appointments, generates the daily appointment report. Needs speed and simple pages. Must not see clinical data.</w:t>
             </w:r>
           </w:p>
         </w:tc>
@@ -3861,15 +3929,7 @@
           <w:sz w:val="23"/>
           <w:szCs w:val="23"/>
         </w:rPr>
-        <w:t xml:space="preserve">Hardware:</w:t>
-      </w:r>
-      <w:r>
-        <w:rPr>
-          <w:rFonts w:ascii="Times New Roman" w:cs="Times New Roman" w:eastAsia="Times New Roman" w:hAnsi="Times New Roman"/>
-          <w:sz w:val="23"/>
-          <w:szCs w:val="23"/>
-        </w:rPr>
-        <w:t xml:space="preserve"> desktop or laptop PC, dual-core 2.0 GHz CPU or better, 4 GB RAM, 500 MB free disk space, keyboard and monitor.</w:t>
+        <w:t>Hardware: desktop or laptop PC, dual-core 2.0 GHz CPU or better, 4 GB RAM, 500 MB free disk space, keyboard, mouse and monitor (1280 × 720 or larger).</w:t>
       </w:r>
     </w:p>
     <w:p>
@@ -3917,15 +3977,27 @@
           <w:sz w:val="23"/>
           <w:szCs w:val="23"/>
         </w:rPr>
-        <w:t xml:space="preserve">Build and run-time software:</w:t>
+        <w:t>Build and run-time software: g++ 11 or later (C++17) or MSVC 2019, CMake 3.25 or later; Node.js 18 or later and npm (only to build the website); a current web browser (Chrome, Edge or Firefox) to use HMS.</w:t>
       </w:r>
+    </w:p>
+    <w:p>
+      <w:pPr>
+        <w:pStyle w:val="ListParagraph"/>
+        <w:numPr>
+          <w:ilvl w:val="0"/>
+          <w:numId w:val="2"/>
+        </w:numPr>
+        <w:spacing w:after="60" w:line="260"/>
+      </w:pPr>
       <w:r>
         <w:rPr>
           <w:rFonts w:ascii="Times New Roman" w:cs="Times New Roman" w:eastAsia="Times New Roman" w:hAnsi="Times New Roman"/>
+          <w:b/>
+          <w:bCs/>
           <w:sz w:val="23"/>
           <w:szCs w:val="23"/>
         </w:rPr>
-        <w:t xml:space="preserve"> g++ 11 or later (C++17) or MSVC 2019, CMake 3.20 or later; a console / terminal with UTF-8 support.</w:t>
+        <w:t>Network: none needed at run time. The HMS server listens only on 127.0.0.1 (this computer), port 8080 by default (HMS-SEC-009).</w:t>
       </w:r>
     </w:p>
     <w:p>
@@ -3994,6 +4066,26 @@
           <w:szCs w:val="23"/>
         </w:rPr>
         <w:t xml:space="preserve"> C / C++ is mandated by the problem statement; the team uses C++17.</w:t>
+      </w:r>
+    </w:p>
+    <w:p>
+      <w:pPr>
+        <w:pStyle w:val="ListParagraph"/>
+        <w:numPr>
+          <w:ilvl w:val="0"/>
+          <w:numId w:val="2"/>
+        </w:numPr>
+        <w:spacing w:after="60" w:line="260"/>
+      </w:pPr>
+      <w:r>
+        <w:rPr>
+          <w:rFonts w:ascii="Times New Roman" w:cs="Times New Roman" w:eastAsia="Times New Roman" w:hAnsi="Times New Roman"/>
+          <w:b/>
+          <w:bCs/>
+          <w:sz w:val="23"/>
+          <w:szCs w:val="23"/>
+        </w:rPr>
+        <w:t>User interface: a website written in TypeScript with React 18 (Vite build, Mantine components), served by the C++ program. All business rules, validation, access control and storage stay in C++; the website only displays data and sends the user's input.</w:t>
       </w:r>
     </w:p>
     <w:p>
@@ -4097,15 +4189,7 @@
           <w:sz w:val="23"/>
           <w:szCs w:val="23"/>
         </w:rPr>
-        <w:t xml:space="preserve">Build and quality tools:</w:t>
-      </w:r>
-      <w:r>
-        <w:rPr>
-          <w:rFonts w:ascii="Times New Roman" w:cs="Times New Roman" w:eastAsia="Times New Roman" w:hAnsi="Times New Roman"/>
-          <w:sz w:val="23"/>
-          <w:szCs w:val="23"/>
-        </w:rPr>
-        <w:t xml:space="preserve"> CMake, GoogleTest, gcov / lcov, cppcheck, Valgrind / AddressSanitizer, Git (course repository).</w:t>
+        <w:t>Build and quality tools: CMake, GoogleTest, npm, Vitest, TypeScript compiler, gcov / lcov, cppcheck, Valgrind / AddressSanitizer, Git (course repository).</w:t>
       </w:r>
     </w:p>
     <w:p>
@@ -4191,7 +4275,7 @@
           <w:sz w:val="23"/>
           <w:szCs w:val="23"/>
         </w:rPr>
-        <w:t xml:space="preserve">The hospital OPD is a single site with one HMS installation; one user works at a time (no concurrent multi-terminal use).</w:t>
+        <w:t>The hospital OPD is a single site with one HMS installation; one user works at a time (one browser window at a time; no multi-computer use).</w:t>
       </w:r>
     </w:p>
     <w:p>
@@ -4245,7 +4329,7 @@
           <w:sz w:val="23"/>
           <w:szCs w:val="23"/>
         </w:rPr>
-        <w:t xml:space="preserve">Users are trained staff who can read English; all screens are in English.</w:t>
+        <w:t>Users are trained staff who can read English; all pages are in English.</w:t>
       </w:r>
     </w:p>
     <w:p>
@@ -4286,6 +4370,24 @@
     </w:p>
     <w:p>
       <w:pPr>
+        <w:pStyle w:val="ListParagraph"/>
+        <w:numPr>
+          <w:ilvl w:val="0"/>
+          <w:numId w:val="2"/>
+        </w:numPr>
+        <w:spacing w:after="60" w:line="260"/>
+      </w:pPr>
+      <w:r>
+        <w:rPr>
+          <w:rFonts w:ascii="Times New Roman" w:cs="Times New Roman" w:eastAsia="Times New Roman" w:hAnsi="Times New Roman"/>
+          <w:sz w:val="23"/>
+          <w:szCs w:val="23"/>
+        </w:rPr>
+        <w:t>Node.js is needed only by developers to build the website; hospital users need only a web browser.</w:t>
+      </w:r>
+    </w:p>
+    <w:p>
+      <w:pPr>
         <w:pStyle w:val="Heading1"/>
         <w:keepNext/>
         <w:pageBreakBefore/>
@@ -4320,7 +4422,7 @@
           <w:sz w:val="23"/>
           <w:szCs w:val="23"/>
         </w:rPr>
-        <w:t xml:space="preserve">HMS has a text-mode (console) user interface. Details will be refined in the SAD (section 4.5). The following conventions apply to every screen:</w:t>
+        <w:t>HMS has a web user interface that runs in the web browser of the HMS computer (http://localhost:8080). Details are in the SAD (section 4.5). The following conventions apply to every page:</w:t>
       </w:r>
     </w:p>
     <w:p>
@@ -4338,7 +4440,7 @@
           <w:sz w:val="23"/>
           <w:szCs w:val="23"/>
         </w:rPr>
-        <w:t xml:space="preserve">The top line shows "HMS — Hospital Management System", the logged-in username and role, and the current date and time.</w:t>
+        <w:t>A header shows "HMS — Hospital Management System", the logged-in username and role, a light / dark switch and a Log out button.</w:t>
       </w:r>
     </w:p>
     <w:p>
@@ -4356,7 +4458,7 @@
           <w:sz w:val="23"/>
           <w:szCs w:val="23"/>
         </w:rPr>
-        <w:t xml:space="preserve">Choices are numbered; "0" always means Back / Exit; invalid choices re-display the menu with an error line.</w:t>
+        <w:t>A sidebar lists only the pages the user's role may use (HMS-F-003); every form has a Save (or action) button and a Cancel button.</w:t>
       </w:r>
     </w:p>
     <w:p>
@@ -4374,7 +4476,7 @@
           <w:sz w:val="23"/>
           <w:szCs w:val="23"/>
         </w:rPr>
-        <w:t xml:space="preserve">Errors are displayed as "ERROR Exxx: message" on one line, naming the field and the rule (error catalogue: SAD 4.4).</w:t>
+        <w:t>Errors are shown next to the form as "Exxx: message", naming the field and the rule (error catalogue: SAD 4.4).</w:t>
       </w:r>
     </w:p>
     <w:p>
@@ -4392,7 +4494,7 @@
           <w:sz w:val="23"/>
           <w:szCs w:val="23"/>
         </w:rPr>
-        <w:t xml:space="preserve">Successful operations end with a one-line confirmation containing the generated ID.</w:t>
+        <w:t>Successful operations show a green confirmation message containing the generated ID.</w:t>
       </w:r>
     </w:p>
     <w:p>
@@ -4410,7 +4512,7 @@
           <w:sz w:val="23"/>
           <w:szCs w:val="23"/>
         </w:rPr>
-        <w:t xml:space="preserve">Passwords are typed without echo (HMS-SEC-004). Destructive or irreversible actions (restore backup, deactivate patient) ask "Confirm (Y/N)?".</w:t>
+        <w:t>Passwords are typed in masked password fields (HMS-SEC-004). Destructive or irreversible actions (restore backup, deactivate patient, cancel appointment) ask for confirmation in a dialog with Yes / No buttons.</w:t>
       </w:r>
     </w:p>
     <w:p>
@@ -4428,7 +4530,7 @@
           <w:sz w:val="23"/>
           <w:szCs w:val="23"/>
         </w:rPr>
-        <w:t xml:space="preserve">Lists show at most 20 rows per page with "N = next page, P = previous page".</w:t>
+        <w:t>Lists show at most 20 rows per page with Previous / Next buttons.</w:t>
       </w:r>
     </w:p>
     <w:p>
@@ -4445,7 +4547,7 @@
           <w:sz w:val="23"/>
           <w:szCs w:val="23"/>
         </w:rPr>
-        <w:t xml:space="preserve">Sample screen (Receptionist main menu)</w:t>
+        <w:t>Sample page (Receptionist dashboard, simplified)</w:t>
       </w:r>
     </w:p>
     <w:tbl>
@@ -4495,7 +4597,7 @@
                 <w:sz w:val="16"/>
                 <w:szCs w:val="16"/>
               </w:rPr>
-              <w:t xml:space="preserve">HMS — Hospital Management System     rec01 (Receptionist)   2026-10-12 09:41</w:t>
+              <w:t>[HMS] Hospital Management System                rec01  [Receptionist]  [dark mode]  [Log out]</w:t>
             </w:r>
           </w:p>
           <w:p>
@@ -4509,7 +4611,7 @@
                 <w:sz w:val="16"/>
                 <w:szCs w:val="16"/>
               </w:rPr>
-              <w:t xml:space="preserve">--------------------------------------------------------------------------</w:t>
+              <w:t>-----------------------------------------------------------------------------------------------</w:t>
             </w:r>
           </w:p>
           <w:p>
@@ -4523,7 +4625,7 @@
                 <w:sz w:val="16"/>
                 <w:szCs w:val="16"/>
               </w:rPr>
-              <w:t xml:space="preserve">  1. Register patient          5. Cancel / reschedule appointment</w:t>
+              <w:t xml:space="preserve"> Dashboard           | Welcome, rec01                         Receptionist · 2026-10-26</w:t>
             </w:r>
           </w:p>
           <w:p>
@@ -4537,7 +4639,7 @@
                 <w:sz w:val="16"/>
                 <w:szCs w:val="16"/>
               </w:rPr>
-              <w:t xml:space="preserve">  2. Search patient            6. View doctor schedule</w:t>
+              <w:t xml:space="preserve"> Patients            | [Appointments today 12] [Scheduled 9] [Completed 2] [No-show 1]</w:t>
             </w:r>
           </w:p>
           <w:p>
@@ -4551,7 +4653,7 @@
                 <w:sz w:val="16"/>
                 <w:szCs w:val="16"/>
               </w:rPr>
-              <w:t xml:space="preserve">  3. Update patient details    7. Daily appointment report</w:t>
+              <w:t xml:space="preserve"> Doctors             |</w:t>
             </w:r>
           </w:p>
           <w:p>
@@ -4565,7 +4667,7 @@
                 <w:sz w:val="16"/>
                 <w:szCs w:val="16"/>
               </w:rPr>
-              <w:t xml:space="preserve">  4. Book appointment          8. Change password</w:t>
+              <w:t xml:space="preserve"> Appointments        | [Patients]  [Doctors]  [Appointments]</w:t>
             </w:r>
           </w:p>
           <w:p>
@@ -4579,7 +4681,7 @@
                 <w:sz w:val="16"/>
                 <w:szCs w:val="16"/>
               </w:rPr>
-              <w:t xml:space="preserve">  0. Log out</w:t>
+              <w:t xml:space="preserve"> Doctor schedules    | [Doctor schedules]  [Reports]  [Change my password]</w:t>
             </w:r>
           </w:p>
           <w:p>
@@ -4593,7 +4695,21 @@
                 <w:sz w:val="16"/>
                 <w:szCs w:val="16"/>
               </w:rPr>
-              <w:t xml:space="preserve">Enter choice: _</w:t>
+              <w:t xml:space="preserve"> Reports             |</w:t>
+            </w:r>
+          </w:p>
+          <w:p>
+            <w:pPr>
+              <w:spacing w:after="30" w:line="240"/>
+              <w:jc w:val="left"/>
+            </w:pPr>
+            <w:r>
+              <w:rPr>
+                <w:rFonts w:ascii="Consolas" w:cs="Consolas" w:eastAsia="Consolas" w:hAnsi="Consolas"/>
+                <w:sz w:val="16"/>
+                <w:szCs w:val="16"/>
+              </w:rPr>
+              <w:t xml:space="preserve"> Change my password  |</w:t>
             </w:r>
           </w:p>
         </w:tc>
@@ -5139,6 +5255,309 @@
                 <w:szCs w:val="19"/>
               </w:rPr>
               <w:t xml:space="preserve">Unit-test framework; not part of the delivered binary.</w:t>
+            </w:r>
+          </w:p>
+        </w:tc>
+      </w:tr>
+      <w:tr>
+        <w:trPr>
+          <w:cantSplit/>
+        </w:trPr>
+        <w:tc>
+          <w:tcPr>
+            <w:tcW w:type="dxa" w:w="2300"/>
+            <w:tcBorders>
+              <w:top w:val="single" w:color="808080" w:sz="4"/>
+              <w:left w:val="single" w:color="808080" w:sz="4"/>
+              <w:bottom w:val="single" w:color="808080" w:sz="4"/>
+              <w:right w:val="single" w:color="808080" w:sz="4"/>
+            </w:tcBorders>
+            <w:tcMar>
+              <w:top w:type="dxa" w:w="50"/>
+              <w:left w:type="dxa" w:w="90"/>
+              <w:bottom w:type="dxa" w:w="50"/>
+              <w:right w:type="dxa" w:w="90"/>
+            </w:tcMar>
+            <w:vAlign w:val="top"/>
+          </w:tcPr>
+          <w:p>
+            <w:pPr>
+              <w:spacing w:after="30" w:line="240"/>
+              <w:jc w:val="left"/>
+            </w:pPr>
+            <w:r>
+              <w:rPr>
+                <w:rFonts w:ascii="Times New Roman" w:cs="Times New Roman" w:eastAsia="Times New Roman" w:hAnsi="Times New Roman"/>
+                <w:sz w:val="19"/>
+                <w:szCs w:val="19"/>
+              </w:rPr>
+              <w:t>Web browser</w:t>
+            </w:r>
+          </w:p>
+        </w:tc>
+        <w:tc>
+          <w:tcPr>
+            <w:tcW w:type="dxa" w:w="3100"/>
+            <w:tcBorders>
+              <w:top w:val="single" w:color="808080" w:sz="4"/>
+              <w:left w:val="single" w:color="808080" w:sz="4"/>
+              <w:bottom w:val="single" w:color="808080" w:sz="4"/>
+              <w:right w:val="single" w:color="808080" w:sz="4"/>
+            </w:tcBorders>
+            <w:tcMar>
+              <w:top w:type="dxa" w:w="50"/>
+              <w:left w:type="dxa" w:w="90"/>
+              <w:bottom w:type="dxa" w:w="50"/>
+              <w:right w:type="dxa" w:w="90"/>
+            </w:tcMar>
+            <w:vAlign w:val="top"/>
+          </w:tcPr>
+          <w:p>
+            <w:pPr>
+              <w:spacing w:after="30" w:line="240"/>
+              <w:jc w:val="left"/>
+            </w:pPr>
+            <w:r>
+              <w:rPr>
+                <w:rFonts w:ascii="Times New Roman" w:cs="Times New Roman" w:eastAsia="Times New Roman" w:hAnsi="Times New Roman"/>
+                <w:sz w:val="19"/>
+                <w:szCs w:val="19"/>
+              </w:rPr>
+              <w:t>Chrome, Edge or Firefox (current)</w:t>
+            </w:r>
+          </w:p>
+        </w:tc>
+        <w:tc>
+          <w:tcPr>
+            <w:tcW w:type="dxa" w:w="4346"/>
+            <w:tcBorders>
+              <w:top w:val="single" w:color="808080" w:sz="4"/>
+              <w:left w:val="single" w:color="808080" w:sz="4"/>
+              <w:bottom w:val="single" w:color="808080" w:sz="4"/>
+              <w:right w:val="single" w:color="808080" w:sz="4"/>
+            </w:tcBorders>
+            <w:tcMar>
+              <w:top w:type="dxa" w:w="50"/>
+              <w:left w:type="dxa" w:w="90"/>
+              <w:bottom w:type="dxa" w:w="50"/>
+              <w:right w:type="dxa" w:w="90"/>
+            </w:tcMar>
+            <w:vAlign w:val="top"/>
+          </w:tcPr>
+          <w:p>
+            <w:pPr>
+              <w:spacing w:after="30" w:line="240"/>
+              <w:jc w:val="left"/>
+            </w:pPr>
+            <w:r>
+              <w:rPr>
+                <w:rFonts w:ascii="Times New Roman" w:cs="Times New Roman" w:eastAsia="Times New Roman" w:hAnsi="Times New Roman"/>
+                <w:sz w:val="19"/>
+                <w:szCs w:val="19"/>
+              </w:rPr>
+              <w:t>Shows the HMS website; exchanges JSON with the HMS server over HTTP on 127.0.0.1 only</w:t>
+            </w:r>
+          </w:p>
+        </w:tc>
+      </w:tr>
+      <w:tr>
+        <w:trPr>
+          <w:cantSplit/>
+        </w:trPr>
+        <w:tc>
+          <w:tcPr>
+            <w:tcW w:type="dxa" w:w="2300"/>
+            <w:tcBorders>
+              <w:top w:val="single" w:color="808080" w:sz="4"/>
+              <w:left w:val="single" w:color="808080" w:sz="4"/>
+              <w:bottom w:val="single" w:color="808080" w:sz="4"/>
+              <w:right w:val="single" w:color="808080" w:sz="4"/>
+            </w:tcBorders>
+            <w:tcMar>
+              <w:top w:type="dxa" w:w="50"/>
+              <w:left w:type="dxa" w:w="90"/>
+              <w:bottom w:type="dxa" w:w="50"/>
+              <w:right w:type="dxa" w:w="90"/>
+            </w:tcMar>
+            <w:vAlign w:val="top"/>
+          </w:tcPr>
+          <w:p>
+            <w:pPr>
+              <w:spacing w:after="30" w:line="240"/>
+              <w:jc w:val="left"/>
+            </w:pPr>
+            <w:r>
+              <w:rPr>
+                <w:rFonts w:ascii="Times New Roman" w:cs="Times New Roman" w:eastAsia="Times New Roman" w:hAnsi="Times New Roman"/>
+                <w:sz w:val="19"/>
+                <w:szCs w:val="19"/>
+              </w:rPr>
+              <w:t>React, Mantine, Vite</w:t>
+            </w:r>
+          </w:p>
+        </w:tc>
+        <w:tc>
+          <w:tcPr>
+            <w:tcW w:type="dxa" w:w="3100"/>
+            <w:tcBorders>
+              <w:top w:val="single" w:color="808080" w:sz="4"/>
+              <w:left w:val="single" w:color="808080" w:sz="4"/>
+              <w:bottom w:val="single" w:color="808080" w:sz="4"/>
+              <w:right w:val="single" w:color="808080" w:sz="4"/>
+            </w:tcBorders>
+            <w:tcMar>
+              <w:top w:type="dxa" w:w="50"/>
+              <w:left w:type="dxa" w:w="90"/>
+              <w:bottom w:type="dxa" w:w="50"/>
+              <w:right w:type="dxa" w:w="90"/>
+            </w:tcMar>
+            <w:vAlign w:val="top"/>
+          </w:tcPr>
+          <w:p>
+            <w:pPr>
+              <w:spacing w:after="30" w:line="240"/>
+              <w:jc w:val="left"/>
+            </w:pPr>
+            <w:r>
+              <w:rPr>
+                <w:rFonts w:ascii="Times New Roman" w:cs="Times New Roman" w:eastAsia="Times New Roman" w:hAnsi="Times New Roman"/>
+                <w:sz w:val="19"/>
+                <w:szCs w:val="19"/>
+              </w:rPr>
+              <w:t>18.3 / 7.17 / 5.4</w:t>
+            </w:r>
+          </w:p>
+        </w:tc>
+        <w:tc>
+          <w:tcPr>
+            <w:tcW w:type="dxa" w:w="4346"/>
+            <w:tcBorders>
+              <w:top w:val="single" w:color="808080" w:sz="4"/>
+              <w:left w:val="single" w:color="808080" w:sz="4"/>
+              <w:bottom w:val="single" w:color="808080" w:sz="4"/>
+              <w:right w:val="single" w:color="808080" w:sz="4"/>
+            </w:tcBorders>
+            <w:tcMar>
+              <w:top w:type="dxa" w:w="50"/>
+              <w:left w:type="dxa" w:w="90"/>
+              <w:bottom w:type="dxa" w:w="50"/>
+              <w:right w:type="dxa" w:w="90"/>
+            </w:tcMar>
+            <w:vAlign w:val="top"/>
+          </w:tcPr>
+          <w:p>
+            <w:pPr>
+              <w:spacing w:after="30" w:line="240"/>
+              <w:jc w:val="left"/>
+            </w:pPr>
+            <w:r>
+              <w:rPr>
+                <w:rFonts w:ascii="Times New Roman" w:cs="Times New Roman" w:eastAsia="Times New Roman" w:hAnsi="Times New Roman"/>
+                <w:sz w:val="19"/>
+                <w:szCs w:val="19"/>
+              </w:rPr>
+              <w:t>Website libraries, bundled into static files at build time (no internet needed at run time)</w:t>
+            </w:r>
+          </w:p>
+        </w:tc>
+      </w:tr>
+      <w:tr>
+        <w:trPr>
+          <w:cantSplit/>
+        </w:trPr>
+        <w:tc>
+          <w:tcPr>
+            <w:tcW w:type="dxa" w:w="2300"/>
+            <w:tcBorders>
+              <w:top w:val="single" w:color="808080" w:sz="4"/>
+              <w:left w:val="single" w:color="808080" w:sz="4"/>
+              <w:bottom w:val="single" w:color="808080" w:sz="4"/>
+              <w:right w:val="single" w:color="808080" w:sz="4"/>
+            </w:tcBorders>
+            <w:tcMar>
+              <w:top w:type="dxa" w:w="50"/>
+              <w:left w:type="dxa" w:w="90"/>
+              <w:bottom w:type="dxa" w:w="50"/>
+              <w:right w:type="dxa" w:w="90"/>
+            </w:tcMar>
+            <w:vAlign w:val="top"/>
+          </w:tcPr>
+          <w:p>
+            <w:pPr>
+              <w:spacing w:after="30" w:line="240"/>
+              <w:jc w:val="left"/>
+            </w:pPr>
+            <w:r>
+              <w:rPr>
+                <w:rFonts w:ascii="Times New Roman" w:cs="Times New Roman" w:eastAsia="Times New Roman" w:hAnsi="Times New Roman"/>
+                <w:sz w:val="19"/>
+                <w:szCs w:val="19"/>
+              </w:rPr>
+              <w:t>cpp-httplib, nlohmann/json</w:t>
+            </w:r>
+          </w:p>
+        </w:tc>
+        <w:tc>
+          <w:tcPr>
+            <w:tcW w:type="dxa" w:w="3100"/>
+            <w:tcBorders>
+              <w:top w:val="single" w:color="808080" w:sz="4"/>
+              <w:left w:val="single" w:color="808080" w:sz="4"/>
+              <w:bottom w:val="single" w:color="808080" w:sz="4"/>
+              <w:right w:val="single" w:color="808080" w:sz="4"/>
+            </w:tcBorders>
+            <w:tcMar>
+              <w:top w:type="dxa" w:w="50"/>
+              <w:left w:type="dxa" w:w="90"/>
+              <w:bottom w:type="dxa" w:w="50"/>
+              <w:right w:type="dxa" w:w="90"/>
+            </w:tcMar>
+            <w:vAlign w:val="top"/>
+          </w:tcPr>
+          <w:p>
+            <w:pPr>
+              <w:spacing w:after="30" w:line="240"/>
+              <w:jc w:val="left"/>
+            </w:pPr>
+            <w:r>
+              <w:rPr>
+                <w:rFonts w:ascii="Times New Roman" w:cs="Times New Roman" w:eastAsia="Times New Roman" w:hAnsi="Times New Roman"/>
+                <w:sz w:val="19"/>
+                <w:szCs w:val="19"/>
+              </w:rPr>
+              <w:t>0.18 / 3.11</w:t>
+            </w:r>
+          </w:p>
+        </w:tc>
+        <w:tc>
+          <w:tcPr>
+            <w:tcW w:type="dxa" w:w="4346"/>
+            <w:tcBorders>
+              <w:top w:val="single" w:color="808080" w:sz="4"/>
+              <w:left w:val="single" w:color="808080" w:sz="4"/>
+              <w:bottom w:val="single" w:color="808080" w:sz="4"/>
+              <w:right w:val="single" w:color="808080" w:sz="4"/>
+            </w:tcBorders>
+            <w:tcMar>
+              <w:top w:type="dxa" w:w="50"/>
+              <w:left w:type="dxa" w:w="90"/>
+              <w:bottom w:type="dxa" w:w="50"/>
+              <w:right w:type="dxa" w:w="90"/>
+            </w:tcMar>
+            <w:vAlign w:val="top"/>
+          </w:tcPr>
+          <w:p>
+            <w:pPr>
+              <w:spacing w:after="30" w:line="240"/>
+              <w:jc w:val="left"/>
+            </w:pPr>
+            <w:r>
+              <w:rPr>
+                <w:rFonts w:ascii="Times New Roman" w:cs="Times New Roman" w:eastAsia="Times New Roman" w:hAnsi="Times New Roman"/>
+                <w:sz w:val="19"/>
+                <w:szCs w:val="19"/>
+              </w:rPr>
+              <w:t>HTTP server and JSON handling inside the C++ program (header-only)</w:t>
             </w:r>
           </w:p>
         </w:tc>
@@ -5187,25 +5606,7 @@
           <w:sz w:val="23"/>
           <w:szCs w:val="23"/>
         </w:rPr>
-        <w:t xml:space="preserve">HMS has </w:t>
-      </w:r>
-      <w:r>
-        <w:rPr>
-          <w:rFonts w:ascii="Times New Roman" w:cs="Times New Roman" w:eastAsia="Times New Roman" w:hAnsi="Times New Roman"/>
-          <w:b/>
-          <w:bCs/>
-          <w:sz w:val="23"/>
-          <w:szCs w:val="23"/>
-        </w:rPr>
-        <w:t xml:space="preserve">no network communication</w:t>
-      </w:r>
-      <w:r>
-        <w:rPr>
-          <w:rFonts w:ascii="Times New Roman" w:cs="Times New Roman" w:eastAsia="Times New Roman" w:hAnsi="Times New Roman"/>
-          <w:sz w:val="23"/>
-          <w:szCs w:val="23"/>
-        </w:rPr>
-        <w:t xml:space="preserve">: it opens no sockets and calls no remote services, so there is no remote attack surface in release 1.0. The only outward data flows are CSV report files written to a user-selected folder (UTF-8, comma-separated, first row = column names) and backup folders written to the local disk. Should a network interface be added later, TLS 1.2 or higher must be used (open issue in the SAD).</w:t>
+        <w:t>The website and the HMS program communicate over HTTP with JSON messages on the loopback address 127.0.0.1 only (port 8080 by default). The server never listens on a network interface, so it cannot be reached from other computers (HMS-SEC-009). Every request other than status, first-run set-up and login carries a random session token. HMS calls no remote services and needs no internet connection at run time. The only outward data flows are CSV report files (UTF-8, comma-separated, first row = column names) downloaded through the browser.</w:t>
       </w:r>
     </w:p>
     <w:p>
@@ -5231,7 +5632,7 @@
           <w:sz w:val="23"/>
           <w:szCs w:val="23"/>
         </w:rPr>
-        <w:t xml:space="preserve">HMS uses only a standard keyboard (input), a display (text output) and local disk storage through the operating system. It has no direct hardware interface; printing is done by the user from the exported CSV file.</w:t>
+        <w:t>HMS uses only a standard keyboard and mouse (input), a display showing the web browser, and local disk storage through the operating system. It has no direct hardware interface; printing is done by the user from the browser or from the exported CSV file.</w:t>
       </w:r>
     </w:p>
     <w:p>
@@ -7955,7 +8356,7 @@
                 <w:sz w:val="19"/>
                 <w:szCs w:val="19"/>
               </w:rPr>
-              <w:t xml:space="preserve">1. The system shows the login prompt.</w:t>
+              <w:t>1. The system shows the login page.</w:t>
             </w:r>
           </w:p>
           <w:p>
@@ -7971,7 +8372,7 @@
                 <w:sz w:val="19"/>
                 <w:szCs w:val="19"/>
               </w:rPr>
-              <w:t xml:space="preserve">2. The user enters username and password (password masked).</w:t>
+              <w:t>2. The user enters username and password (password masked).</w:t>
             </w:r>
           </w:p>
           <w:p>
@@ -7987,7 +8388,7 @@
                 <w:sz w:val="19"/>
                 <w:szCs w:val="19"/>
               </w:rPr>
-              <w:t xml:space="preserve">3. The system validates the input, verifies the password hash and creates a session.</w:t>
+              <w:t>3. The system validates the input, verifies the password hash and creates a session.</w:t>
             </w:r>
           </w:p>
           <w:p>
@@ -8003,7 +8404,7 @@
                 <w:sz w:val="19"/>
                 <w:szCs w:val="19"/>
               </w:rPr>
-              <w:t xml:space="preserve">4. The system shows the main menu for the user's role.</w:t>
+              <w:t>4. The system shows the dashboard for the user's role.</w:t>
             </w:r>
           </w:p>
         </w:tc>
@@ -9469,25 +9870,7 @@
           <w:sz w:val="23"/>
           <w:szCs w:val="23"/>
         </w:rPr>
-        <w:t xml:space="preserve">Each requirement has a unique identifier of the form </w:t>
-      </w:r>
-      <w:r>
-        <w:rPr>
-          <w:rFonts w:ascii="Times New Roman" w:cs="Times New Roman" w:eastAsia="Times New Roman" w:hAnsi="Times New Roman"/>
-          <w:b/>
-          <w:bCs/>
-          <w:sz w:val="23"/>
-          <w:szCs w:val="23"/>
-        </w:rPr>
-        <w:t xml:space="preserve">HMS-F-nnn</w:t>
-      </w:r>
-      <w:r>
-        <w:rPr>
-          <w:rFonts w:ascii="Times New Roman" w:cs="Times New Roman" w:eastAsia="Times New Roman" w:hAnsi="Times New Roman"/>
-          <w:sz w:val="23"/>
-          <w:szCs w:val="23"/>
-        </w:rPr>
-        <w:t xml:space="preserve"> and is written as one "shall" statement that is clear (one meaning), concise, measurable or directly verifiable (limits, formats and counts are stated), and testable by at least one test case listed in Appendix C. Priority: High = must be delivered for release 1.0; Medium = should be delivered; Low = may be postponed.</w:t>
+        <w:t>Each requirement has a unique identifier of the form HMS-F-nnn and is written as one "shall" statement that is clear (one meaning), concise, measurable or directly verifiable (limits, formats and counts are stated), and testable by at least one test case listed in Appendix C. Priority: High = must be delivered for release 1.1; Medium = should be delivered; Low = may be postponed.</w:t>
       </w:r>
     </w:p>
     <w:p>
@@ -9682,7 +10065,7 @@
                 <w:sz w:val="19"/>
                 <w:szCs w:val="19"/>
               </w:rPr>
-              <w:t xml:space="preserve">User starts HMS</w:t>
+              <w:t>User opens http://localhost:8080</w:t>
             </w:r>
           </w:p>
         </w:tc>
@@ -9714,7 +10097,7 @@
                 <w:sz w:val="19"/>
                 <w:szCs w:val="19"/>
               </w:rPr>
-              <w:t xml:space="preserve">Login prompt is displayed; nothing else is reachable.</w:t>
+              <w:t>Login page is displayed; nothing else is reachable.</w:t>
             </w:r>
           </w:p>
         </w:tc>
@@ -9783,7 +10166,7 @@
                 <w:sz w:val="19"/>
                 <w:szCs w:val="19"/>
               </w:rPr>
-              <w:t xml:space="preserve">Main menu for the role is displayed.</w:t>
+              <w:t>The dashboard and the sidebar for the role are displayed.</w:t>
             </w:r>
           </w:p>
         </w:tc>
@@ -9990,7 +10373,7 @@
                 <w:sz w:val="19"/>
                 <w:szCs w:val="19"/>
               </w:rPr>
-              <w:t xml:space="preserve">Session ends; login prompt is shown.</w:t>
+              <w:t>Session ends; login page is shown.</w:t>
             </w:r>
           </w:p>
         </w:tc>
@@ -15188,6 +15571,703 @@
     </w:tbl>
     <w:p>
       <w:pPr>
+        <w:spacing w:after="100" w:before="0" w:line="264"/>
+        <w:jc w:val="left"/>
+      </w:pPr>
+      <w:r>
+        <w:rPr>
+          <w:rFonts w:ascii="Times New Roman" w:cs="Times New Roman" w:eastAsia="Times New Roman" w:hAnsi="Times New Roman"/>
+          <w:sz w:val="23"/>
+          <w:szCs w:val="23"/>
+        </w:rPr>
+      </w:r>
+    </w:p>
+    <w:p>
+      <w:pPr>
+        <w:pStyle w:val="Heading2"/>
+        <w:keepNext/>
+        <w:pageBreakBefore/>
+      </w:pPr>
+      <w:r>
+        <w:rPr>
+          <w:rFonts w:ascii="Times New Roman" w:cs="Times New Roman" w:eastAsia="Times New Roman" w:hAnsi="Times New Roman"/>
+        </w:rPr>
+        <w:t>5.5 Web User Interface</w:t>
+      </w:r>
+    </w:p>
+    <w:p>
+      <w:pPr>
+        <w:pStyle w:val="Heading3"/>
+        <w:keepNext/>
+      </w:pPr>
+      <w:r>
+        <w:rPr>
+          <w:rFonts w:ascii="Times New Roman" w:cs="Times New Roman" w:eastAsia="Times New Roman" w:hAnsi="Times New Roman"/>
+        </w:rPr>
+        <w:t>5.5.1 Description and Priority</w:t>
+      </w:r>
+    </w:p>
+    <w:p>
+      <w:pPr>
+        <w:spacing w:after="100" w:before="0" w:line="264"/>
+        <w:jc w:val="left"/>
+      </w:pPr>
+      <w:r>
+        <w:rPr>
+          <w:rFonts w:ascii="Times New Roman" w:cs="Times New Roman" w:eastAsia="Times New Roman" w:hAnsi="Times New Roman"/>
+          <w:sz w:val="23"/>
+          <w:szCs w:val="23"/>
+        </w:rPr>
+        <w:t>Priority: High. Every function of Sections 5.1 to 5.4 is used through a website that runs in the web browser of the HMS computer. The website is only a presentation layer: it calls the HMS program for every action, and the HMS program applies all rules, validation and access control. Benefit: familiar point-and-click pages for staff; risk: an extra build tool (Node.js) for the developers.</w:t>
+      </w:r>
+    </w:p>
+    <w:p>
+      <w:pPr>
+        <w:pStyle w:val="Heading3"/>
+        <w:keepNext/>
+      </w:pPr>
+      <w:r>
+        <w:rPr>
+          <w:rFonts w:ascii="Times New Roman" w:cs="Times New Roman" w:eastAsia="Times New Roman" w:hAnsi="Times New Roman"/>
+        </w:rPr>
+        <w:t>5.5.2 Functional Requirements</w:t>
+      </w:r>
+    </w:p>
+    <w:tbl>
+      <w:tblPr>
+        <w:tblW w:type="dxa" w:w="9746"/>
+        <w:tblBorders>
+          <w:top w:val="single" w:color="auto" w:sz="4"/>
+          <w:left w:val="single" w:color="auto" w:sz="4"/>
+          <w:bottom w:val="single" w:color="auto" w:sz="4"/>
+          <w:right w:val="single" w:color="auto" w:sz="4"/>
+          <w:insideH w:val="single" w:color="auto" w:sz="4"/>
+          <w:insideV w:val="single" w:color="auto" w:sz="4"/>
+        </w:tblBorders>
+      </w:tblPr>
+      <w:tblGrid>
+        <w:gridCol w:w="1400"/>
+        <w:gridCol w:w="7100"/>
+        <w:gridCol w:w="1246"/>
+      </w:tblGrid>
+      <w:tr>
+        <w:trPr>
+          <w:tblHeader/>
+        </w:trPr>
+        <w:tc>
+          <w:tcPr>
+            <w:tcW w:type="dxa" w:w="1400"/>
+            <w:tcBorders>
+              <w:top w:val="single" w:color="808080" w:sz="4"/>
+              <w:left w:val="single" w:color="808080" w:sz="4"/>
+              <w:bottom w:val="single" w:color="808080" w:sz="4"/>
+              <w:right w:val="single" w:color="808080" w:sz="4"/>
+            </w:tcBorders>
+            <w:shd w:fill="DCE6F2" w:color="auto" w:val="clear"/>
+            <w:tcMar>
+              <w:top w:type="dxa" w:w="50"/>
+              <w:left w:type="dxa" w:w="90"/>
+              <w:bottom w:type="dxa" w:w="50"/>
+              <w:right w:type="dxa" w:w="90"/>
+            </w:tcMar>
+            <w:vAlign w:val="top"/>
+          </w:tcPr>
+          <w:p>
+            <w:pPr>
+              <w:spacing w:after="30" w:line="240"/>
+              <w:jc w:val="left"/>
+            </w:pPr>
+            <w:r>
+              <w:rPr>
+                <w:rFonts w:ascii="Times New Roman" w:cs="Times New Roman" w:eastAsia="Times New Roman" w:hAnsi="Times New Roman"/>
+                <w:b/>
+                <w:bCs/>
+                <w:sz w:val="19"/>
+                <w:szCs w:val="19"/>
+              </w:rPr>
+              <w:t xml:space="preserve">ID</w:t>
+            </w:r>
+          </w:p>
+        </w:tc>
+        <w:tc>
+          <w:tcPr>
+            <w:tcW w:type="dxa" w:w="7100"/>
+            <w:tcBorders>
+              <w:top w:val="single" w:color="808080" w:sz="4"/>
+              <w:left w:val="single" w:color="808080" w:sz="4"/>
+              <w:bottom w:val="single" w:color="808080" w:sz="4"/>
+              <w:right w:val="single" w:color="808080" w:sz="4"/>
+            </w:tcBorders>
+            <w:shd w:fill="DCE6F2" w:color="auto" w:val="clear"/>
+            <w:tcMar>
+              <w:top w:type="dxa" w:w="50"/>
+              <w:left w:type="dxa" w:w="90"/>
+              <w:bottom w:type="dxa" w:w="50"/>
+              <w:right w:type="dxa" w:w="90"/>
+            </w:tcMar>
+            <w:vAlign w:val="top"/>
+          </w:tcPr>
+          <w:p>
+            <w:pPr>
+              <w:spacing w:after="30" w:line="240"/>
+              <w:jc w:val="left"/>
+            </w:pPr>
+            <w:r>
+              <w:rPr>
+                <w:rFonts w:ascii="Times New Roman" w:cs="Times New Roman" w:eastAsia="Times New Roman" w:hAnsi="Times New Roman"/>
+                <w:b/>
+                <w:bCs/>
+                <w:sz w:val="19"/>
+                <w:szCs w:val="19"/>
+              </w:rPr>
+              <w:t xml:space="preserve">Requirement</w:t>
+            </w:r>
+          </w:p>
+        </w:tc>
+        <w:tc>
+          <w:tcPr>
+            <w:tcW w:type="dxa" w:w="1246"/>
+            <w:tcBorders>
+              <w:top w:val="single" w:color="808080" w:sz="4"/>
+              <w:left w:val="single" w:color="808080" w:sz="4"/>
+              <w:bottom w:val="single" w:color="808080" w:sz="4"/>
+              <w:right w:val="single" w:color="808080" w:sz="4"/>
+            </w:tcBorders>
+            <w:shd w:fill="DCE6F2" w:color="auto" w:val="clear"/>
+            <w:tcMar>
+              <w:top w:type="dxa" w:w="50"/>
+              <w:left w:type="dxa" w:w="90"/>
+              <w:bottom w:type="dxa" w:w="50"/>
+              <w:right w:type="dxa" w:w="90"/>
+            </w:tcMar>
+            <w:vAlign w:val="top"/>
+          </w:tcPr>
+          <w:p>
+            <w:pPr>
+              <w:spacing w:after="30" w:line="240"/>
+              <w:jc w:val="left"/>
+            </w:pPr>
+            <w:r>
+              <w:rPr>
+                <w:rFonts w:ascii="Times New Roman" w:cs="Times New Roman" w:eastAsia="Times New Roman" w:hAnsi="Times New Roman"/>
+                <w:b/>
+                <w:bCs/>
+                <w:sz w:val="19"/>
+                <w:szCs w:val="19"/>
+              </w:rPr>
+              <w:t xml:space="preserve">Priority</w:t>
+            </w:r>
+          </w:p>
+        </w:tc>
+      </w:tr>
+      <w:tr>
+        <w:trPr/>
+        <w:tc>
+          <w:tcPr>
+            <w:tcW w:type="dxa" w:w="1400"/>
+            <w:tcBorders>
+              <w:top w:val="single" w:color="808080" w:sz="4"/>
+              <w:left w:val="single" w:color="808080" w:sz="4"/>
+              <w:bottom w:val="single" w:color="808080" w:sz="4"/>
+              <w:right w:val="single" w:color="808080" w:sz="4"/>
+            </w:tcBorders>
+            <w:tcMar>
+              <w:top w:type="dxa" w:w="50"/>
+              <w:left w:type="dxa" w:w="90"/>
+              <w:bottom w:type="dxa" w:w="50"/>
+              <w:right w:type="dxa" w:w="90"/>
+            </w:tcMar>
+            <w:vAlign w:val="top"/>
+          </w:tcPr>
+          <w:p>
+            <w:pPr>
+              <w:spacing w:after="30" w:line="240"/>
+              <w:jc w:val="left"/>
+            </w:pPr>
+            <w:r>
+              <w:rPr>
+                <w:rFonts w:ascii="Times New Roman" w:cs="Times New Roman" w:eastAsia="Times New Roman" w:hAnsi="Times New Roman"/>
+                <w:b/>
+                <w:bCs/>
+                <w:sz w:val="19"/>
+                <w:szCs w:val="19"/>
+              </w:rPr>
+              <w:t>HMS-F-070</w:t>
+            </w:r>
+          </w:p>
+        </w:tc>
+        <w:tc>
+          <w:tcPr>
+            <w:tcW w:type="dxa" w:w="7100"/>
+            <w:tcBorders>
+              <w:top w:val="single" w:color="808080" w:sz="4"/>
+              <w:left w:val="single" w:color="808080" w:sz="4"/>
+              <w:bottom w:val="single" w:color="808080" w:sz="4"/>
+              <w:right w:val="single" w:color="808080" w:sz="4"/>
+            </w:tcBorders>
+            <w:tcMar>
+              <w:top w:type="dxa" w:w="50"/>
+              <w:left w:type="dxa" w:w="90"/>
+              <w:bottom w:type="dxa" w:w="50"/>
+              <w:right w:type="dxa" w:w="90"/>
+            </w:tcMar>
+            <w:vAlign w:val="top"/>
+          </w:tcPr>
+          <w:p>
+            <w:pPr>
+              <w:spacing w:after="30" w:line="240"/>
+              <w:jc w:val="left"/>
+            </w:pPr>
+            <w:r>
+              <w:rPr>
+                <w:rFonts w:ascii="Times New Roman" w:cs="Times New Roman" w:eastAsia="Times New Roman" w:hAnsi="Times New Roman"/>
+                <w:sz w:val="19"/>
+                <w:szCs w:val="19"/>
+              </w:rPr>
+              <w:t>The system shall provide all its functions through a website served by the HMS program at http://localhost:8080, with a login page, a dashboard and a sidebar that lists only the pages allowed for the logged-in role (Table 6.5-1).</w:t>
+            </w:r>
+          </w:p>
+        </w:tc>
+        <w:tc>
+          <w:tcPr>
+            <w:tcW w:type="dxa" w:w="1246"/>
+            <w:tcBorders>
+              <w:top w:val="single" w:color="808080" w:sz="4"/>
+              <w:left w:val="single" w:color="808080" w:sz="4"/>
+              <w:bottom w:val="single" w:color="808080" w:sz="4"/>
+              <w:right w:val="single" w:color="808080" w:sz="4"/>
+            </w:tcBorders>
+            <w:tcMar>
+              <w:top w:type="dxa" w:w="50"/>
+              <w:left w:type="dxa" w:w="90"/>
+              <w:bottom w:type="dxa" w:w="50"/>
+              <w:right w:type="dxa" w:w="90"/>
+            </w:tcMar>
+            <w:vAlign w:val="top"/>
+          </w:tcPr>
+          <w:p>
+            <w:pPr>
+              <w:spacing w:after="30" w:line="240"/>
+              <w:jc w:val="left"/>
+            </w:pPr>
+            <w:r>
+              <w:rPr>
+                <w:rFonts w:ascii="Times New Roman" w:cs="Times New Roman" w:eastAsia="Times New Roman" w:hAnsi="Times New Roman"/>
+                <w:sz w:val="19"/>
+                <w:szCs w:val="19"/>
+              </w:rPr>
+              <w:t>High</w:t>
+            </w:r>
+          </w:p>
+        </w:tc>
+      </w:tr>
+      <w:tr>
+        <w:trPr/>
+        <w:tc>
+          <w:tcPr>
+            <w:tcW w:type="dxa" w:w="1400"/>
+            <w:tcBorders>
+              <w:top w:val="single" w:color="808080" w:sz="4"/>
+              <w:left w:val="single" w:color="808080" w:sz="4"/>
+              <w:bottom w:val="single" w:color="808080" w:sz="4"/>
+              <w:right w:val="single" w:color="808080" w:sz="4"/>
+            </w:tcBorders>
+            <w:tcMar>
+              <w:top w:type="dxa" w:w="50"/>
+              <w:left w:type="dxa" w:w="90"/>
+              <w:bottom w:type="dxa" w:w="50"/>
+              <w:right w:type="dxa" w:w="90"/>
+            </w:tcMar>
+            <w:vAlign w:val="top"/>
+          </w:tcPr>
+          <w:p>
+            <w:pPr>
+              <w:spacing w:after="30" w:line="240"/>
+              <w:jc w:val="left"/>
+            </w:pPr>
+            <w:r>
+              <w:rPr>
+                <w:rFonts w:ascii="Times New Roman" w:cs="Times New Roman" w:eastAsia="Times New Roman" w:hAnsi="Times New Roman"/>
+                <w:b/>
+                <w:bCs/>
+                <w:sz w:val="19"/>
+                <w:szCs w:val="19"/>
+              </w:rPr>
+              <w:t>HMS-F-071</w:t>
+            </w:r>
+          </w:p>
+        </w:tc>
+        <w:tc>
+          <w:tcPr>
+            <w:tcW w:type="dxa" w:w="7100"/>
+            <w:tcBorders>
+              <w:top w:val="single" w:color="808080" w:sz="4"/>
+              <w:left w:val="single" w:color="808080" w:sz="4"/>
+              <w:bottom w:val="single" w:color="808080" w:sz="4"/>
+              <w:right w:val="single" w:color="808080" w:sz="4"/>
+            </w:tcBorders>
+            <w:tcMar>
+              <w:top w:type="dxa" w:w="50"/>
+              <w:left w:type="dxa" w:w="90"/>
+              <w:bottom w:type="dxa" w:w="50"/>
+              <w:right w:type="dxa" w:w="90"/>
+            </w:tcMar>
+            <w:vAlign w:val="top"/>
+          </w:tcPr>
+          <w:p>
+            <w:pPr>
+              <w:spacing w:after="30" w:line="240"/>
+              <w:jc w:val="left"/>
+            </w:pPr>
+            <w:r>
+              <w:rPr>
+                <w:rFonts w:ascii="Times New Roman" w:cs="Times New Roman" w:eastAsia="Times New Roman" w:hAnsi="Times New Roman"/>
+                <w:sz w:val="19"/>
+                <w:szCs w:val="19"/>
+              </w:rPr>
+              <w:t>The website shall provide pages to manage user accounts, to view the audit log filtered by date range and username, and to change one's own password, each available only to the roles allowed in Table 6.5-1.</w:t>
+            </w:r>
+          </w:p>
+        </w:tc>
+        <w:tc>
+          <w:tcPr>
+            <w:tcW w:type="dxa" w:w="1246"/>
+            <w:tcBorders>
+              <w:top w:val="single" w:color="808080" w:sz="4"/>
+              <w:left w:val="single" w:color="808080" w:sz="4"/>
+              <w:bottom w:val="single" w:color="808080" w:sz="4"/>
+              <w:right w:val="single" w:color="808080" w:sz="4"/>
+            </w:tcBorders>
+            <w:tcMar>
+              <w:top w:type="dxa" w:w="50"/>
+              <w:left w:type="dxa" w:w="90"/>
+              <w:bottom w:type="dxa" w:w="50"/>
+              <w:right w:type="dxa" w:w="90"/>
+            </w:tcMar>
+            <w:vAlign w:val="top"/>
+          </w:tcPr>
+          <w:p>
+            <w:pPr>
+              <w:spacing w:after="30" w:line="240"/>
+              <w:jc w:val="left"/>
+            </w:pPr>
+            <w:r>
+              <w:rPr>
+                <w:rFonts w:ascii="Times New Roman" w:cs="Times New Roman" w:eastAsia="Times New Roman" w:hAnsi="Times New Roman"/>
+                <w:sz w:val="19"/>
+                <w:szCs w:val="19"/>
+              </w:rPr>
+              <w:t>Medium</w:t>
+            </w:r>
+          </w:p>
+        </w:tc>
+      </w:tr>
+      <w:tr>
+        <w:trPr/>
+        <w:tc>
+          <w:tcPr>
+            <w:tcW w:type="dxa" w:w="1400"/>
+            <w:tcBorders>
+              <w:top w:val="single" w:color="808080" w:sz="4"/>
+              <w:left w:val="single" w:color="808080" w:sz="4"/>
+              <w:bottom w:val="single" w:color="808080" w:sz="4"/>
+              <w:right w:val="single" w:color="808080" w:sz="4"/>
+            </w:tcBorders>
+            <w:tcMar>
+              <w:top w:type="dxa" w:w="50"/>
+              <w:left w:type="dxa" w:w="90"/>
+              <w:bottom w:type="dxa" w:w="50"/>
+              <w:right w:type="dxa" w:w="90"/>
+            </w:tcMar>
+            <w:vAlign w:val="top"/>
+          </w:tcPr>
+          <w:p>
+            <w:pPr>
+              <w:spacing w:after="30" w:line="240"/>
+              <w:jc w:val="left"/>
+            </w:pPr>
+            <w:r>
+              <w:rPr>
+                <w:rFonts w:ascii="Times New Roman" w:cs="Times New Roman" w:eastAsia="Times New Roman" w:hAnsi="Times New Roman"/>
+                <w:b/>
+                <w:bCs/>
+                <w:sz w:val="19"/>
+                <w:szCs w:val="19"/>
+              </w:rPr>
+              <w:t>HMS-F-072</w:t>
+            </w:r>
+          </w:p>
+        </w:tc>
+        <w:tc>
+          <w:tcPr>
+            <w:tcW w:type="dxa" w:w="7100"/>
+            <w:tcBorders>
+              <w:top w:val="single" w:color="808080" w:sz="4"/>
+              <w:left w:val="single" w:color="808080" w:sz="4"/>
+              <w:bottom w:val="single" w:color="808080" w:sz="4"/>
+              <w:right w:val="single" w:color="808080" w:sz="4"/>
+            </w:tcBorders>
+            <w:tcMar>
+              <w:top w:type="dxa" w:w="50"/>
+              <w:left w:type="dxa" w:w="90"/>
+              <w:bottom w:type="dxa" w:w="50"/>
+              <w:right w:type="dxa" w:w="90"/>
+            </w:tcMar>
+            <w:vAlign w:val="top"/>
+          </w:tcPr>
+          <w:p>
+            <w:pPr>
+              <w:spacing w:after="30" w:line="240"/>
+              <w:jc w:val="left"/>
+            </w:pPr>
+            <w:r>
+              <w:rPr>
+                <w:rFonts w:ascii="Times New Roman" w:cs="Times New Roman" w:eastAsia="Times New Roman" w:hAnsi="Times New Roman"/>
+                <w:sz w:val="19"/>
+                <w:szCs w:val="19"/>
+              </w:rPr>
+              <w:t>The website shall provide a Patients page to search by patient ID, part of the name or phone (20 results per page), register a patient (showing the existing patient ID and asking for confirmation when a duplicate is found), update details and deactivate a patient.</w:t>
+            </w:r>
+          </w:p>
+        </w:tc>
+        <w:tc>
+          <w:tcPr>
+            <w:tcW w:type="dxa" w:w="1246"/>
+            <w:tcBorders>
+              <w:top w:val="single" w:color="808080" w:sz="4"/>
+              <w:left w:val="single" w:color="808080" w:sz="4"/>
+              <w:bottom w:val="single" w:color="808080" w:sz="4"/>
+              <w:right w:val="single" w:color="808080" w:sz="4"/>
+            </w:tcBorders>
+            <w:tcMar>
+              <w:top w:type="dxa" w:w="50"/>
+              <w:left w:type="dxa" w:w="90"/>
+              <w:bottom w:type="dxa" w:w="50"/>
+              <w:right w:type="dxa" w:w="90"/>
+            </w:tcMar>
+            <w:vAlign w:val="top"/>
+          </w:tcPr>
+          <w:p>
+            <w:pPr>
+              <w:spacing w:after="30" w:line="240"/>
+              <w:jc w:val="left"/>
+            </w:pPr>
+            <w:r>
+              <w:rPr>
+                <w:rFonts w:ascii="Times New Roman" w:cs="Times New Roman" w:eastAsia="Times New Roman" w:hAnsi="Times New Roman"/>
+                <w:sz w:val="19"/>
+                <w:szCs w:val="19"/>
+              </w:rPr>
+              <w:t>High</w:t>
+            </w:r>
+          </w:p>
+        </w:tc>
+      </w:tr>
+      <w:tr>
+        <w:trPr/>
+        <w:tc>
+          <w:tcPr>
+            <w:tcW w:type="dxa" w:w="1400"/>
+            <w:tcBorders>
+              <w:top w:val="single" w:color="808080" w:sz="4"/>
+              <w:left w:val="single" w:color="808080" w:sz="4"/>
+              <w:bottom w:val="single" w:color="808080" w:sz="4"/>
+              <w:right w:val="single" w:color="808080" w:sz="4"/>
+            </w:tcBorders>
+            <w:tcMar>
+              <w:top w:type="dxa" w:w="50"/>
+              <w:left w:type="dxa" w:w="90"/>
+              <w:bottom w:type="dxa" w:w="50"/>
+              <w:right w:type="dxa" w:w="90"/>
+            </w:tcMar>
+            <w:vAlign w:val="top"/>
+          </w:tcPr>
+          <w:p>
+            <w:pPr>
+              <w:spacing w:after="30" w:line="240"/>
+              <w:jc w:val="left"/>
+            </w:pPr>
+            <w:r>
+              <w:rPr>
+                <w:rFonts w:ascii="Times New Roman" w:cs="Times New Roman" w:eastAsia="Times New Roman" w:hAnsi="Times New Roman"/>
+                <w:b/>
+                <w:bCs/>
+                <w:sz w:val="19"/>
+                <w:szCs w:val="19"/>
+              </w:rPr>
+              <w:t>HMS-F-073</w:t>
+            </w:r>
+          </w:p>
+        </w:tc>
+        <w:tc>
+          <w:tcPr>
+            <w:tcW w:type="dxa" w:w="7100"/>
+            <w:tcBorders>
+              <w:top w:val="single" w:color="808080" w:sz="4"/>
+              <w:left w:val="single" w:color="808080" w:sz="4"/>
+              <w:bottom w:val="single" w:color="808080" w:sz="4"/>
+              <w:right w:val="single" w:color="808080" w:sz="4"/>
+            </w:tcBorders>
+            <w:tcMar>
+              <w:top w:type="dxa" w:w="50"/>
+              <w:left w:type="dxa" w:w="90"/>
+              <w:bottom w:type="dxa" w:w="50"/>
+              <w:right w:type="dxa" w:w="90"/>
+            </w:tcMar>
+            <w:vAlign w:val="top"/>
+          </w:tcPr>
+          <w:p>
+            <w:pPr>
+              <w:spacing w:after="30" w:line="240"/>
+              <w:jc w:val="left"/>
+            </w:pPr>
+            <w:r>
+              <w:rPr>
+                <w:rFonts w:ascii="Times New Roman" w:cs="Times New Roman" w:eastAsia="Times New Roman" w:hAnsi="Times New Roman"/>
+                <w:sz w:val="19"/>
+                <w:szCs w:val="19"/>
+              </w:rPr>
+              <w:t>The website shall provide pages to manage doctors and their weekly working hours, to book appointments (offering the next 3 free slots as buttons when a slot is refused), to cancel, reschedule or mark an appointment as no-show, and to view a doctor's schedule for a date.</w:t>
+            </w:r>
+          </w:p>
+        </w:tc>
+        <w:tc>
+          <w:tcPr>
+            <w:tcW w:type="dxa" w:w="1246"/>
+            <w:tcBorders>
+              <w:top w:val="single" w:color="808080" w:sz="4"/>
+              <w:left w:val="single" w:color="808080" w:sz="4"/>
+              <w:bottom w:val="single" w:color="808080" w:sz="4"/>
+              <w:right w:val="single" w:color="808080" w:sz="4"/>
+            </w:tcBorders>
+            <w:tcMar>
+              <w:top w:type="dxa" w:w="50"/>
+              <w:left w:type="dxa" w:w="90"/>
+              <w:bottom w:type="dxa" w:w="50"/>
+              <w:right w:type="dxa" w:w="90"/>
+            </w:tcMar>
+            <w:vAlign w:val="top"/>
+          </w:tcPr>
+          <w:p>
+            <w:pPr>
+              <w:spacing w:after="30" w:line="240"/>
+              <w:jc w:val="left"/>
+            </w:pPr>
+            <w:r>
+              <w:rPr>
+                <w:rFonts w:ascii="Times New Roman" w:cs="Times New Roman" w:eastAsia="Times New Roman" w:hAnsi="Times New Roman"/>
+                <w:sz w:val="19"/>
+                <w:szCs w:val="19"/>
+              </w:rPr>
+              <w:t>High</w:t>
+            </w:r>
+          </w:p>
+        </w:tc>
+      </w:tr>
+      <w:tr>
+        <w:trPr/>
+        <w:tc>
+          <w:tcPr>
+            <w:tcW w:type="dxa" w:w="1400"/>
+            <w:tcBorders>
+              <w:top w:val="single" w:color="808080" w:sz="4"/>
+              <w:left w:val="single" w:color="808080" w:sz="4"/>
+              <w:bottom w:val="single" w:color="808080" w:sz="4"/>
+              <w:right w:val="single" w:color="808080" w:sz="4"/>
+            </w:tcBorders>
+            <w:tcMar>
+              <w:top w:type="dxa" w:w="50"/>
+              <w:left w:type="dxa" w:w="90"/>
+              <w:bottom w:type="dxa" w:w="50"/>
+              <w:right w:type="dxa" w:w="90"/>
+            </w:tcMar>
+            <w:vAlign w:val="top"/>
+          </w:tcPr>
+          <w:p>
+            <w:pPr>
+              <w:spacing w:after="30" w:line="240"/>
+              <w:jc w:val="left"/>
+            </w:pPr>
+            <w:r>
+              <w:rPr>
+                <w:rFonts w:ascii="Times New Roman" w:cs="Times New Roman" w:eastAsia="Times New Roman" w:hAnsi="Times New Roman"/>
+                <w:b/>
+                <w:bCs/>
+                <w:sz w:val="19"/>
+                <w:szCs w:val="19"/>
+              </w:rPr>
+              <w:t>HMS-F-074</w:t>
+            </w:r>
+          </w:p>
+        </w:tc>
+        <w:tc>
+          <w:tcPr>
+            <w:tcW w:type="dxa" w:w="7100"/>
+            <w:tcBorders>
+              <w:top w:val="single" w:color="808080" w:sz="4"/>
+              <w:left w:val="single" w:color="808080" w:sz="4"/>
+              <w:bottom w:val="single" w:color="808080" w:sz="4"/>
+              <w:right w:val="single" w:color="808080" w:sz="4"/>
+            </w:tcBorders>
+            <w:tcMar>
+              <w:top w:type="dxa" w:w="50"/>
+              <w:left w:type="dxa" w:w="90"/>
+              <w:bottom w:type="dxa" w:w="50"/>
+              <w:right w:type="dxa" w:w="90"/>
+            </w:tcMar>
+            <w:vAlign w:val="top"/>
+          </w:tcPr>
+          <w:p>
+            <w:pPr>
+              <w:spacing w:after="30" w:line="240"/>
+              <w:jc w:val="left"/>
+            </w:pPr>
+            <w:r>
+              <w:rPr>
+                <w:rFonts w:ascii="Times New Roman" w:cs="Times New Roman" w:eastAsia="Times New Roman" w:hAnsi="Times New Roman"/>
+                <w:sz w:val="19"/>
+                <w:szCs w:val="19"/>
+              </w:rPr>
+              <w:t>The website shall provide, for Doctors, pages to record a consultation (showing patient ID, name and age for confirmation before saving), view a patient's history and add addenda; and pages for the daily report with CSV download, the doctor workload report and backup / restore.</w:t>
+            </w:r>
+          </w:p>
+        </w:tc>
+        <w:tc>
+          <w:tcPr>
+            <w:tcW w:type="dxa" w:w="1246"/>
+            <w:tcBorders>
+              <w:top w:val="single" w:color="808080" w:sz="4"/>
+              <w:left w:val="single" w:color="808080" w:sz="4"/>
+              <w:bottom w:val="single" w:color="808080" w:sz="4"/>
+              <w:right w:val="single" w:color="808080" w:sz="4"/>
+            </w:tcBorders>
+            <w:tcMar>
+              <w:top w:type="dxa" w:w="50"/>
+              <w:left w:type="dxa" w:w="90"/>
+              <w:bottom w:type="dxa" w:w="50"/>
+              <w:right w:type="dxa" w:w="90"/>
+            </w:tcMar>
+            <w:vAlign w:val="top"/>
+          </w:tcPr>
+          <w:p>
+            <w:pPr>
+              <w:spacing w:after="30" w:line="240"/>
+              <w:jc w:val="left"/>
+            </w:pPr>
+            <w:r>
+              <w:rPr>
+                <w:rFonts w:ascii="Times New Roman" w:cs="Times New Roman" w:eastAsia="Times New Roman" w:hAnsi="Times New Roman"/>
+                <w:sz w:val="19"/>
+                <w:szCs w:val="19"/>
+              </w:rPr>
+              <w:t>High</w:t>
+            </w:r>
+          </w:p>
+        </w:tc>
+      </w:tr>
+    </w:tbl>
+    <w:p>
+      <w:pPr>
         <w:spacing w:after="60" w:before="0" w:line="264"/>
         <w:jc w:val="left"/>
       </w:pPr>
@@ -15631,7 +16711,7 @@
                 <w:sz w:val="19"/>
                 <w:szCs w:val="19"/>
               </w:rPr>
-              <w:t xml:space="preserve">The system shall complete start-up (login prompt displayed) within 5 seconds when loading 10,000 patients, 100 doctors and 50,000 appointments.</w:t>
+              <w:t>The system shall complete start-up (login page displayed) within 5 seconds when loading 10,000 patients, 100 doctors and 50,000 appointments.</w:t>
             </w:r>
           </w:p>
         </w:tc>
@@ -17441,7 +18521,7 @@
                 <w:sz w:val="19"/>
                 <w:szCs w:val="19"/>
               </w:rPr>
-              <w:t xml:space="preserve">The system shall not echo password characters on the screen while they are typed.</w:t>
+              <w:t>The system shall never display password characters while they are typed (masked password fields) and shall never send a password back to the browser.</w:t>
             </w:r>
           </w:p>
         </w:tc>
@@ -18014,6 +19094,141 @@
                 <w:szCs w:val="19"/>
               </w:rPr>
               <w:t xml:space="preserve">Medium</w:t>
+            </w:r>
+          </w:p>
+        </w:tc>
+      </w:tr>
+      <w:tr>
+        <w:trPr>
+          <w:cantSplit/>
+        </w:trPr>
+        <w:tc>
+          <w:tcPr>
+            <w:tcW w:type="dxa" w:w="1400"/>
+            <w:tcBorders>
+              <w:top w:val="single" w:color="808080" w:sz="4"/>
+              <w:left w:val="single" w:color="808080" w:sz="4"/>
+              <w:bottom w:val="single" w:color="808080" w:sz="4"/>
+              <w:right w:val="single" w:color="808080" w:sz="4"/>
+            </w:tcBorders>
+            <w:tcMar>
+              <w:top w:type="dxa" w:w="50"/>
+              <w:left w:type="dxa" w:w="90"/>
+              <w:bottom w:type="dxa" w:w="50"/>
+              <w:right w:type="dxa" w:w="90"/>
+            </w:tcMar>
+            <w:vAlign w:val="top"/>
+          </w:tcPr>
+          <w:p>
+            <w:pPr>
+              <w:spacing w:after="30" w:line="240"/>
+              <w:jc w:val="left"/>
+            </w:pPr>
+            <w:r>
+              <w:rPr>
+                <w:rFonts w:ascii="Times New Roman" w:cs="Times New Roman" w:eastAsia="Times New Roman" w:hAnsi="Times New Roman"/>
+                <w:b/>
+                <w:bCs/>
+                <w:sz w:val="19"/>
+                <w:szCs w:val="19"/>
+              </w:rPr>
+              <w:t>HMS-SEC-009</w:t>
+            </w:r>
+          </w:p>
+        </w:tc>
+        <w:tc>
+          <w:tcPr>
+            <w:tcW w:type="dxa" w:w="1150"/>
+            <w:tcBorders>
+              <w:top w:val="single" w:color="808080" w:sz="4"/>
+              <w:left w:val="single" w:color="808080" w:sz="4"/>
+              <w:bottom w:val="single" w:color="808080" w:sz="4"/>
+              <w:right w:val="single" w:color="808080" w:sz="4"/>
+            </w:tcBorders>
+            <w:tcMar>
+              <w:top w:type="dxa" w:w="50"/>
+              <w:left w:type="dxa" w:w="90"/>
+              <w:bottom w:type="dxa" w:w="50"/>
+              <w:right w:type="dxa" w:w="90"/>
+            </w:tcMar>
+            <w:vAlign w:val="top"/>
+          </w:tcPr>
+          <w:p>
+            <w:pPr>
+              <w:spacing w:after="30" w:line="240"/>
+              <w:jc w:val="left"/>
+            </w:pPr>
+            <w:r>
+              <w:rPr>
+                <w:rFonts w:ascii="Times New Roman" w:cs="Times New Roman" w:eastAsia="Times New Roman" w:hAnsi="Times New Roman"/>
+                <w:sz w:val="19"/>
+                <w:szCs w:val="19"/>
+              </w:rPr>
+              <w:t>SO-1</w:t>
+            </w:r>
+          </w:p>
+        </w:tc>
+        <w:tc>
+          <w:tcPr>
+            <w:tcW w:type="dxa" w:w="5950"/>
+            <w:tcBorders>
+              <w:top w:val="single" w:color="808080" w:sz="4"/>
+              <w:left w:val="single" w:color="808080" w:sz="4"/>
+              <w:bottom w:val="single" w:color="808080" w:sz="4"/>
+              <w:right w:val="single" w:color="808080" w:sz="4"/>
+            </w:tcBorders>
+            <w:tcMar>
+              <w:top w:type="dxa" w:w="50"/>
+              <w:left w:type="dxa" w:w="90"/>
+              <w:bottom w:type="dxa" w:w="50"/>
+              <w:right w:type="dxa" w:w="90"/>
+            </w:tcMar>
+            <w:vAlign w:val="top"/>
+          </w:tcPr>
+          <w:p>
+            <w:pPr>
+              <w:spacing w:after="30" w:line="240"/>
+              <w:jc w:val="left"/>
+            </w:pPr>
+            <w:r>
+              <w:rPr>
+                <w:rFonts w:ascii="Times New Roman" w:cs="Times New Roman" w:eastAsia="Times New Roman" w:hAnsi="Times New Roman"/>
+                <w:sz w:val="19"/>
+                <w:szCs w:val="19"/>
+              </w:rPr>
+              <w:t>The HMS server shall accept connections only on the loopback address 127.0.0.1, every session token shall contain at least 128 random bits, and every request without a valid token (except status, first-run set-up and login) shall be refused with E003.</w:t>
+            </w:r>
+          </w:p>
+        </w:tc>
+        <w:tc>
+          <w:tcPr>
+            <w:tcW w:type="dxa" w:w="1246"/>
+            <w:tcBorders>
+              <w:top w:val="single" w:color="808080" w:sz="4"/>
+              <w:left w:val="single" w:color="808080" w:sz="4"/>
+              <w:bottom w:val="single" w:color="808080" w:sz="4"/>
+              <w:right w:val="single" w:color="808080" w:sz="4"/>
+            </w:tcBorders>
+            <w:tcMar>
+              <w:top w:type="dxa" w:w="50"/>
+              <w:left w:type="dxa" w:w="90"/>
+              <w:bottom w:type="dxa" w:w="50"/>
+              <w:right w:type="dxa" w:w="90"/>
+            </w:tcMar>
+            <w:vAlign w:val="top"/>
+          </w:tcPr>
+          <w:p>
+            <w:pPr>
+              <w:spacing w:after="30" w:line="240"/>
+              <w:jc w:val="left"/>
+            </w:pPr>
+            <w:r>
+              <w:rPr>
+                <w:rFonts w:ascii="Times New Roman" w:cs="Times New Roman" w:eastAsia="Times New Roman" w:hAnsi="Times New Roman"/>
+                <w:sz w:val="19"/>
+                <w:szCs w:val="19"/>
+              </w:rPr>
+              <w:t>High</w:t>
             </w:r>
           </w:p>
         </w:tc>
@@ -18380,7 +19595,7 @@
                 <w:sz w:val="19"/>
                 <w:szCs w:val="19"/>
               </w:rPr>
-              <w:t xml:space="preserve">After a 30-minute walkthrough, at least 90% of first-time users shall complete patient registration and appointment booking, each within 2 minutes; every screen shall show numbered options with "0" for Back, and every error message shall name the field and the rule violated.</w:t>
+              <w:t>After a 30-minute walkthrough, at least 90% of first-time users shall complete patient registration and appointment booking, each within 2 minutes; every page shall be reachable from the sidebar, every form shall have a Cancel button, and every error message shall name the field and the rule violated.</w:t>
             </w:r>
           </w:p>
         </w:tc>
@@ -18483,7 +19698,7 @@
                 <w:sz w:val="19"/>
                 <w:szCs w:val="19"/>
               </w:rPr>
-              <w:t xml:space="preserve">The same source code shall compile without modification using g++ 11 or later (C++17) on Ubuntu 22.04 and on Windows 10/11 (MSYS2 g++ or MSVC 2019), and shall pass the same system tests on both.</w:t>
+              <w:t>The same source code shall compile without modification using g++ 11 or later (C++17) on Ubuntu 22.04 and on Windows 10/11 (MSYS2 g++ or MSVC 2019), and shall pass the same system tests on both; the website shall work in current versions of Chrome, Edge and Firefox.</w:t>
             </w:r>
           </w:p>
         </w:tc>
@@ -21226,15 +22441,7 @@
           <w:sz w:val="23"/>
           <w:szCs w:val="23"/>
         </w:rPr>
-        <w:t xml:space="preserve">Domain requirements.</w:t>
-      </w:r>
-      <w:r>
-        <w:rPr>
-          <w:rFonts w:ascii="Times New Roman" w:cs="Times New Roman" w:eastAsia="Times New Roman" w:hAnsi="Times New Roman"/>
-          <w:sz w:val="23"/>
-          <w:szCs w:val="23"/>
-        </w:rPr>
-        <w:t xml:space="preserve"> Patient identification uses a unique Patient ID, not the name; blood group values are limited to A+, A−, B+, B−, AB+, AB−, O+, O−; ages shown to doctors are computed from the date of birth; medicine dosage and duration are free text within the stated limits (no drug-interaction checking in release 1.0).</w:t>
+        <w:t>Domain requirements. Patient identification uses a unique Patient ID, not the name; blood group values are limited to A+, A−, B+, B−, AB+, AB−, O+, O−; ages shown to doctors are computed from the date of birth; medicine dosage and duration are free text within the stated limits (no drug-interaction checking in release 1.1).</w:t>
       </w:r>
     </w:p>
     <w:p>
@@ -21311,15 +22518,7 @@
           <w:sz w:val="23"/>
           <w:szCs w:val="23"/>
         </w:rPr>
-        <w:t xml:space="preserve">Internationalisation:</w:t>
-      </w:r>
-      <w:r>
-        <w:rPr>
-          <w:rFonts w:ascii="Times New Roman" w:cs="Times New Roman" w:eastAsia="Times New Roman" w:hAnsi="Times New Roman"/>
-          <w:sz w:val="23"/>
-          <w:szCs w:val="23"/>
-        </w:rPr>
-        <w:t xml:space="preserve"> English only; dates in YYYY-MM-DD, times in 24-hour HH:MM; no support for other languages in release 1.0.</w:t>
+        <w:t>Internationalisation: English only; dates in YYYY-MM-DD, times in 24-hour HH:MM; no support for other languages in release 1.1.</w:t>
       </w:r>
     </w:p>
     <w:p>
@@ -21367,15 +22566,7 @@
           <w:sz w:val="23"/>
           <w:szCs w:val="23"/>
         </w:rPr>
-        <w:t xml:space="preserve">Reuse:</w:t>
-      </w:r>
-      <w:r>
-        <w:rPr>
-          <w:rFonts w:ascii="Times New Roman" w:cs="Times New Roman" w:eastAsia="Times New Roman" w:hAnsi="Times New Roman"/>
-          <w:sz w:val="23"/>
-          <w:szCs w:val="23"/>
-        </w:rPr>
-        <w:t xml:space="preserve"> the service and repository layers shall not depend on the console, so that a different user interface can reuse them in a later release.</w:t>
+        <w:t>Reuse: the service and repository layers shall not depend on the user interface; the website reaches them only through the local web API (SAD 4.3.8).</w:t>
       </w:r>
     </w:p>
     <w:p>
@@ -32656,7 +33847,7 @@
                 <w:sz w:val="15"/>
                 <w:szCs w:val="15"/>
               </w:rPr>
-              <w:t xml:space="preserve">access_control.cpp, menu_controller.cpp</w:t>
+              <w:t>access_control.cpp, Layout.tsx, App.tsx</w:t>
             </w:r>
           </w:p>
         </w:tc>
@@ -41469,7 +42660,7 @@
                 <w:sz w:val="15"/>
                 <w:szCs w:val="15"/>
               </w:rPr>
-              <w:t xml:space="preserve">console_ui.cpp, menu_controller.cpp</w:t>
+              <w:t>LoginPage.tsx, api.cpp</w:t>
             </w:r>
           </w:p>
         </w:tc>
@@ -42537,7 +43728,7 @@
                 <w:sz w:val="15"/>
                 <w:szCs w:val="15"/>
               </w:rPr>
-              <w:t xml:space="preserve">consultation_service.cpp, menu_controller.cpp</w:t>
+              <w:t>consultation_service.cpp, ConsultationsPage.tsx</w:t>
             </w:r>
           </w:p>
         </w:tc>
@@ -43870,7 +45061,7 @@
                 <w:sz w:val="15"/>
                 <w:szCs w:val="15"/>
               </w:rPr>
-              <w:t xml:space="preserve">console_ui.cpp</w:t>
+              <w:t>api.cpp, auth.tsx</w:t>
             </w:r>
           </w:p>
         </w:tc>
@@ -45007,10 +46198,1590 @@
           </w:p>
         </w:tc>
       </w:tr>
+      <w:tr>
+        <w:trPr>
+          <w:cantSplit/>
+        </w:trPr>
+        <w:tc>
+          <w:tcPr>
+            <w:tcW w:type="dxa" w:w="450"/>
+            <w:tcBorders>
+              <w:top w:val="single" w:color="808080" w:sz="4"/>
+              <w:left w:val="single" w:color="808080" w:sz="4"/>
+              <w:bottom w:val="single" w:color="808080" w:sz="4"/>
+              <w:right w:val="single" w:color="808080" w:sz="4"/>
+            </w:tcBorders>
+            <w:tcMar>
+              <w:top w:type="dxa" w:w="50"/>
+              <w:left w:type="dxa" w:w="90"/>
+              <w:bottom w:type="dxa" w:w="50"/>
+              <w:right w:type="dxa" w:w="90"/>
+            </w:tcMar>
+            <w:vAlign w:val="top"/>
+          </w:tcPr>
+          <w:p>
+            <w:pPr>
+              <w:spacing w:after="30" w:line="240"/>
+              <w:jc w:val="left"/>
+            </w:pPr>
+            <w:r>
+              <w:rPr>
+                <w:rFonts w:ascii="Times New Roman" w:cs="Times New Roman" w:eastAsia="Times New Roman" w:hAnsi="Times New Roman"/>
+                <w:sz w:val="15"/>
+                <w:szCs w:val="15"/>
+              </w:rPr>
+              <w:t>50</w:t>
+            </w:r>
+          </w:p>
+        </w:tc>
+        <w:tc>
+          <w:tcPr>
+            <w:tcW w:type="dxa" w:w="1150"/>
+            <w:tcBorders>
+              <w:top w:val="single" w:color="808080" w:sz="4"/>
+              <w:left w:val="single" w:color="808080" w:sz="4"/>
+              <w:bottom w:val="single" w:color="808080" w:sz="4"/>
+              <w:right w:val="single" w:color="808080" w:sz="4"/>
+            </w:tcBorders>
+            <w:tcMar>
+              <w:top w:type="dxa" w:w="50"/>
+              <w:left w:type="dxa" w:w="90"/>
+              <w:bottom w:type="dxa" w:w="50"/>
+              <w:right w:type="dxa" w:w="90"/>
+            </w:tcMar>
+            <w:vAlign w:val="top"/>
+          </w:tcPr>
+          <w:p>
+            <w:pPr>
+              <w:spacing w:after="30" w:line="240"/>
+              <w:jc w:val="left"/>
+            </w:pPr>
+            <w:r>
+              <w:rPr>
+                <w:rFonts w:ascii="Times New Roman" w:cs="Times New Roman" w:eastAsia="Times New Roman" w:hAnsi="Times New Roman"/>
+                <w:b/>
+                <w:bCs/>
+                <w:sz w:val="15"/>
+                <w:szCs w:val="15"/>
+              </w:rPr>
+              <w:t>HMS-F-070</w:t>
+            </w:r>
+          </w:p>
+        </w:tc>
+        <w:tc>
+          <w:tcPr>
+            <w:tcW w:type="dxa" w:w="1650"/>
+            <w:tcBorders>
+              <w:top w:val="single" w:color="808080" w:sz="4"/>
+              <w:left w:val="single" w:color="808080" w:sz="4"/>
+              <w:bottom w:val="single" w:color="808080" w:sz="4"/>
+              <w:right w:val="single" w:color="808080" w:sz="4"/>
+            </w:tcBorders>
+            <w:tcMar>
+              <w:top w:type="dxa" w:w="50"/>
+              <w:left w:type="dxa" w:w="90"/>
+              <w:bottom w:type="dxa" w:w="50"/>
+              <w:right w:type="dxa" w:w="90"/>
+            </w:tcMar>
+            <w:vAlign w:val="top"/>
+          </w:tcPr>
+          <w:p>
+            <w:pPr>
+              <w:spacing w:after="30" w:line="240"/>
+              <w:jc w:val="left"/>
+            </w:pPr>
+            <w:r>
+              <w:rPr>
+                <w:rFonts w:ascii="Times New Roman" w:cs="Times New Roman" w:eastAsia="Times New Roman" w:hAnsi="Times New Roman"/>
+                <w:sz w:val="15"/>
+                <w:szCs w:val="15"/>
+              </w:rPr>
+              <w:t>Website, login page, role sidebar</w:t>
+            </w:r>
+          </w:p>
+        </w:tc>
+        <w:tc>
+          <w:tcPr>
+            <w:tcW w:type="dxa" w:w="850"/>
+            <w:tcBorders>
+              <w:top w:val="single" w:color="808080" w:sz="4"/>
+              <w:left w:val="single" w:color="808080" w:sz="4"/>
+              <w:bottom w:val="single" w:color="808080" w:sz="4"/>
+              <w:right w:val="single" w:color="808080" w:sz="4"/>
+            </w:tcBorders>
+            <w:tcMar>
+              <w:top w:type="dxa" w:w="50"/>
+              <w:left w:type="dxa" w:w="90"/>
+              <w:bottom w:type="dxa" w:w="50"/>
+              <w:right w:type="dxa" w:w="90"/>
+            </w:tcMar>
+            <w:vAlign w:val="top"/>
+          </w:tcPr>
+          <w:p>
+            <w:pPr>
+              <w:spacing w:after="30" w:line="240"/>
+              <w:jc w:val="left"/>
+            </w:pPr>
+            <w:r>
+              <w:rPr>
+                <w:rFonts w:ascii="Times New Roman" w:cs="Times New Roman" w:eastAsia="Times New Roman" w:hAnsi="Times New Roman"/>
+                <w:sz w:val="15"/>
+                <w:szCs w:val="15"/>
+              </w:rPr>
+              <w:t>C1, C16</w:t>
+            </w:r>
+          </w:p>
+        </w:tc>
+        <w:tc>
+          <w:tcPr>
+            <w:tcW w:type="dxa" w:w="1750"/>
+            <w:tcBorders>
+              <w:top w:val="single" w:color="808080" w:sz="4"/>
+              <w:left w:val="single" w:color="808080" w:sz="4"/>
+              <w:bottom w:val="single" w:color="808080" w:sz="4"/>
+              <w:right w:val="single" w:color="808080" w:sz="4"/>
+            </w:tcBorders>
+            <w:tcMar>
+              <w:top w:type="dxa" w:w="50"/>
+              <w:left w:type="dxa" w:w="90"/>
+              <w:bottom w:type="dxa" w:w="50"/>
+              <w:right w:type="dxa" w:w="90"/>
+            </w:tcMar>
+            <w:vAlign w:val="top"/>
+          </w:tcPr>
+          <w:p>
+            <w:pPr>
+              <w:spacing w:after="30" w:line="240"/>
+              <w:jc w:val="left"/>
+            </w:pPr>
+            <w:r>
+              <w:rPr>
+                <w:rFonts w:ascii="Times New Roman" w:cs="Times New Roman" w:eastAsia="Times New Roman" w:hAnsi="Times New Roman"/>
+                <w:sz w:val="15"/>
+                <w:szCs w:val="15"/>
+              </w:rPr>
+              <w:t>SAD 3.3, 4.3.8, 4.5</w:t>
+            </w:r>
+          </w:p>
+        </w:tc>
+        <w:tc>
+          <w:tcPr>
+            <w:tcW w:type="dxa" w:w="1500"/>
+            <w:tcBorders>
+              <w:top w:val="single" w:color="808080" w:sz="4"/>
+              <w:left w:val="single" w:color="808080" w:sz="4"/>
+              <w:bottom w:val="single" w:color="808080" w:sz="4"/>
+              <w:right w:val="single" w:color="808080" w:sz="4"/>
+            </w:tcBorders>
+            <w:tcMar>
+              <w:top w:type="dxa" w:w="50"/>
+              <w:left w:type="dxa" w:w="90"/>
+              <w:bottom w:type="dxa" w:w="50"/>
+              <w:right w:type="dxa" w:w="90"/>
+            </w:tcMar>
+            <w:vAlign w:val="top"/>
+          </w:tcPr>
+          <w:p>
+            <w:pPr>
+              <w:spacing w:after="30" w:line="240"/>
+              <w:jc w:val="left"/>
+            </w:pPr>
+            <w:r>
+              <w:rPr>
+                <w:rFonts w:ascii="Times New Roman" w:cs="Times New Roman" w:eastAsia="Times New Roman" w:hAnsi="Times New Roman"/>
+                <w:sz w:val="15"/>
+                <w:szCs w:val="15"/>
+              </w:rPr>
+              <w:t>api.cpp, routes_status.cpp, App.tsx, Layout.tsx</w:t>
+            </w:r>
+          </w:p>
+        </w:tc>
+        <w:tc>
+          <w:tcPr>
+            <w:tcW w:type="dxa" w:w="900"/>
+            <w:tcBorders>
+              <w:top w:val="single" w:color="808080" w:sz="4"/>
+              <w:left w:val="single" w:color="808080" w:sz="4"/>
+              <w:bottom w:val="single" w:color="808080" w:sz="4"/>
+              <w:right w:val="single" w:color="808080" w:sz="4"/>
+            </w:tcBorders>
+            <w:tcMar>
+              <w:top w:type="dxa" w:w="50"/>
+              <w:left w:type="dxa" w:w="90"/>
+              <w:bottom w:type="dxa" w:w="50"/>
+              <w:right w:type="dxa" w:w="90"/>
+            </w:tcMar>
+            <w:vAlign w:val="top"/>
+          </w:tcPr>
+          <w:p>
+            <w:pPr>
+              <w:spacing w:after="30" w:line="240"/>
+              <w:jc w:val="left"/>
+            </w:pPr>
+            <w:r>
+              <w:rPr>
+                <w:rFonts w:ascii="Times New Roman" w:cs="Times New Roman" w:eastAsia="Times New Roman" w:hAnsi="Times New Roman"/>
+                <w:sz w:val="15"/>
+                <w:szCs w:val="15"/>
+              </w:rPr>
+              <w:t>UT-WEB</w:t>
+            </w:r>
+          </w:p>
+        </w:tc>
+        <w:tc>
+          <w:tcPr>
+            <w:tcW w:type="dxa" w:w="1496"/>
+            <w:tcBorders>
+              <w:top w:val="single" w:color="808080" w:sz="4"/>
+              <w:left w:val="single" w:color="808080" w:sz="4"/>
+              <w:bottom w:val="single" w:color="808080" w:sz="4"/>
+              <w:right w:val="single" w:color="808080" w:sz="4"/>
+            </w:tcBorders>
+            <w:tcMar>
+              <w:top w:type="dxa" w:w="50"/>
+              <w:left w:type="dxa" w:w="90"/>
+              <w:bottom w:type="dxa" w:w="50"/>
+              <w:right w:type="dxa" w:w="90"/>
+            </w:tcMar>
+            <w:vAlign w:val="top"/>
+          </w:tcPr>
+          <w:p>
+            <w:pPr>
+              <w:spacing w:after="30" w:line="240"/>
+              <w:jc w:val="left"/>
+            </w:pPr>
+            <w:r>
+              <w:rPr>
+                <w:rFonts w:ascii="Times New Roman" w:cs="Times New Roman" w:eastAsia="Times New Roman" w:hAnsi="Times New Roman"/>
+                <w:sz w:val="15"/>
+                <w:szCs w:val="15"/>
+              </w:rPr>
+              <w:t>TC-WEB-01</w:t>
+            </w:r>
+          </w:p>
+        </w:tc>
+      </w:tr>
+      <w:tr>
+        <w:trPr>
+          <w:cantSplit/>
+        </w:trPr>
+        <w:tc>
+          <w:tcPr>
+            <w:tcW w:type="dxa" w:w="450"/>
+            <w:tcBorders>
+              <w:top w:val="single" w:color="808080" w:sz="4"/>
+              <w:left w:val="single" w:color="808080" w:sz="4"/>
+              <w:bottom w:val="single" w:color="808080" w:sz="4"/>
+              <w:right w:val="single" w:color="808080" w:sz="4"/>
+            </w:tcBorders>
+            <w:tcMar>
+              <w:top w:type="dxa" w:w="50"/>
+              <w:left w:type="dxa" w:w="90"/>
+              <w:bottom w:type="dxa" w:w="50"/>
+              <w:right w:type="dxa" w:w="90"/>
+            </w:tcMar>
+            <w:vAlign w:val="top"/>
+          </w:tcPr>
+          <w:p>
+            <w:pPr>
+              <w:spacing w:after="30" w:line="240"/>
+              <w:jc w:val="left"/>
+            </w:pPr>
+            <w:r>
+              <w:rPr>
+                <w:rFonts w:ascii="Times New Roman" w:cs="Times New Roman" w:eastAsia="Times New Roman" w:hAnsi="Times New Roman"/>
+                <w:sz w:val="15"/>
+                <w:szCs w:val="15"/>
+              </w:rPr>
+              <w:t>51</w:t>
+            </w:r>
+          </w:p>
+        </w:tc>
+        <w:tc>
+          <w:tcPr>
+            <w:tcW w:type="dxa" w:w="1150"/>
+            <w:tcBorders>
+              <w:top w:val="single" w:color="808080" w:sz="4"/>
+              <w:left w:val="single" w:color="808080" w:sz="4"/>
+              <w:bottom w:val="single" w:color="808080" w:sz="4"/>
+              <w:right w:val="single" w:color="808080" w:sz="4"/>
+            </w:tcBorders>
+            <w:tcMar>
+              <w:top w:type="dxa" w:w="50"/>
+              <w:left w:type="dxa" w:w="90"/>
+              <w:bottom w:type="dxa" w:w="50"/>
+              <w:right w:type="dxa" w:w="90"/>
+            </w:tcMar>
+            <w:vAlign w:val="top"/>
+          </w:tcPr>
+          <w:p>
+            <w:pPr>
+              <w:spacing w:after="30" w:line="240"/>
+              <w:jc w:val="left"/>
+            </w:pPr>
+            <w:r>
+              <w:rPr>
+                <w:rFonts w:ascii="Times New Roman" w:cs="Times New Roman" w:eastAsia="Times New Roman" w:hAnsi="Times New Roman"/>
+                <w:b/>
+                <w:bCs/>
+                <w:sz w:val="15"/>
+                <w:szCs w:val="15"/>
+              </w:rPr>
+              <w:t>HMS-F-071</w:t>
+            </w:r>
+          </w:p>
+        </w:tc>
+        <w:tc>
+          <w:tcPr>
+            <w:tcW w:type="dxa" w:w="1650"/>
+            <w:tcBorders>
+              <w:top w:val="single" w:color="808080" w:sz="4"/>
+              <w:left w:val="single" w:color="808080" w:sz="4"/>
+              <w:bottom w:val="single" w:color="808080" w:sz="4"/>
+              <w:right w:val="single" w:color="808080" w:sz="4"/>
+            </w:tcBorders>
+            <w:tcMar>
+              <w:top w:type="dxa" w:w="50"/>
+              <w:left w:type="dxa" w:w="90"/>
+              <w:bottom w:type="dxa" w:w="50"/>
+              <w:right w:type="dxa" w:w="90"/>
+            </w:tcMar>
+            <w:vAlign w:val="top"/>
+          </w:tcPr>
+          <w:p>
+            <w:pPr>
+              <w:spacing w:after="30" w:line="240"/>
+              <w:jc w:val="left"/>
+            </w:pPr>
+            <w:r>
+              <w:rPr>
+                <w:rFonts w:ascii="Times New Roman" w:cs="Times New Roman" w:eastAsia="Times New Roman" w:hAnsi="Times New Roman"/>
+                <w:sz w:val="15"/>
+                <w:szCs w:val="15"/>
+              </w:rPr>
+              <w:t>Users, audit log, password pages</w:t>
+            </w:r>
+          </w:p>
+        </w:tc>
+        <w:tc>
+          <w:tcPr>
+            <w:tcW w:type="dxa" w:w="850"/>
+            <w:tcBorders>
+              <w:top w:val="single" w:color="808080" w:sz="4"/>
+              <w:left w:val="single" w:color="808080" w:sz="4"/>
+              <w:bottom w:val="single" w:color="808080" w:sz="4"/>
+              <w:right w:val="single" w:color="808080" w:sz="4"/>
+            </w:tcBorders>
+            <w:tcMar>
+              <w:top w:type="dxa" w:w="50"/>
+              <w:left w:type="dxa" w:w="90"/>
+              <w:bottom w:type="dxa" w:w="50"/>
+              <w:right w:type="dxa" w:w="90"/>
+            </w:tcMar>
+            <w:vAlign w:val="top"/>
+          </w:tcPr>
+          <w:p>
+            <w:pPr>
+              <w:spacing w:after="30" w:line="240"/>
+              <w:jc w:val="left"/>
+            </w:pPr>
+            <w:r>
+              <w:rPr>
+                <w:rFonts w:ascii="Times New Roman" w:cs="Times New Roman" w:eastAsia="Times New Roman" w:hAnsi="Times New Roman"/>
+                <w:sz w:val="15"/>
+                <w:szCs w:val="15"/>
+              </w:rPr>
+              <w:t>C1, C16, C3, C12</w:t>
+            </w:r>
+          </w:p>
+        </w:tc>
+        <w:tc>
+          <w:tcPr>
+            <w:tcW w:type="dxa" w:w="1750"/>
+            <w:tcBorders>
+              <w:top w:val="single" w:color="808080" w:sz="4"/>
+              <w:left w:val="single" w:color="808080" w:sz="4"/>
+              <w:bottom w:val="single" w:color="808080" w:sz="4"/>
+              <w:right w:val="single" w:color="808080" w:sz="4"/>
+            </w:tcBorders>
+            <w:tcMar>
+              <w:top w:type="dxa" w:w="50"/>
+              <w:left w:type="dxa" w:w="90"/>
+              <w:bottom w:type="dxa" w:w="50"/>
+              <w:right w:type="dxa" w:w="90"/>
+            </w:tcMar>
+            <w:vAlign w:val="top"/>
+          </w:tcPr>
+          <w:p>
+            <w:pPr>
+              <w:spacing w:after="30" w:line="240"/>
+              <w:jc w:val="left"/>
+            </w:pPr>
+            <w:r>
+              <w:rPr>
+                <w:rFonts w:ascii="Times New Roman" w:cs="Times New Roman" w:eastAsia="Times New Roman" w:hAnsi="Times New Roman"/>
+                <w:sz w:val="15"/>
+                <w:szCs w:val="15"/>
+              </w:rPr>
+              <w:t>SAD 4.3.8, 4.5</w:t>
+            </w:r>
+          </w:p>
+        </w:tc>
+        <w:tc>
+          <w:tcPr>
+            <w:tcW w:type="dxa" w:w="1500"/>
+            <w:tcBorders>
+              <w:top w:val="single" w:color="808080" w:sz="4"/>
+              <w:left w:val="single" w:color="808080" w:sz="4"/>
+              <w:bottom w:val="single" w:color="808080" w:sz="4"/>
+              <w:right w:val="single" w:color="808080" w:sz="4"/>
+            </w:tcBorders>
+            <w:tcMar>
+              <w:top w:type="dxa" w:w="50"/>
+              <w:left w:type="dxa" w:w="90"/>
+              <w:bottom w:type="dxa" w:w="50"/>
+              <w:right w:type="dxa" w:w="90"/>
+            </w:tcMar>
+            <w:vAlign w:val="top"/>
+          </w:tcPr>
+          <w:p>
+            <w:pPr>
+              <w:spacing w:after="30" w:line="240"/>
+              <w:jc w:val="left"/>
+            </w:pPr>
+            <w:r>
+              <w:rPr>
+                <w:rFonts w:ascii="Times New Roman" w:cs="Times New Roman" w:eastAsia="Times New Roman" w:hAnsi="Times New Roman"/>
+                <w:sz w:val="15"/>
+                <w:szCs w:val="15"/>
+              </w:rPr>
+              <w:t>routes_auth.cpp, UsersPage.tsx, AuditPage.tsx, PasswordPage.tsx</w:t>
+            </w:r>
+          </w:p>
+        </w:tc>
+        <w:tc>
+          <w:tcPr>
+            <w:tcW w:type="dxa" w:w="900"/>
+            <w:tcBorders>
+              <w:top w:val="single" w:color="808080" w:sz="4"/>
+              <w:left w:val="single" w:color="808080" w:sz="4"/>
+              <w:bottom w:val="single" w:color="808080" w:sz="4"/>
+              <w:right w:val="single" w:color="808080" w:sz="4"/>
+            </w:tcBorders>
+            <w:tcMar>
+              <w:top w:type="dxa" w:w="50"/>
+              <w:left w:type="dxa" w:w="90"/>
+              <w:bottom w:type="dxa" w:w="50"/>
+              <w:right w:type="dxa" w:w="90"/>
+            </w:tcMar>
+            <w:vAlign w:val="top"/>
+          </w:tcPr>
+          <w:p>
+            <w:pPr>
+              <w:spacing w:after="30" w:line="240"/>
+              <w:jc w:val="left"/>
+            </w:pPr>
+            <w:r>
+              <w:rPr>
+                <w:rFonts w:ascii="Times New Roman" w:cs="Times New Roman" w:eastAsia="Times New Roman" w:hAnsi="Times New Roman"/>
+                <w:sz w:val="15"/>
+                <w:szCs w:val="15"/>
+              </w:rPr>
+              <w:t>UT-WEB</w:t>
+            </w:r>
+          </w:p>
+        </w:tc>
+        <w:tc>
+          <w:tcPr>
+            <w:tcW w:type="dxa" w:w="1496"/>
+            <w:tcBorders>
+              <w:top w:val="single" w:color="808080" w:sz="4"/>
+              <w:left w:val="single" w:color="808080" w:sz="4"/>
+              <w:bottom w:val="single" w:color="808080" w:sz="4"/>
+              <w:right w:val="single" w:color="808080" w:sz="4"/>
+            </w:tcBorders>
+            <w:tcMar>
+              <w:top w:type="dxa" w:w="50"/>
+              <w:left w:type="dxa" w:w="90"/>
+              <w:bottom w:type="dxa" w:w="50"/>
+              <w:right w:type="dxa" w:w="90"/>
+            </w:tcMar>
+            <w:vAlign w:val="top"/>
+          </w:tcPr>
+          <w:p>
+            <w:pPr>
+              <w:spacing w:after="30" w:line="240"/>
+              <w:jc w:val="left"/>
+            </w:pPr>
+            <w:r>
+              <w:rPr>
+                <w:rFonts w:ascii="Times New Roman" w:cs="Times New Roman" w:eastAsia="Times New Roman" w:hAnsi="Times New Roman"/>
+                <w:sz w:val="15"/>
+                <w:szCs w:val="15"/>
+              </w:rPr>
+              <w:t>TC-WEB-02</w:t>
+            </w:r>
+          </w:p>
+        </w:tc>
+      </w:tr>
+      <w:tr>
+        <w:trPr>
+          <w:cantSplit/>
+        </w:trPr>
+        <w:tc>
+          <w:tcPr>
+            <w:tcW w:type="dxa" w:w="450"/>
+            <w:tcBorders>
+              <w:top w:val="single" w:color="808080" w:sz="4"/>
+              <w:left w:val="single" w:color="808080" w:sz="4"/>
+              <w:bottom w:val="single" w:color="808080" w:sz="4"/>
+              <w:right w:val="single" w:color="808080" w:sz="4"/>
+            </w:tcBorders>
+            <w:tcMar>
+              <w:top w:type="dxa" w:w="50"/>
+              <w:left w:type="dxa" w:w="90"/>
+              <w:bottom w:type="dxa" w:w="50"/>
+              <w:right w:type="dxa" w:w="90"/>
+            </w:tcMar>
+            <w:vAlign w:val="top"/>
+          </w:tcPr>
+          <w:p>
+            <w:pPr>
+              <w:spacing w:after="30" w:line="240"/>
+              <w:jc w:val="left"/>
+            </w:pPr>
+            <w:r>
+              <w:rPr>
+                <w:rFonts w:ascii="Times New Roman" w:cs="Times New Roman" w:eastAsia="Times New Roman" w:hAnsi="Times New Roman"/>
+                <w:sz w:val="15"/>
+                <w:szCs w:val="15"/>
+              </w:rPr>
+              <w:t>52</w:t>
+            </w:r>
+          </w:p>
+        </w:tc>
+        <w:tc>
+          <w:tcPr>
+            <w:tcW w:type="dxa" w:w="1150"/>
+            <w:tcBorders>
+              <w:top w:val="single" w:color="808080" w:sz="4"/>
+              <w:left w:val="single" w:color="808080" w:sz="4"/>
+              <w:bottom w:val="single" w:color="808080" w:sz="4"/>
+              <w:right w:val="single" w:color="808080" w:sz="4"/>
+            </w:tcBorders>
+            <w:tcMar>
+              <w:top w:type="dxa" w:w="50"/>
+              <w:left w:type="dxa" w:w="90"/>
+              <w:bottom w:type="dxa" w:w="50"/>
+              <w:right w:type="dxa" w:w="90"/>
+            </w:tcMar>
+            <w:vAlign w:val="top"/>
+          </w:tcPr>
+          <w:p>
+            <w:pPr>
+              <w:spacing w:after="30" w:line="240"/>
+              <w:jc w:val="left"/>
+            </w:pPr>
+            <w:r>
+              <w:rPr>
+                <w:rFonts w:ascii="Times New Roman" w:cs="Times New Roman" w:eastAsia="Times New Roman" w:hAnsi="Times New Roman"/>
+                <w:b/>
+                <w:bCs/>
+                <w:sz w:val="15"/>
+                <w:szCs w:val="15"/>
+              </w:rPr>
+              <w:t>HMS-F-072</w:t>
+            </w:r>
+          </w:p>
+        </w:tc>
+        <w:tc>
+          <w:tcPr>
+            <w:tcW w:type="dxa" w:w="1650"/>
+            <w:tcBorders>
+              <w:top w:val="single" w:color="808080" w:sz="4"/>
+              <w:left w:val="single" w:color="808080" w:sz="4"/>
+              <w:bottom w:val="single" w:color="808080" w:sz="4"/>
+              <w:right w:val="single" w:color="808080" w:sz="4"/>
+            </w:tcBorders>
+            <w:tcMar>
+              <w:top w:type="dxa" w:w="50"/>
+              <w:left w:type="dxa" w:w="90"/>
+              <w:bottom w:type="dxa" w:w="50"/>
+              <w:right w:type="dxa" w:w="90"/>
+            </w:tcMar>
+            <w:vAlign w:val="top"/>
+          </w:tcPr>
+          <w:p>
+            <w:pPr>
+              <w:spacing w:after="30" w:line="240"/>
+              <w:jc w:val="left"/>
+            </w:pPr>
+            <w:r>
+              <w:rPr>
+                <w:rFonts w:ascii="Times New Roman" w:cs="Times New Roman" w:eastAsia="Times New Roman" w:hAnsi="Times New Roman"/>
+                <w:sz w:val="15"/>
+                <w:szCs w:val="15"/>
+              </w:rPr>
+              <w:t>Patients page</w:t>
+            </w:r>
+          </w:p>
+        </w:tc>
+        <w:tc>
+          <w:tcPr>
+            <w:tcW w:type="dxa" w:w="850"/>
+            <w:tcBorders>
+              <w:top w:val="single" w:color="808080" w:sz="4"/>
+              <w:left w:val="single" w:color="808080" w:sz="4"/>
+              <w:bottom w:val="single" w:color="808080" w:sz="4"/>
+              <w:right w:val="single" w:color="808080" w:sz="4"/>
+            </w:tcBorders>
+            <w:tcMar>
+              <w:top w:type="dxa" w:w="50"/>
+              <w:left w:type="dxa" w:w="90"/>
+              <w:bottom w:type="dxa" w:w="50"/>
+              <w:right w:type="dxa" w:w="90"/>
+            </w:tcMar>
+            <w:vAlign w:val="top"/>
+          </w:tcPr>
+          <w:p>
+            <w:pPr>
+              <w:spacing w:after="30" w:line="240"/>
+              <w:jc w:val="left"/>
+            </w:pPr>
+            <w:r>
+              <w:rPr>
+                <w:rFonts w:ascii="Times New Roman" w:cs="Times New Roman" w:eastAsia="Times New Roman" w:hAnsi="Times New Roman"/>
+                <w:sz w:val="15"/>
+                <w:szCs w:val="15"/>
+              </w:rPr>
+              <w:t>C1, C16, C4</w:t>
+            </w:r>
+          </w:p>
+        </w:tc>
+        <w:tc>
+          <w:tcPr>
+            <w:tcW w:type="dxa" w:w="1750"/>
+            <w:tcBorders>
+              <w:top w:val="single" w:color="808080" w:sz="4"/>
+              <w:left w:val="single" w:color="808080" w:sz="4"/>
+              <w:bottom w:val="single" w:color="808080" w:sz="4"/>
+              <w:right w:val="single" w:color="808080" w:sz="4"/>
+            </w:tcBorders>
+            <w:tcMar>
+              <w:top w:type="dxa" w:w="50"/>
+              <w:left w:type="dxa" w:w="90"/>
+              <w:bottom w:type="dxa" w:w="50"/>
+              <w:right w:type="dxa" w:w="90"/>
+            </w:tcMar>
+            <w:vAlign w:val="top"/>
+          </w:tcPr>
+          <w:p>
+            <w:pPr>
+              <w:spacing w:after="30" w:line="240"/>
+              <w:jc w:val="left"/>
+            </w:pPr>
+            <w:r>
+              <w:rPr>
+                <w:rFonts w:ascii="Times New Roman" w:cs="Times New Roman" w:eastAsia="Times New Roman" w:hAnsi="Times New Roman"/>
+                <w:sz w:val="15"/>
+                <w:szCs w:val="15"/>
+              </w:rPr>
+              <w:t>SAD 4.3.8, 4.5</w:t>
+            </w:r>
+          </w:p>
+        </w:tc>
+        <w:tc>
+          <w:tcPr>
+            <w:tcW w:type="dxa" w:w="1500"/>
+            <w:tcBorders>
+              <w:top w:val="single" w:color="808080" w:sz="4"/>
+              <w:left w:val="single" w:color="808080" w:sz="4"/>
+              <w:bottom w:val="single" w:color="808080" w:sz="4"/>
+              <w:right w:val="single" w:color="808080" w:sz="4"/>
+            </w:tcBorders>
+            <w:tcMar>
+              <w:top w:type="dxa" w:w="50"/>
+              <w:left w:type="dxa" w:w="90"/>
+              <w:bottom w:type="dxa" w:w="50"/>
+              <w:right w:type="dxa" w:w="90"/>
+            </w:tcMar>
+            <w:vAlign w:val="top"/>
+          </w:tcPr>
+          <w:p>
+            <w:pPr>
+              <w:spacing w:after="30" w:line="240"/>
+              <w:jc w:val="left"/>
+            </w:pPr>
+            <w:r>
+              <w:rPr>
+                <w:rFonts w:ascii="Times New Roman" w:cs="Times New Roman" w:eastAsia="Times New Roman" w:hAnsi="Times New Roman"/>
+                <w:sz w:val="15"/>
+                <w:szCs w:val="15"/>
+              </w:rPr>
+              <w:t>routes_patients.cpp, PatientsPage.tsx</w:t>
+            </w:r>
+          </w:p>
+        </w:tc>
+        <w:tc>
+          <w:tcPr>
+            <w:tcW w:type="dxa" w:w="900"/>
+            <w:tcBorders>
+              <w:top w:val="single" w:color="808080" w:sz="4"/>
+              <w:left w:val="single" w:color="808080" w:sz="4"/>
+              <w:bottom w:val="single" w:color="808080" w:sz="4"/>
+              <w:right w:val="single" w:color="808080" w:sz="4"/>
+            </w:tcBorders>
+            <w:tcMar>
+              <w:top w:type="dxa" w:w="50"/>
+              <w:left w:type="dxa" w:w="90"/>
+              <w:bottom w:type="dxa" w:w="50"/>
+              <w:right w:type="dxa" w:w="90"/>
+            </w:tcMar>
+            <w:vAlign w:val="top"/>
+          </w:tcPr>
+          <w:p>
+            <w:pPr>
+              <w:spacing w:after="30" w:line="240"/>
+              <w:jc w:val="left"/>
+            </w:pPr>
+            <w:r>
+              <w:rPr>
+                <w:rFonts w:ascii="Times New Roman" w:cs="Times New Roman" w:eastAsia="Times New Roman" w:hAnsi="Times New Roman"/>
+                <w:sz w:val="15"/>
+                <w:szCs w:val="15"/>
+              </w:rPr>
+              <w:t>UT-WEB</w:t>
+            </w:r>
+          </w:p>
+        </w:tc>
+        <w:tc>
+          <w:tcPr>
+            <w:tcW w:type="dxa" w:w="1496"/>
+            <w:tcBorders>
+              <w:top w:val="single" w:color="808080" w:sz="4"/>
+              <w:left w:val="single" w:color="808080" w:sz="4"/>
+              <w:bottom w:val="single" w:color="808080" w:sz="4"/>
+              <w:right w:val="single" w:color="808080" w:sz="4"/>
+            </w:tcBorders>
+            <w:tcMar>
+              <w:top w:type="dxa" w:w="50"/>
+              <w:left w:type="dxa" w:w="90"/>
+              <w:bottom w:type="dxa" w:w="50"/>
+              <w:right w:type="dxa" w:w="90"/>
+            </w:tcMar>
+            <w:vAlign w:val="top"/>
+          </w:tcPr>
+          <w:p>
+            <w:pPr>
+              <w:spacing w:after="30" w:line="240"/>
+              <w:jc w:val="left"/>
+            </w:pPr>
+            <w:r>
+              <w:rPr>
+                <w:rFonts w:ascii="Times New Roman" w:cs="Times New Roman" w:eastAsia="Times New Roman" w:hAnsi="Times New Roman"/>
+                <w:sz w:val="15"/>
+                <w:szCs w:val="15"/>
+              </w:rPr>
+              <w:t>TC-WEB-03</w:t>
+            </w:r>
+          </w:p>
+        </w:tc>
+      </w:tr>
+      <w:tr>
+        <w:trPr>
+          <w:cantSplit/>
+        </w:trPr>
+        <w:tc>
+          <w:tcPr>
+            <w:tcW w:type="dxa" w:w="450"/>
+            <w:tcBorders>
+              <w:top w:val="single" w:color="808080" w:sz="4"/>
+              <w:left w:val="single" w:color="808080" w:sz="4"/>
+              <w:bottom w:val="single" w:color="808080" w:sz="4"/>
+              <w:right w:val="single" w:color="808080" w:sz="4"/>
+            </w:tcBorders>
+            <w:tcMar>
+              <w:top w:type="dxa" w:w="50"/>
+              <w:left w:type="dxa" w:w="90"/>
+              <w:bottom w:type="dxa" w:w="50"/>
+              <w:right w:type="dxa" w:w="90"/>
+            </w:tcMar>
+            <w:vAlign w:val="top"/>
+          </w:tcPr>
+          <w:p>
+            <w:pPr>
+              <w:spacing w:after="30" w:line="240"/>
+              <w:jc w:val="left"/>
+            </w:pPr>
+            <w:r>
+              <w:rPr>
+                <w:rFonts w:ascii="Times New Roman" w:cs="Times New Roman" w:eastAsia="Times New Roman" w:hAnsi="Times New Roman"/>
+                <w:sz w:val="15"/>
+                <w:szCs w:val="15"/>
+              </w:rPr>
+              <w:t>53</w:t>
+            </w:r>
+          </w:p>
+        </w:tc>
+        <w:tc>
+          <w:tcPr>
+            <w:tcW w:type="dxa" w:w="1150"/>
+            <w:tcBorders>
+              <w:top w:val="single" w:color="808080" w:sz="4"/>
+              <w:left w:val="single" w:color="808080" w:sz="4"/>
+              <w:bottom w:val="single" w:color="808080" w:sz="4"/>
+              <w:right w:val="single" w:color="808080" w:sz="4"/>
+            </w:tcBorders>
+            <w:tcMar>
+              <w:top w:type="dxa" w:w="50"/>
+              <w:left w:type="dxa" w:w="90"/>
+              <w:bottom w:type="dxa" w:w="50"/>
+              <w:right w:type="dxa" w:w="90"/>
+            </w:tcMar>
+            <w:vAlign w:val="top"/>
+          </w:tcPr>
+          <w:p>
+            <w:pPr>
+              <w:spacing w:after="30" w:line="240"/>
+              <w:jc w:val="left"/>
+            </w:pPr>
+            <w:r>
+              <w:rPr>
+                <w:rFonts w:ascii="Times New Roman" w:cs="Times New Roman" w:eastAsia="Times New Roman" w:hAnsi="Times New Roman"/>
+                <w:b/>
+                <w:bCs/>
+                <w:sz w:val="15"/>
+                <w:szCs w:val="15"/>
+              </w:rPr>
+              <w:t>HMS-F-073</w:t>
+            </w:r>
+          </w:p>
+        </w:tc>
+        <w:tc>
+          <w:tcPr>
+            <w:tcW w:type="dxa" w:w="1650"/>
+            <w:tcBorders>
+              <w:top w:val="single" w:color="808080" w:sz="4"/>
+              <w:left w:val="single" w:color="808080" w:sz="4"/>
+              <w:bottom w:val="single" w:color="808080" w:sz="4"/>
+              <w:right w:val="single" w:color="808080" w:sz="4"/>
+            </w:tcBorders>
+            <w:tcMar>
+              <w:top w:type="dxa" w:w="50"/>
+              <w:left w:type="dxa" w:w="90"/>
+              <w:bottom w:type="dxa" w:w="50"/>
+              <w:right w:type="dxa" w:w="90"/>
+            </w:tcMar>
+            <w:vAlign w:val="top"/>
+          </w:tcPr>
+          <w:p>
+            <w:pPr>
+              <w:spacing w:after="30" w:line="240"/>
+              <w:jc w:val="left"/>
+            </w:pPr>
+            <w:r>
+              <w:rPr>
+                <w:rFonts w:ascii="Times New Roman" w:cs="Times New Roman" w:eastAsia="Times New Roman" w:hAnsi="Times New Roman"/>
+                <w:sz w:val="15"/>
+                <w:szCs w:val="15"/>
+              </w:rPr>
+              <w:t>Doctors, appointments, schedule pages</w:t>
+            </w:r>
+          </w:p>
+        </w:tc>
+        <w:tc>
+          <w:tcPr>
+            <w:tcW w:type="dxa" w:w="850"/>
+            <w:tcBorders>
+              <w:top w:val="single" w:color="808080" w:sz="4"/>
+              <w:left w:val="single" w:color="808080" w:sz="4"/>
+              <w:bottom w:val="single" w:color="808080" w:sz="4"/>
+              <w:right w:val="single" w:color="808080" w:sz="4"/>
+            </w:tcBorders>
+            <w:tcMar>
+              <w:top w:type="dxa" w:w="50"/>
+              <w:left w:type="dxa" w:w="90"/>
+              <w:bottom w:type="dxa" w:w="50"/>
+              <w:right w:type="dxa" w:w="90"/>
+            </w:tcMar>
+            <w:vAlign w:val="top"/>
+          </w:tcPr>
+          <w:p>
+            <w:pPr>
+              <w:spacing w:after="30" w:line="240"/>
+              <w:jc w:val="left"/>
+            </w:pPr>
+            <w:r>
+              <w:rPr>
+                <w:rFonts w:ascii="Times New Roman" w:cs="Times New Roman" w:eastAsia="Times New Roman" w:hAnsi="Times New Roman"/>
+                <w:sz w:val="15"/>
+                <w:szCs w:val="15"/>
+              </w:rPr>
+              <w:t>C1, C16, C5, C6</w:t>
+            </w:r>
+          </w:p>
+        </w:tc>
+        <w:tc>
+          <w:tcPr>
+            <w:tcW w:type="dxa" w:w="1750"/>
+            <w:tcBorders>
+              <w:top w:val="single" w:color="808080" w:sz="4"/>
+              <w:left w:val="single" w:color="808080" w:sz="4"/>
+              <w:bottom w:val="single" w:color="808080" w:sz="4"/>
+              <w:right w:val="single" w:color="808080" w:sz="4"/>
+            </w:tcBorders>
+            <w:tcMar>
+              <w:top w:type="dxa" w:w="50"/>
+              <w:left w:type="dxa" w:w="90"/>
+              <w:bottom w:type="dxa" w:w="50"/>
+              <w:right w:type="dxa" w:w="90"/>
+            </w:tcMar>
+            <w:vAlign w:val="top"/>
+          </w:tcPr>
+          <w:p>
+            <w:pPr>
+              <w:spacing w:after="30" w:line="240"/>
+              <w:jc w:val="left"/>
+            </w:pPr>
+            <w:r>
+              <w:rPr>
+                <w:rFonts w:ascii="Times New Roman" w:cs="Times New Roman" w:eastAsia="Times New Roman" w:hAnsi="Times New Roman"/>
+                <w:sz w:val="15"/>
+                <w:szCs w:val="15"/>
+              </w:rPr>
+              <w:t>SAD 4.3.8, 4.5</w:t>
+            </w:r>
+          </w:p>
+        </w:tc>
+        <w:tc>
+          <w:tcPr>
+            <w:tcW w:type="dxa" w:w="1500"/>
+            <w:tcBorders>
+              <w:top w:val="single" w:color="808080" w:sz="4"/>
+              <w:left w:val="single" w:color="808080" w:sz="4"/>
+              <w:bottom w:val="single" w:color="808080" w:sz="4"/>
+              <w:right w:val="single" w:color="808080" w:sz="4"/>
+            </w:tcBorders>
+            <w:tcMar>
+              <w:top w:type="dxa" w:w="50"/>
+              <w:left w:type="dxa" w:w="90"/>
+              <w:bottom w:type="dxa" w:w="50"/>
+              <w:right w:type="dxa" w:w="90"/>
+            </w:tcMar>
+            <w:vAlign w:val="top"/>
+          </w:tcPr>
+          <w:p>
+            <w:pPr>
+              <w:spacing w:after="30" w:line="240"/>
+              <w:jc w:val="left"/>
+            </w:pPr>
+            <w:r>
+              <w:rPr>
+                <w:rFonts w:ascii="Times New Roman" w:cs="Times New Roman" w:eastAsia="Times New Roman" w:hAnsi="Times New Roman"/>
+                <w:sz w:val="15"/>
+                <w:szCs w:val="15"/>
+              </w:rPr>
+              <w:t>routes_doctors.cpp, routes_appointments.cpp, DoctorsPage.tsx, AppointmentsPage.tsx, SchedulePage.tsx</w:t>
+            </w:r>
+          </w:p>
+        </w:tc>
+        <w:tc>
+          <w:tcPr>
+            <w:tcW w:type="dxa" w:w="900"/>
+            <w:tcBorders>
+              <w:top w:val="single" w:color="808080" w:sz="4"/>
+              <w:left w:val="single" w:color="808080" w:sz="4"/>
+              <w:bottom w:val="single" w:color="808080" w:sz="4"/>
+              <w:right w:val="single" w:color="808080" w:sz="4"/>
+            </w:tcBorders>
+            <w:tcMar>
+              <w:top w:type="dxa" w:w="50"/>
+              <w:left w:type="dxa" w:w="90"/>
+              <w:bottom w:type="dxa" w:w="50"/>
+              <w:right w:type="dxa" w:w="90"/>
+            </w:tcMar>
+            <w:vAlign w:val="top"/>
+          </w:tcPr>
+          <w:p>
+            <w:pPr>
+              <w:spacing w:after="30" w:line="240"/>
+              <w:jc w:val="left"/>
+            </w:pPr>
+            <w:r>
+              <w:rPr>
+                <w:rFonts w:ascii="Times New Roman" w:cs="Times New Roman" w:eastAsia="Times New Roman" w:hAnsi="Times New Roman"/>
+                <w:sz w:val="15"/>
+                <w:szCs w:val="15"/>
+              </w:rPr>
+              <w:t>UT-WEB</w:t>
+            </w:r>
+          </w:p>
+        </w:tc>
+        <w:tc>
+          <w:tcPr>
+            <w:tcW w:type="dxa" w:w="1496"/>
+            <w:tcBorders>
+              <w:top w:val="single" w:color="808080" w:sz="4"/>
+              <w:left w:val="single" w:color="808080" w:sz="4"/>
+              <w:bottom w:val="single" w:color="808080" w:sz="4"/>
+              <w:right w:val="single" w:color="808080" w:sz="4"/>
+            </w:tcBorders>
+            <w:tcMar>
+              <w:top w:type="dxa" w:w="50"/>
+              <w:left w:type="dxa" w:w="90"/>
+              <w:bottom w:type="dxa" w:w="50"/>
+              <w:right w:type="dxa" w:w="90"/>
+            </w:tcMar>
+            <w:vAlign w:val="top"/>
+          </w:tcPr>
+          <w:p>
+            <w:pPr>
+              <w:spacing w:after="30" w:line="240"/>
+              <w:jc w:val="left"/>
+            </w:pPr>
+            <w:r>
+              <w:rPr>
+                <w:rFonts w:ascii="Times New Roman" w:cs="Times New Roman" w:eastAsia="Times New Roman" w:hAnsi="Times New Roman"/>
+                <w:sz w:val="15"/>
+                <w:szCs w:val="15"/>
+              </w:rPr>
+              <w:t>TC-WEB-04</w:t>
+            </w:r>
+          </w:p>
+        </w:tc>
+      </w:tr>
+      <w:tr>
+        <w:trPr>
+          <w:cantSplit/>
+        </w:trPr>
+        <w:tc>
+          <w:tcPr>
+            <w:tcW w:type="dxa" w:w="450"/>
+            <w:tcBorders>
+              <w:top w:val="single" w:color="808080" w:sz="4"/>
+              <w:left w:val="single" w:color="808080" w:sz="4"/>
+              <w:bottom w:val="single" w:color="808080" w:sz="4"/>
+              <w:right w:val="single" w:color="808080" w:sz="4"/>
+            </w:tcBorders>
+            <w:tcMar>
+              <w:top w:type="dxa" w:w="50"/>
+              <w:left w:type="dxa" w:w="90"/>
+              <w:bottom w:type="dxa" w:w="50"/>
+              <w:right w:type="dxa" w:w="90"/>
+            </w:tcMar>
+            <w:vAlign w:val="top"/>
+          </w:tcPr>
+          <w:p>
+            <w:pPr>
+              <w:spacing w:after="30" w:line="240"/>
+              <w:jc w:val="left"/>
+            </w:pPr>
+            <w:r>
+              <w:rPr>
+                <w:rFonts w:ascii="Times New Roman" w:cs="Times New Roman" w:eastAsia="Times New Roman" w:hAnsi="Times New Roman"/>
+                <w:sz w:val="15"/>
+                <w:szCs w:val="15"/>
+              </w:rPr>
+              <w:t>54</w:t>
+            </w:r>
+          </w:p>
+        </w:tc>
+        <w:tc>
+          <w:tcPr>
+            <w:tcW w:type="dxa" w:w="1150"/>
+            <w:tcBorders>
+              <w:top w:val="single" w:color="808080" w:sz="4"/>
+              <w:left w:val="single" w:color="808080" w:sz="4"/>
+              <w:bottom w:val="single" w:color="808080" w:sz="4"/>
+              <w:right w:val="single" w:color="808080" w:sz="4"/>
+            </w:tcBorders>
+            <w:tcMar>
+              <w:top w:type="dxa" w:w="50"/>
+              <w:left w:type="dxa" w:w="90"/>
+              <w:bottom w:type="dxa" w:w="50"/>
+              <w:right w:type="dxa" w:w="90"/>
+            </w:tcMar>
+            <w:vAlign w:val="top"/>
+          </w:tcPr>
+          <w:p>
+            <w:pPr>
+              <w:spacing w:after="30" w:line="240"/>
+              <w:jc w:val="left"/>
+            </w:pPr>
+            <w:r>
+              <w:rPr>
+                <w:rFonts w:ascii="Times New Roman" w:cs="Times New Roman" w:eastAsia="Times New Roman" w:hAnsi="Times New Roman"/>
+                <w:b/>
+                <w:bCs/>
+                <w:sz w:val="15"/>
+                <w:szCs w:val="15"/>
+              </w:rPr>
+              <w:t>HMS-F-074</w:t>
+            </w:r>
+          </w:p>
+        </w:tc>
+        <w:tc>
+          <w:tcPr>
+            <w:tcW w:type="dxa" w:w="1650"/>
+            <w:tcBorders>
+              <w:top w:val="single" w:color="808080" w:sz="4"/>
+              <w:left w:val="single" w:color="808080" w:sz="4"/>
+              <w:bottom w:val="single" w:color="808080" w:sz="4"/>
+              <w:right w:val="single" w:color="808080" w:sz="4"/>
+            </w:tcBorders>
+            <w:tcMar>
+              <w:top w:type="dxa" w:w="50"/>
+              <w:left w:type="dxa" w:w="90"/>
+              <w:bottom w:type="dxa" w:w="50"/>
+              <w:right w:type="dxa" w:w="90"/>
+            </w:tcMar>
+            <w:vAlign w:val="top"/>
+          </w:tcPr>
+          <w:p>
+            <w:pPr>
+              <w:spacing w:after="30" w:line="240"/>
+              <w:jc w:val="left"/>
+            </w:pPr>
+            <w:r>
+              <w:rPr>
+                <w:rFonts w:ascii="Times New Roman" w:cs="Times New Roman" w:eastAsia="Times New Roman" w:hAnsi="Times New Roman"/>
+                <w:sz w:val="15"/>
+                <w:szCs w:val="15"/>
+              </w:rPr>
+              <w:t>Consultation, report, backup pages</w:t>
+            </w:r>
+          </w:p>
+        </w:tc>
+        <w:tc>
+          <w:tcPr>
+            <w:tcW w:type="dxa" w:w="850"/>
+            <w:tcBorders>
+              <w:top w:val="single" w:color="808080" w:sz="4"/>
+              <w:left w:val="single" w:color="808080" w:sz="4"/>
+              <w:bottom w:val="single" w:color="808080" w:sz="4"/>
+              <w:right w:val="single" w:color="808080" w:sz="4"/>
+            </w:tcBorders>
+            <w:tcMar>
+              <w:top w:type="dxa" w:w="50"/>
+              <w:left w:type="dxa" w:w="90"/>
+              <w:bottom w:type="dxa" w:w="50"/>
+              <w:right w:type="dxa" w:w="90"/>
+            </w:tcMar>
+            <w:vAlign w:val="top"/>
+          </w:tcPr>
+          <w:p>
+            <w:pPr>
+              <w:spacing w:after="30" w:line="240"/>
+              <w:jc w:val="left"/>
+            </w:pPr>
+            <w:r>
+              <w:rPr>
+                <w:rFonts w:ascii="Times New Roman" w:cs="Times New Roman" w:eastAsia="Times New Roman" w:hAnsi="Times New Roman"/>
+                <w:sz w:val="15"/>
+                <w:szCs w:val="15"/>
+              </w:rPr>
+              <w:t>C1, C16, C7, C8, C9</w:t>
+            </w:r>
+          </w:p>
+        </w:tc>
+        <w:tc>
+          <w:tcPr>
+            <w:tcW w:type="dxa" w:w="1750"/>
+            <w:tcBorders>
+              <w:top w:val="single" w:color="808080" w:sz="4"/>
+              <w:left w:val="single" w:color="808080" w:sz="4"/>
+              <w:bottom w:val="single" w:color="808080" w:sz="4"/>
+              <w:right w:val="single" w:color="808080" w:sz="4"/>
+            </w:tcBorders>
+            <w:tcMar>
+              <w:top w:type="dxa" w:w="50"/>
+              <w:left w:type="dxa" w:w="90"/>
+              <w:bottom w:type="dxa" w:w="50"/>
+              <w:right w:type="dxa" w:w="90"/>
+            </w:tcMar>
+            <w:vAlign w:val="top"/>
+          </w:tcPr>
+          <w:p>
+            <w:pPr>
+              <w:spacing w:after="30" w:line="240"/>
+              <w:jc w:val="left"/>
+            </w:pPr>
+            <w:r>
+              <w:rPr>
+                <w:rFonts w:ascii="Times New Roman" w:cs="Times New Roman" w:eastAsia="Times New Roman" w:hAnsi="Times New Roman"/>
+                <w:sz w:val="15"/>
+                <w:szCs w:val="15"/>
+              </w:rPr>
+              <w:t>SAD 4.3.8, 4.5</w:t>
+            </w:r>
+          </w:p>
+        </w:tc>
+        <w:tc>
+          <w:tcPr>
+            <w:tcW w:type="dxa" w:w="1500"/>
+            <w:tcBorders>
+              <w:top w:val="single" w:color="808080" w:sz="4"/>
+              <w:left w:val="single" w:color="808080" w:sz="4"/>
+              <w:bottom w:val="single" w:color="808080" w:sz="4"/>
+              <w:right w:val="single" w:color="808080" w:sz="4"/>
+            </w:tcBorders>
+            <w:tcMar>
+              <w:top w:type="dxa" w:w="50"/>
+              <w:left w:type="dxa" w:w="90"/>
+              <w:bottom w:type="dxa" w:w="50"/>
+              <w:right w:type="dxa" w:w="90"/>
+            </w:tcMar>
+            <w:vAlign w:val="top"/>
+          </w:tcPr>
+          <w:p>
+            <w:pPr>
+              <w:spacing w:after="30" w:line="240"/>
+              <w:jc w:val="left"/>
+            </w:pPr>
+            <w:r>
+              <w:rPr>
+                <w:rFonts w:ascii="Times New Roman" w:cs="Times New Roman" w:eastAsia="Times New Roman" w:hAnsi="Times New Roman"/>
+                <w:sz w:val="15"/>
+                <w:szCs w:val="15"/>
+              </w:rPr>
+              <w:t>routes_clinical.cpp, routes_reports.cpp, routes_backup.cpp, ConsultationsPage.tsx, ReportsPage.tsx, BackupPage.tsx</w:t>
+            </w:r>
+          </w:p>
+        </w:tc>
+        <w:tc>
+          <w:tcPr>
+            <w:tcW w:type="dxa" w:w="900"/>
+            <w:tcBorders>
+              <w:top w:val="single" w:color="808080" w:sz="4"/>
+              <w:left w:val="single" w:color="808080" w:sz="4"/>
+              <w:bottom w:val="single" w:color="808080" w:sz="4"/>
+              <w:right w:val="single" w:color="808080" w:sz="4"/>
+            </w:tcBorders>
+            <w:tcMar>
+              <w:top w:type="dxa" w:w="50"/>
+              <w:left w:type="dxa" w:w="90"/>
+              <w:bottom w:type="dxa" w:w="50"/>
+              <w:right w:type="dxa" w:w="90"/>
+            </w:tcMar>
+            <w:vAlign w:val="top"/>
+          </w:tcPr>
+          <w:p>
+            <w:pPr>
+              <w:spacing w:after="30" w:line="240"/>
+              <w:jc w:val="left"/>
+            </w:pPr>
+            <w:r>
+              <w:rPr>
+                <w:rFonts w:ascii="Times New Roman" w:cs="Times New Roman" w:eastAsia="Times New Roman" w:hAnsi="Times New Roman"/>
+                <w:sz w:val="15"/>
+                <w:szCs w:val="15"/>
+              </w:rPr>
+              <w:t>UT-WEB</w:t>
+            </w:r>
+          </w:p>
+        </w:tc>
+        <w:tc>
+          <w:tcPr>
+            <w:tcW w:type="dxa" w:w="1496"/>
+            <w:tcBorders>
+              <w:top w:val="single" w:color="808080" w:sz="4"/>
+              <w:left w:val="single" w:color="808080" w:sz="4"/>
+              <w:bottom w:val="single" w:color="808080" w:sz="4"/>
+              <w:right w:val="single" w:color="808080" w:sz="4"/>
+            </w:tcBorders>
+            <w:tcMar>
+              <w:top w:type="dxa" w:w="50"/>
+              <w:left w:type="dxa" w:w="90"/>
+              <w:bottom w:type="dxa" w:w="50"/>
+              <w:right w:type="dxa" w:w="90"/>
+            </w:tcMar>
+            <w:vAlign w:val="top"/>
+          </w:tcPr>
+          <w:p>
+            <w:pPr>
+              <w:spacing w:after="30" w:line="240"/>
+              <w:jc w:val="left"/>
+            </w:pPr>
+            <w:r>
+              <w:rPr>
+                <w:rFonts w:ascii="Times New Roman" w:cs="Times New Roman" w:eastAsia="Times New Roman" w:hAnsi="Times New Roman"/>
+                <w:sz w:val="15"/>
+                <w:szCs w:val="15"/>
+              </w:rPr>
+              <w:t>TC-WEB-05</w:t>
+            </w:r>
+          </w:p>
+        </w:tc>
+      </w:tr>
+      <w:tr>
+        <w:trPr>
+          <w:cantSplit/>
+        </w:trPr>
+        <w:tc>
+          <w:tcPr>
+            <w:tcW w:type="dxa" w:w="450"/>
+            <w:tcBorders>
+              <w:top w:val="single" w:color="808080" w:sz="4"/>
+              <w:left w:val="single" w:color="808080" w:sz="4"/>
+              <w:bottom w:val="single" w:color="808080" w:sz="4"/>
+              <w:right w:val="single" w:color="808080" w:sz="4"/>
+            </w:tcBorders>
+            <w:tcMar>
+              <w:top w:type="dxa" w:w="50"/>
+              <w:left w:type="dxa" w:w="90"/>
+              <w:bottom w:type="dxa" w:w="50"/>
+              <w:right w:type="dxa" w:w="90"/>
+            </w:tcMar>
+            <w:vAlign w:val="top"/>
+          </w:tcPr>
+          <w:p>
+            <w:pPr>
+              <w:spacing w:after="30" w:line="240"/>
+              <w:jc w:val="left"/>
+            </w:pPr>
+            <w:r>
+              <w:rPr>
+                <w:rFonts w:ascii="Times New Roman" w:cs="Times New Roman" w:eastAsia="Times New Roman" w:hAnsi="Times New Roman"/>
+                <w:sz w:val="15"/>
+                <w:szCs w:val="15"/>
+              </w:rPr>
+              <w:t>55</w:t>
+            </w:r>
+          </w:p>
+        </w:tc>
+        <w:tc>
+          <w:tcPr>
+            <w:tcW w:type="dxa" w:w="1150"/>
+            <w:tcBorders>
+              <w:top w:val="single" w:color="808080" w:sz="4"/>
+              <w:left w:val="single" w:color="808080" w:sz="4"/>
+              <w:bottom w:val="single" w:color="808080" w:sz="4"/>
+              <w:right w:val="single" w:color="808080" w:sz="4"/>
+            </w:tcBorders>
+            <w:tcMar>
+              <w:top w:type="dxa" w:w="50"/>
+              <w:left w:type="dxa" w:w="90"/>
+              <w:bottom w:type="dxa" w:w="50"/>
+              <w:right w:type="dxa" w:w="90"/>
+            </w:tcMar>
+            <w:vAlign w:val="top"/>
+          </w:tcPr>
+          <w:p>
+            <w:pPr>
+              <w:spacing w:after="30" w:line="240"/>
+              <w:jc w:val="left"/>
+            </w:pPr>
+            <w:r>
+              <w:rPr>
+                <w:rFonts w:ascii="Times New Roman" w:cs="Times New Roman" w:eastAsia="Times New Roman" w:hAnsi="Times New Roman"/>
+                <w:b/>
+                <w:bCs/>
+                <w:sz w:val="15"/>
+                <w:szCs w:val="15"/>
+              </w:rPr>
+              <w:t>HMS-SEC-009</w:t>
+            </w:r>
+          </w:p>
+        </w:tc>
+        <w:tc>
+          <w:tcPr>
+            <w:tcW w:type="dxa" w:w="1650"/>
+            <w:tcBorders>
+              <w:top w:val="single" w:color="808080" w:sz="4"/>
+              <w:left w:val="single" w:color="808080" w:sz="4"/>
+              <w:bottom w:val="single" w:color="808080" w:sz="4"/>
+              <w:right w:val="single" w:color="808080" w:sz="4"/>
+            </w:tcBorders>
+            <w:tcMar>
+              <w:top w:type="dxa" w:w="50"/>
+              <w:left w:type="dxa" w:w="90"/>
+              <w:bottom w:type="dxa" w:w="50"/>
+              <w:right w:type="dxa" w:w="90"/>
+            </w:tcMar>
+            <w:vAlign w:val="top"/>
+          </w:tcPr>
+          <w:p>
+            <w:pPr>
+              <w:spacing w:after="30" w:line="240"/>
+              <w:jc w:val="left"/>
+            </w:pPr>
+            <w:r>
+              <w:rPr>
+                <w:rFonts w:ascii="Times New Roman" w:cs="Times New Roman" w:eastAsia="Times New Roman" w:hAnsi="Times New Roman"/>
+                <w:sz w:val="15"/>
+                <w:szCs w:val="15"/>
+              </w:rPr>
+              <w:t>Local-only server, random session tokens</w:t>
+            </w:r>
+          </w:p>
+        </w:tc>
+        <w:tc>
+          <w:tcPr>
+            <w:tcW w:type="dxa" w:w="850"/>
+            <w:tcBorders>
+              <w:top w:val="single" w:color="808080" w:sz="4"/>
+              <w:left w:val="single" w:color="808080" w:sz="4"/>
+              <w:bottom w:val="single" w:color="808080" w:sz="4"/>
+              <w:right w:val="single" w:color="808080" w:sz="4"/>
+            </w:tcBorders>
+            <w:tcMar>
+              <w:top w:type="dxa" w:w="50"/>
+              <w:left w:type="dxa" w:w="90"/>
+              <w:bottom w:type="dxa" w:w="50"/>
+              <w:right w:type="dxa" w:w="90"/>
+            </w:tcMar>
+            <w:vAlign w:val="top"/>
+          </w:tcPr>
+          <w:p>
+            <w:pPr>
+              <w:spacing w:after="30" w:line="240"/>
+              <w:jc w:val="left"/>
+            </w:pPr>
+            <w:r>
+              <w:rPr>
+                <w:rFonts w:ascii="Times New Roman" w:cs="Times New Roman" w:eastAsia="Times New Roman" w:hAnsi="Times New Roman"/>
+                <w:sz w:val="15"/>
+                <w:szCs w:val="15"/>
+              </w:rPr>
+              <w:t>C16, C11</w:t>
+            </w:r>
+          </w:p>
+        </w:tc>
+        <w:tc>
+          <w:tcPr>
+            <w:tcW w:type="dxa" w:w="1750"/>
+            <w:tcBorders>
+              <w:top w:val="single" w:color="808080" w:sz="4"/>
+              <w:left w:val="single" w:color="808080" w:sz="4"/>
+              <w:bottom w:val="single" w:color="808080" w:sz="4"/>
+              <w:right w:val="single" w:color="808080" w:sz="4"/>
+            </w:tcBorders>
+            <w:tcMar>
+              <w:top w:type="dxa" w:w="50"/>
+              <w:left w:type="dxa" w:w="90"/>
+              <w:bottom w:type="dxa" w:w="50"/>
+              <w:right w:type="dxa" w:w="90"/>
+            </w:tcMar>
+            <w:vAlign w:val="top"/>
+          </w:tcPr>
+          <w:p>
+            <w:pPr>
+              <w:spacing w:after="30" w:line="240"/>
+              <w:jc w:val="left"/>
+            </w:pPr>
+            <w:r>
+              <w:rPr>
+                <w:rFonts w:ascii="Times New Roman" w:cs="Times New Roman" w:eastAsia="Times New Roman" w:hAnsi="Times New Roman"/>
+                <w:sz w:val="15"/>
+                <w:szCs w:val="15"/>
+              </w:rPr>
+              <w:t>SAD 3.9</w:t>
+            </w:r>
+          </w:p>
+        </w:tc>
+        <w:tc>
+          <w:tcPr>
+            <w:tcW w:type="dxa" w:w="1500"/>
+            <w:tcBorders>
+              <w:top w:val="single" w:color="808080" w:sz="4"/>
+              <w:left w:val="single" w:color="808080" w:sz="4"/>
+              <w:bottom w:val="single" w:color="808080" w:sz="4"/>
+              <w:right w:val="single" w:color="808080" w:sz="4"/>
+            </w:tcBorders>
+            <w:tcMar>
+              <w:top w:type="dxa" w:w="50"/>
+              <w:left w:type="dxa" w:w="90"/>
+              <w:bottom w:type="dxa" w:w="50"/>
+              <w:right w:type="dxa" w:w="90"/>
+            </w:tcMar>
+            <w:vAlign w:val="top"/>
+          </w:tcPr>
+          <w:p>
+            <w:pPr>
+              <w:spacing w:after="30" w:line="240"/>
+              <w:jc w:val="left"/>
+            </w:pPr>
+            <w:r>
+              <w:rPr>
+                <w:rFonts w:ascii="Times New Roman" w:cs="Times New Roman" w:eastAsia="Times New Roman" w:hAnsi="Times New Roman"/>
+                <w:sz w:val="15"/>
+                <w:szCs w:val="15"/>
+              </w:rPr>
+              <w:t>main.cpp, api.cpp, session_manager.cpp</w:t>
+            </w:r>
+          </w:p>
+        </w:tc>
+        <w:tc>
+          <w:tcPr>
+            <w:tcW w:type="dxa" w:w="900"/>
+            <w:tcBorders>
+              <w:top w:val="single" w:color="808080" w:sz="4"/>
+              <w:left w:val="single" w:color="808080" w:sz="4"/>
+              <w:bottom w:val="single" w:color="808080" w:sz="4"/>
+              <w:right w:val="single" w:color="808080" w:sz="4"/>
+            </w:tcBorders>
+            <w:tcMar>
+              <w:top w:type="dxa" w:w="50"/>
+              <w:left w:type="dxa" w:w="90"/>
+              <w:bottom w:type="dxa" w:w="50"/>
+              <w:right w:type="dxa" w:w="90"/>
+            </w:tcMar>
+            <w:vAlign w:val="top"/>
+          </w:tcPr>
+          <w:p>
+            <w:pPr>
+              <w:spacing w:after="30" w:line="240"/>
+              <w:jc w:val="left"/>
+            </w:pPr>
+            <w:r>
+              <w:rPr>
+                <w:rFonts w:ascii="Times New Roman" w:cs="Times New Roman" w:eastAsia="Times New Roman" w:hAnsi="Times New Roman"/>
+                <w:sz w:val="15"/>
+                <w:szCs w:val="15"/>
+              </w:rPr>
+              <w:t>UT-SEC</w:t>
+            </w:r>
+          </w:p>
+        </w:tc>
+        <w:tc>
+          <w:tcPr>
+            <w:tcW w:type="dxa" w:w="1496"/>
+            <w:tcBorders>
+              <w:top w:val="single" w:color="808080" w:sz="4"/>
+              <w:left w:val="single" w:color="808080" w:sz="4"/>
+              <w:bottom w:val="single" w:color="808080" w:sz="4"/>
+              <w:right w:val="single" w:color="808080" w:sz="4"/>
+            </w:tcBorders>
+            <w:tcMar>
+              <w:top w:type="dxa" w:w="50"/>
+              <w:left w:type="dxa" w:w="90"/>
+              <w:bottom w:type="dxa" w:w="50"/>
+              <w:right w:type="dxa" w:w="90"/>
+            </w:tcMar>
+            <w:vAlign w:val="top"/>
+          </w:tcPr>
+          <w:p>
+            <w:pPr>
+              <w:spacing w:after="30" w:line="240"/>
+              <w:jc w:val="left"/>
+            </w:pPr>
+            <w:r>
+              <w:rPr>
+                <w:rFonts w:ascii="Times New Roman" w:cs="Times New Roman" w:eastAsia="Times New Roman" w:hAnsi="Times New Roman"/>
+                <w:sz w:val="15"/>
+                <w:szCs w:val="15"/>
+              </w:rPr>
+              <w:t>TC-SEC-07</w:t>
+            </w:r>
+          </w:p>
+        </w:tc>
+      </w:tr>
     </w:tbl>
     <w:sectPr>
       <w:headerReference w:type="default" r:id="rId7"/>
       <w:footerReference w:type="default" r:id="rId8"/>
+      <w:footerReference w:type="first" r:id="rId12"/>
+      <w:headerReference w:type="first" r:id="rId13"/>
       <w:pgSz w:w="11906" w:h="16838" w:orient="portrait"/>
       <w:pgMar w:top="1500" w:right="1080" w:bottom="1000" w:left="1080" w:header="400" w:footer="400" w:gutter="0"/>
       <w:pgNumType/>
@@ -45079,7 +47850,7 @@
         <w:sz w:val="16"/>
         <w:szCs w:val="16"/>
       </w:rPr>
-      <w:t xml:space="preserve">HMS — Software Requirements Specification v1.0 — Team 11</w:t>
+      <w:t>HMS — Software Requirements Specification v1.1 — Team 11</w:t>
     </w:r>
     <w:r>
       <w:rPr>
@@ -45123,6 +47894,16 @@
       <w:fldChar w:fldCharType="separate"/>
       <w:fldChar w:fldCharType="end"/>
     </w:r>
+  </w:p>
+</w:ftr>
+</file>
+
+<file path=word/footer2.xml><?xml version="1.0" encoding="utf-8"?>
+<w:ftr xmlns:m="http://schemas.openxmlformats.org/officeDocument/2006/math" xmlns:mc="http://schemas.openxmlformats.org/markup-compatibility/2006" xmlns:mo="http://schemas.microsoft.com/office/mac/office/2008/main" xmlns:mv="urn:schemas-microsoft-com:mac:vml" xmlns:o="urn:schemas-microsoft-com:office:office" xmlns:r="http://schemas.openxmlformats.org/officeDocument/2006/relationships" xmlns:v="urn:schemas-microsoft-com:vml" xmlns:w10="urn:schemas-microsoft-com:office:word" xmlns:w14="http://schemas.microsoft.com/office/word/2010/wordml" xmlns:w="http://schemas.openxmlformats.org/wordprocessingml/2006/main" xmlns:wne="http://schemas.microsoft.com/office/word/2006/wordml" xmlns:wp14="http://schemas.microsoft.com/office/word/2010/wordprocessingDrawing" xmlns:wp="http://schemas.openxmlformats.org/drawingml/2006/wordprocessingDrawing" xmlns:wpc="http://schemas.microsoft.com/office/word/2010/wordprocessingCanvas" xmlns:wpg="http://schemas.microsoft.com/office/word/2010/wordprocessingGroup" xmlns:wpi="http://schemas.microsoft.com/office/word/2010/wordprocessingInk" xmlns:wps="http://schemas.microsoft.com/office/word/2010/wordprocessingShape" mc:Ignorable="w14 wp14">
+  <w:p>
+    <w:pPr>
+      <w:pStyle w:val="Footer"/>
+    </w:pPr>
   </w:p>
 </w:ftr>
 </file>
@@ -45244,6 +48025,16 @@
       </w:rPr>
       <w:t xml:space="preserve">Department of Computer Science and Engineering</w:t>
     </w:r>
+  </w:p>
+</w:hdr>
+</file>
+
+<file path=word/header2.xml><?xml version="1.0" encoding="utf-8"?>
+<w:hdr xmlns:m="http://schemas.openxmlformats.org/officeDocument/2006/math" xmlns:mc="http://schemas.openxmlformats.org/markup-compatibility/2006" xmlns:mo="http://schemas.microsoft.com/office/mac/office/2008/main" xmlns:mv="urn:schemas-microsoft-com:mac:vml" xmlns:o="urn:schemas-microsoft-com:office:office" xmlns:r="http://schemas.openxmlformats.org/officeDocument/2006/relationships" xmlns:v="urn:schemas-microsoft-com:vml" xmlns:w10="urn:schemas-microsoft-com:office:word" xmlns:w14="http://schemas.microsoft.com/office/word/2010/wordml" xmlns:w="http://schemas.openxmlformats.org/wordprocessingml/2006/main" xmlns:wne="http://schemas.microsoft.com/office/word/2006/wordml" xmlns:wp14="http://schemas.microsoft.com/office/word/2010/wordprocessingDrawing" xmlns:wp="http://schemas.openxmlformats.org/drawingml/2006/wordprocessingDrawing" xmlns:wpc="http://schemas.microsoft.com/office/word/2010/wordprocessingCanvas" xmlns:wpg="http://schemas.microsoft.com/office/word/2010/wordprocessingGroup" xmlns:wpi="http://schemas.microsoft.com/office/word/2010/wordprocessingInk" xmlns:wps="http://schemas.microsoft.com/office/word/2010/wordprocessingShape" mc:Ignorable="w14 wp14">
+  <w:p>
+    <w:pPr>
+      <w:pStyle w:val="Header"/>
+    </w:pPr>
   </w:p>
 </w:hdr>
 </file>

</xml_diff>